<commit_message>
feat(estandar-sitio): agrega fases ART, permisos trabajo, area solicitante y residuos
- Fase 4: Área Solicitante — coordinación previa al inicio (4 actividades)
- Fase 5: ART + permisos trabajo general, altura, caliente, EC, LOTO (7 actividades)
- Fase 6: Disposición de residuos — segregación, peligrosos, vertimientos (5 actividades)
- Fase 7: Incumplimientos renumerada

Co-Authored-By: Claude Sonnet 4.6 <noreply@anthropic.com>
Claude-Session: https://claude.ai/code/session_01Mu84mNMmRhshwom6voaTeY
</commit_message>
<xml_diff>
--- a/GE-SO-I002_Estandar_Requerimientos_Sitio_Contratistas_v01.docx
+++ b/GE-SO-I002_Estandar_Requerimientos_Sitio_Contratistas_v01.docx
@@ -997,6 +997,326 @@
                 <w:szCs w:val="20"/>
               </w:rPr>
               <w:t>Hoja de Datos de Seguridad (Safety Data Sheet). Documento con información sobre riesgos, manejo seguro, EPP requerido y medidas de emergencia para sustancias químicas.</w:t>
+            </w:r>
+          </w:p>
+        </w:tc>
+      </w:tr>
+      <w:tr>
+        <w:trPr>
+          <w:tblHeader/>
+        </w:trPr>
+        <w:tc>
+          <w:tcPr>
+            <w:tcW w:w="2600" w:type="dxa"/>
+            <w:tcBorders>
+              <w:top w:val="single" w:sz="4" w:space="0" w:color="000000"/>
+              <w:left w:val="single" w:sz="4" w:space="0" w:color="000000"/>
+              <w:bottom w:val="single" w:sz="4" w:space="0" w:color="000000"/>
+              <w:right w:val="single" w:sz="4" w:space="0" w:color="000000"/>
+            </w:tcBorders>
+            <w:shd w:val="clear" w:color="auto" w:fill="D9D9D9"/>
+            <w:tcMar>
+              <w:top w:w="70" w:type="dxa"/>
+              <w:left w:w="100" w:type="dxa"/>
+              <w:bottom w:w="70" w:type="dxa"/>
+              <w:right w:w="100" w:type="dxa"/>
+            </w:tcMar>
+            <w:vAlign w:val="center"/>
+          </w:tcPr>
+          <w:p>
+            <w:pPr/>
+            <w:r>
+              <w:rPr>
+                <w:b/>
+                <w:sz w:val="20"/>
+                <w:szCs w:val="20"/>
+              </w:rPr>
+              <w:t>ART (Análisis de Riesgo en el Trabajo)</w:t>
+            </w:r>
+          </w:p>
+        </w:tc>
+        <w:tc>
+          <w:tcPr>
+            <w:tcW w:w="7038" w:type="dxa"/>
+            <w:tcBorders>
+              <w:top w:val="single" w:sz="4" w:space="0" w:color="000000"/>
+              <w:left w:val="single" w:sz="4" w:space="0" w:color="000000"/>
+              <w:bottom w:val="single" w:sz="4" w:space="0" w:color="000000"/>
+              <w:right w:val="single" w:sz="4" w:space="0" w:color="000000"/>
+            </w:tcBorders>
+            <w:shd w:val="clear" w:color="auto" w:fill="D9D9D9"/>
+            <w:tcMar>
+              <w:top w:w="70" w:type="dxa"/>
+              <w:left w:w="100" w:type="dxa"/>
+              <w:bottom w:w="70" w:type="dxa"/>
+              <w:right w:w="100" w:type="dxa"/>
+            </w:tcMar>
+            <w:vAlign w:val="center"/>
+          </w:tcPr>
+          <w:p>
+            <w:pPr/>
+            <w:r>
+              <w:rPr>
+                <w:sz w:val="20"/>
+                <w:szCs w:val="20"/>
+              </w:rPr>
+              <w:t>Análisis participativo realizado por el equipo de trabajo inmediatamente antes de iniciar cada tarea, identificando paso a paso los peligros específicos y los controles a aplicar. Complementa el IPERC y es obligatorio para toda actividad en las instalaciones de Plantabal.</w:t>
+            </w:r>
+          </w:p>
+        </w:tc>
+      </w:tr>
+      <w:tr>
+        <w:trPr>
+          <w:tblHeader/>
+        </w:trPr>
+        <w:tc>
+          <w:tcPr>
+            <w:tcW w:w="2600" w:type="dxa"/>
+            <w:tcBorders>
+              <w:top w:val="single" w:sz="4" w:space="0" w:color="000000"/>
+              <w:left w:val="single" w:sz="4" w:space="0" w:color="000000"/>
+              <w:bottom w:val="single" w:sz="4" w:space="0" w:color="000000"/>
+              <w:right w:val="single" w:sz="4" w:space="0" w:color="000000"/>
+            </w:tcBorders>
+            <w:shd w:val="clear" w:color="auto" w:fill="D9D9D9"/>
+            <w:tcMar>
+              <w:top w:w="70" w:type="dxa"/>
+              <w:left w:w="100" w:type="dxa"/>
+              <w:bottom w:w="70" w:type="dxa"/>
+              <w:right w:w="100" w:type="dxa"/>
+            </w:tcMar>
+            <w:vAlign w:val="center"/>
+          </w:tcPr>
+          <w:p>
+            <w:pPr/>
+            <w:r>
+              <w:rPr>
+                <w:b/>
+                <w:sz w:val="20"/>
+                <w:szCs w:val="20"/>
+              </w:rPr>
+              <w:t>Área Solicitante</w:t>
+            </w:r>
+          </w:p>
+        </w:tc>
+        <w:tc>
+          <w:tcPr>
+            <w:tcW w:w="7038" w:type="dxa"/>
+            <w:tcBorders>
+              <w:top w:val="single" w:sz="4" w:space="0" w:color="000000"/>
+              <w:left w:val="single" w:sz="4" w:space="0" w:color="000000"/>
+              <w:bottom w:val="single" w:sz="4" w:space="0" w:color="000000"/>
+              <w:right w:val="single" w:sz="4" w:space="0" w:color="000000"/>
+            </w:tcBorders>
+            <w:shd w:val="clear" w:color="auto" w:fill="D9D9D9"/>
+            <w:tcMar>
+              <w:top w:w="70" w:type="dxa"/>
+              <w:left w:w="100" w:type="dxa"/>
+              <w:bottom w:w="70" w:type="dxa"/>
+              <w:right w:w="100" w:type="dxa"/>
+            </w:tcMar>
+            <w:vAlign w:val="center"/>
+          </w:tcPr>
+          <w:p>
+            <w:pPr/>
+            <w:r>
+              <w:rPr>
+                <w:sz w:val="20"/>
+                <w:szCs w:val="20"/>
+              </w:rPr>
+              <w:t>Jefatura o supervisor de Plantabal S.A. que requiere y autoriza la ejecución de trabajos por parte de una empresa contratista. Es responsable de definir el alcance, facilitar las condiciones de acceso y verificar el cumplimiento de los estándares en su área.</w:t>
+            </w:r>
+          </w:p>
+        </w:tc>
+      </w:tr>
+      <w:tr>
+        <w:trPr>
+          <w:tblHeader/>
+        </w:trPr>
+        <w:tc>
+          <w:tcPr>
+            <w:tcW w:w="2600" w:type="dxa"/>
+            <w:tcBorders>
+              <w:top w:val="single" w:sz="4" w:space="0" w:color="000000"/>
+              <w:left w:val="single" w:sz="4" w:space="0" w:color="000000"/>
+              <w:bottom w:val="single" w:sz="4" w:space="0" w:color="000000"/>
+              <w:right w:val="single" w:sz="4" w:space="0" w:color="000000"/>
+            </w:tcBorders>
+            <w:shd w:val="clear" w:color="auto" w:fill="D9D9D9"/>
+            <w:tcMar>
+              <w:top w:w="70" w:type="dxa"/>
+              <w:left w:w="100" w:type="dxa"/>
+              <w:bottom w:w="70" w:type="dxa"/>
+              <w:right w:w="100" w:type="dxa"/>
+            </w:tcMar>
+            <w:vAlign w:val="center"/>
+          </w:tcPr>
+          <w:p>
+            <w:pPr/>
+            <w:r>
+              <w:rPr>
+                <w:b/>
+                <w:sz w:val="20"/>
+                <w:szCs w:val="20"/>
+              </w:rPr>
+              <w:t>Permiso de Trabajo General</w:t>
+            </w:r>
+          </w:p>
+        </w:tc>
+        <w:tc>
+          <w:tcPr>
+            <w:tcW w:w="7038" w:type="dxa"/>
+            <w:tcBorders>
+              <w:top w:val="single" w:sz="4" w:space="0" w:color="000000"/>
+              <w:left w:val="single" w:sz="4" w:space="0" w:color="000000"/>
+              <w:bottom w:val="single" w:sz="4" w:space="0" w:color="000000"/>
+              <w:right w:val="single" w:sz="4" w:space="0" w:color="000000"/>
+            </w:tcBorders>
+            <w:shd w:val="clear" w:color="auto" w:fill="D9D9D9"/>
+            <w:tcMar>
+              <w:top w:w="70" w:type="dxa"/>
+              <w:left w:w="100" w:type="dxa"/>
+              <w:bottom w:w="70" w:type="dxa"/>
+              <w:right w:w="100" w:type="dxa"/>
+            </w:tcMar>
+            <w:vAlign w:val="center"/>
+          </w:tcPr>
+          <w:p>
+            <w:pPr/>
+            <w:r>
+              <w:rPr>
+                <w:sz w:val="20"/>
+                <w:szCs w:val="20"/>
+              </w:rPr>
+              <w:t>Documento que autoriza actividades de bajo a mediano riesgo dentro de las instalaciones. Emitido por el Área Solicitante con conocimiento de E&amp;S.</w:t>
+            </w:r>
+          </w:p>
+        </w:tc>
+      </w:tr>
+      <w:tr>
+        <w:trPr>
+          <w:tblHeader/>
+        </w:trPr>
+        <w:tc>
+          <w:tcPr>
+            <w:tcW w:w="2600" w:type="dxa"/>
+            <w:tcBorders>
+              <w:top w:val="single" w:sz="4" w:space="0" w:color="000000"/>
+              <w:left w:val="single" w:sz="4" w:space="0" w:color="000000"/>
+              <w:bottom w:val="single" w:sz="4" w:space="0" w:color="000000"/>
+              <w:right w:val="single" w:sz="4" w:space="0" w:color="000000"/>
+            </w:tcBorders>
+            <w:shd w:val="clear" w:color="auto" w:fill="D9D9D9"/>
+            <w:tcMar>
+              <w:top w:w="70" w:type="dxa"/>
+              <w:left w:w="100" w:type="dxa"/>
+              <w:bottom w:w="70" w:type="dxa"/>
+              <w:right w:w="100" w:type="dxa"/>
+            </w:tcMar>
+            <w:vAlign w:val="center"/>
+          </w:tcPr>
+          <w:p>
+            <w:pPr/>
+            <w:r>
+              <w:rPr>
+                <w:b/>
+                <w:sz w:val="20"/>
+                <w:szCs w:val="20"/>
+              </w:rPr>
+              <w:t>Permiso de Trabajo Especial</w:t>
+            </w:r>
+          </w:p>
+        </w:tc>
+        <w:tc>
+          <w:tcPr>
+            <w:tcW w:w="7038" w:type="dxa"/>
+            <w:tcBorders>
+              <w:top w:val="single" w:sz="4" w:space="0" w:color="000000"/>
+              <w:left w:val="single" w:sz="4" w:space="0" w:color="000000"/>
+              <w:bottom w:val="single" w:sz="4" w:space="0" w:color="000000"/>
+              <w:right w:val="single" w:sz="4" w:space="0" w:color="000000"/>
+            </w:tcBorders>
+            <w:shd w:val="clear" w:color="auto" w:fill="D9D9D9"/>
+            <w:tcMar>
+              <w:top w:w="70" w:type="dxa"/>
+              <w:left w:w="100" w:type="dxa"/>
+              <w:bottom w:w="70" w:type="dxa"/>
+              <w:right w:w="100" w:type="dxa"/>
+            </w:tcMar>
+            <w:vAlign w:val="center"/>
+          </w:tcPr>
+          <w:p>
+            <w:pPr/>
+            <w:r>
+              <w:rPr>
+                <w:sz w:val="20"/>
+                <w:szCs w:val="20"/>
+              </w:rPr>
+              <w:t>Documento que autoriza actividades de alto riesgo: trabajo en altura, espacio confinado, trabajo en caliente, LOTO, excavaciones. Emitido y firmado por E&amp;S y el Supervisor de Área. Válido solo por la jornada indicada.</w:t>
+            </w:r>
+          </w:p>
+        </w:tc>
+      </w:tr>
+      <w:tr>
+        <w:trPr>
+          <w:tblHeader/>
+        </w:trPr>
+        <w:tc>
+          <w:tcPr>
+            <w:tcW w:w="2600" w:type="dxa"/>
+            <w:tcBorders>
+              <w:top w:val="single" w:sz="4" w:space="0" w:color="000000"/>
+              <w:left w:val="single" w:sz="4" w:space="0" w:color="000000"/>
+              <w:bottom w:val="single" w:sz="4" w:space="0" w:color="000000"/>
+              <w:right w:val="single" w:sz="4" w:space="0" w:color="000000"/>
+            </w:tcBorders>
+            <w:shd w:val="clear" w:color="auto" w:fill="D9D9D9"/>
+            <w:tcMar>
+              <w:top w:w="70" w:type="dxa"/>
+              <w:left w:w="100" w:type="dxa"/>
+              <w:bottom w:w="70" w:type="dxa"/>
+              <w:right w:w="100" w:type="dxa"/>
+            </w:tcMar>
+            <w:vAlign w:val="center"/>
+          </w:tcPr>
+          <w:p>
+            <w:pPr/>
+            <w:r>
+              <w:rPr>
+                <w:b/>
+                <w:sz w:val="20"/>
+                <w:szCs w:val="20"/>
+              </w:rPr>
+              <w:t>Residuo Peligroso</w:t>
+            </w:r>
+          </w:p>
+        </w:tc>
+        <w:tc>
+          <w:tcPr>
+            <w:tcW w:w="7038" w:type="dxa"/>
+            <w:tcBorders>
+              <w:top w:val="single" w:sz="4" w:space="0" w:color="000000"/>
+              <w:left w:val="single" w:sz="4" w:space="0" w:color="000000"/>
+              <w:bottom w:val="single" w:sz="4" w:space="0" w:color="000000"/>
+              <w:right w:val="single" w:sz="4" w:space="0" w:color="000000"/>
+            </w:tcBorders>
+            <w:shd w:val="clear" w:color="auto" w:fill="D9D9D9"/>
+            <w:tcMar>
+              <w:top w:w="70" w:type="dxa"/>
+              <w:left w:w="100" w:type="dxa"/>
+              <w:bottom w:w="70" w:type="dxa"/>
+              <w:right w:w="100" w:type="dxa"/>
+            </w:tcMar>
+            <w:vAlign w:val="center"/>
+          </w:tcPr>
+          <w:p>
+            <w:pPr/>
+            <w:r>
+              <w:rPr>
+                <w:sz w:val="20"/>
+                <w:szCs w:val="20"/>
+              </w:rPr>
+              <w:t>Desecho que por sus características (inflamabilidad, corrosividad, toxicidad, reactividad) representa riesgo para la salud o el medio ambiente. Requiere manejo, almacenamiento temporal y disposición según la normativa ambiental vigente.</w:t>
             </w:r>
           </w:p>
         </w:tc>
@@ -1482,6 +1802,70 @@
                 <w:sz w:val="20"/>
                 <w:szCs w:val="20"/>
               </w:rPr>
+              <w:t>Área Solicitante / Jefe de Área (Plantabal)</w:t>
+            </w:r>
+          </w:p>
+        </w:tc>
+        <w:tc>
+          <w:tcPr>
+            <w:tcW w:w="7038" w:type="dxa"/>
+            <w:tcBorders>
+              <w:top w:val="single" w:sz="4" w:space="0" w:color="000000"/>
+              <w:left w:val="single" w:sz="4" w:space="0" w:color="000000"/>
+              <w:bottom w:val="single" w:sz="4" w:space="0" w:color="000000"/>
+              <w:right w:val="single" w:sz="4" w:space="0" w:color="000000"/>
+            </w:tcBorders>
+            <w:shd w:val="clear" w:color="auto" w:fill="D9D9D9"/>
+            <w:tcMar>
+              <w:top w:w="70" w:type="dxa"/>
+              <w:left w:w="100" w:type="dxa"/>
+              <w:bottom w:w="70" w:type="dxa"/>
+              <w:right w:w="100" w:type="dxa"/>
+            </w:tcMar>
+            <w:vAlign w:val="center"/>
+          </w:tcPr>
+          <w:p>
+            <w:pPr/>
+            <w:r>
+              <w:rPr>
+                <w:sz w:val="20"/>
+                <w:szCs w:val="20"/>
+              </w:rPr>
+              <w:t>Definir el alcance detallado del trabajo a contratar; coordinar con E&amp;S la emisión del permiso de trabajo; garantizar que el área esté en condiciones seguras antes del inicio; supervisar el avance de los trabajos y verificar que el contratista cumple los estándares en todo momento.</w:t>
+            </w:r>
+          </w:p>
+        </w:tc>
+      </w:tr>
+      <w:tr>
+        <w:trPr>
+          <w:tblHeader/>
+        </w:trPr>
+        <w:tc>
+          <w:tcPr>
+            <w:tcW w:w="2600" w:type="dxa"/>
+            <w:tcBorders>
+              <w:top w:val="single" w:sz="4" w:space="0" w:color="000000"/>
+              <w:left w:val="single" w:sz="4" w:space="0" w:color="000000"/>
+              <w:bottom w:val="single" w:sz="4" w:space="0" w:color="000000"/>
+              <w:right w:val="single" w:sz="4" w:space="0" w:color="000000"/>
+            </w:tcBorders>
+            <w:shd w:val="clear" w:color="auto" w:fill="D9D9D9"/>
+            <w:tcMar>
+              <w:top w:w="70" w:type="dxa"/>
+              <w:left w:w="100" w:type="dxa"/>
+              <w:bottom w:w="70" w:type="dxa"/>
+              <w:right w:w="100" w:type="dxa"/>
+            </w:tcMar>
+            <w:vAlign w:val="center"/>
+          </w:tcPr>
+          <w:p>
+            <w:pPr/>
+            <w:r>
+              <w:rPr>
+                <w:b/>
+                <w:sz w:val="20"/>
+                <w:szCs w:val="20"/>
+              </w:rPr>
               <w:t>Gerencia de Planta</w:t>
             </w:r>
           </w:p>
@@ -3984,7 +4368,7 @@
                 <w:sz w:val="20"/>
                 <w:szCs w:val="20"/>
               </w:rPr>
-              <w:t>FASE 4: DOCUMENTACIÓN Y PERMISOS</w:t>
+              <w:t>FASE 4: ÁREA SOLICITANTE — COORDINACIÓN PREVIA AL INICIO</w:t>
             </w:r>
           </w:p>
         </w:tc>
@@ -4094,7 +4478,7 @@
                 <w:sz w:val="20"/>
                 <w:szCs w:val="20"/>
               </w:rPr>
-              <w:t>Verificar que el equipo contratista presenta antes de iniciar: permiso de trabajo vigente para la actividad (firmado por E&amp;S y supervisor de área), IPERC específico para la tarea elaborado y firmado por el supervisor.</w:t>
+              <w:t>El Área Solicitante (jefe o supervisor de la dependencia de Plantabal que requiere el trabajo) debe definir por escrito el alcance completo de la actividad a contratar: descripción de la tarea, ubicación exacta, materiales, equipos involucrados y plazo estimado. Esto se entrega al contratista antes del inicio.</w:t>
             </w:r>
           </w:p>
         </w:tc>
@@ -4125,38 +4509,38 @@
                 <w:sz w:val="20"/>
                 <w:szCs w:val="20"/>
               </w:rPr>
+              <w:t>Área Solicitante</w:t>
+            </w:r>
+          </w:p>
+        </w:tc>
+        <w:tc>
+          <w:tcPr>
+            <w:tcW w:w="1300" w:type="dxa"/>
+            <w:tcBorders>
+              <w:top w:val="single" w:sz="4" w:space="0" w:color="000000"/>
+              <w:left w:val="single" w:sz="4" w:space="0" w:color="000000"/>
+              <w:bottom w:val="single" w:sz="4" w:space="0" w:color="000000"/>
+              <w:right w:val="single" w:sz="4" w:space="0" w:color="000000"/>
+            </w:tcBorders>
+            <w:shd w:val="clear" w:color="auto" w:fill="D9D9D9"/>
+            <w:tcMar>
+              <w:top w:w="70" w:type="dxa"/>
+              <w:left w:w="100" w:type="dxa"/>
+              <w:bottom w:w="70" w:type="dxa"/>
+              <w:right w:w="100" w:type="dxa"/>
+            </w:tcMar>
+            <w:vAlign w:val="center"/>
+          </w:tcPr>
+          <w:p>
+            <w:pPr>
+              <w:jc w:val="center"/>
+            </w:pPr>
+            <w:r>
+              <w:rPr>
+                <w:sz w:val="20"/>
+                <w:szCs w:val="20"/>
+              </w:rPr>
               <w:t>Equipo de E&amp;S</w:t>
-            </w:r>
-          </w:p>
-        </w:tc>
-        <w:tc>
-          <w:tcPr>
-            <w:tcW w:w="1300" w:type="dxa"/>
-            <w:tcBorders>
-              <w:top w:val="single" w:sz="4" w:space="0" w:color="000000"/>
-              <w:left w:val="single" w:sz="4" w:space="0" w:color="000000"/>
-              <w:bottom w:val="single" w:sz="4" w:space="0" w:color="000000"/>
-              <w:right w:val="single" w:sz="4" w:space="0" w:color="000000"/>
-            </w:tcBorders>
-            <w:shd w:val="clear" w:color="auto" w:fill="D9D9D9"/>
-            <w:tcMar>
-              <w:top w:w="70" w:type="dxa"/>
-              <w:left w:w="100" w:type="dxa"/>
-              <w:bottom w:w="70" w:type="dxa"/>
-              <w:right w:w="100" w:type="dxa"/>
-            </w:tcMar>
-            <w:vAlign w:val="center"/>
-          </w:tcPr>
-          <w:p>
-            <w:pPr>
-              <w:jc w:val="center"/>
-            </w:pPr>
-            <w:r>
-              <w:rPr>
-                <w:sz w:val="20"/>
-                <w:szCs w:val="20"/>
-              </w:rPr>
-              <w:t>Supervisor de Área</w:t>
             </w:r>
           </w:p>
         </w:tc>
@@ -4222,7 +4606,7 @@
                 <w:sz w:val="20"/>
                 <w:szCs w:val="20"/>
               </w:rPr>
-              <w:t>Confirmar habilitaciones individuales del personal para trabajos especiales: certificado de trabajo en altura, certificado de espacio confinado, certificado de trabajos en caliente, LOTO, según la actividad a realizar. Las habilitaciones deben estar vigentes.</w:t>
+              <w:t>El Área Solicitante coordina con el Equipo de E&amp;S la visita previa al área de trabajo (inspección conjunta) para identificar riesgos específicos del entorno, fuentes de energía a bloquear, interferencias con otros trabajos en curso y condiciones ambientales relevantes.</w:t>
             </w:r>
           </w:p>
         </w:tc>
@@ -4253,7 +4637,7 @@
                 <w:sz w:val="20"/>
                 <w:szCs w:val="20"/>
               </w:rPr>
-              <w:t>Equipo de E&amp;S</w:t>
+              <w:t>Área Solicitante / Equipo de E&amp;S</w:t>
             </w:r>
           </w:p>
         </w:tc>
@@ -4284,7 +4668,7 @@
                 <w:sz w:val="20"/>
                 <w:szCs w:val="20"/>
               </w:rPr>
-              <w:t>Gerencia de Planta</w:t>
+              <w:t>Supervisor Contratista</w:t>
             </w:r>
           </w:p>
         </w:tc>
@@ -4350,7 +4734,7 @@
                 <w:sz w:val="20"/>
                 <w:szCs w:val="20"/>
               </w:rPr>
-              <w:t>Para uso de productos químicos: verificar disponibilidad de SDS en idioma español en el área de trabajo + trabajadores capacitados en manejo seguro del producto + plan de respuesta a derrames en sitio.</w:t>
+              <w:t>El Área Solicitante verifica que el área de trabajo esté en condiciones seguras antes del ingreso del contratista: equipos energizados o en movimiento aislados, superficies limpias, accesos despejados. No se autoriza el ingreso si el área presenta condiciones inseguras no controladas.</w:t>
             </w:r>
           </w:p>
         </w:tc>
@@ -4381,7 +4765,7 @@
                 <w:sz w:val="20"/>
                 <w:szCs w:val="20"/>
               </w:rPr>
-              <w:t>Supervisor Contratista</w:t>
+              <w:t>Área Solicitante</w:t>
             </w:r>
           </w:p>
         </w:tc>
@@ -4440,38 +4824,45 @@
             <w:vAlign w:val="center"/>
           </w:tcPr>
           <w:p>
+            <w:pPr>
+              <w:jc w:val="center"/>
+            </w:pPr>
+            <w:r>
+              <w:rPr>
+                <w:b/>
+                <w:sz w:val="20"/>
+                <w:szCs w:val="20"/>
+              </w:rPr>
+              <w:t>4.4</w:t>
+            </w:r>
+          </w:p>
+        </w:tc>
+        <w:tc>
+          <w:tcPr>
+            <w:tcW w:w="5888" w:type="dxa"/>
+            <w:tcBorders>
+              <w:top w:val="single" w:sz="4" w:space="0" w:color="000000"/>
+              <w:left w:val="single" w:sz="4" w:space="0" w:color="000000"/>
+              <w:bottom w:val="single" w:sz="4" w:space="0" w:color="000000"/>
+              <w:right w:val="single" w:sz="4" w:space="0" w:color="000000"/>
+            </w:tcBorders>
+            <w:shd w:val="clear" w:color="auto" w:fill="D9D9D9"/>
+            <w:tcMar>
+              <w:top w:w="70" w:type="dxa"/>
+              <w:left w:w="100" w:type="dxa"/>
+              <w:bottom w:w="70" w:type="dxa"/>
+              <w:right w:w="100" w:type="dxa"/>
+            </w:tcMar>
+            <w:vAlign w:val="center"/>
+          </w:tcPr>
+          <w:p>
             <w:pPr/>
-          </w:p>
-        </w:tc>
-        <w:tc>
-          <w:tcPr>
-            <w:tcW w:w="5888" w:type="dxa"/>
-            <w:tcBorders>
-              <w:top w:val="single" w:sz="4" w:space="0" w:color="000000"/>
-              <w:left w:val="single" w:sz="4" w:space="0" w:color="000000"/>
-              <w:bottom w:val="single" w:sz="4" w:space="0" w:color="000000"/>
-              <w:right w:val="single" w:sz="4" w:space="0" w:color="000000"/>
-            </w:tcBorders>
-            <w:shd w:val="clear" w:color="auto" w:fill="D9D9D9"/>
-            <w:tcMar>
-              <w:top w:w="70" w:type="dxa"/>
-              <w:left w:w="100" w:type="dxa"/>
-              <w:bottom w:w="70" w:type="dxa"/>
-              <w:right w:w="100" w:type="dxa"/>
-            </w:tcMar>
-            <w:vAlign w:val="center"/>
-          </w:tcPr>
-          <w:p>
-            <w:pPr>
-              <w:jc w:val="center"/>
-            </w:pPr>
-            <w:r>
-              <w:rPr>
-                <w:b/>
-                <w:sz w:val="20"/>
-                <w:szCs w:val="20"/>
-              </w:rPr>
-              <w:t>FASE 5: INCUMPLIMIENTOS Y SANCIONES</w:t>
+            <w:r>
+              <w:rPr>
+                <w:sz w:val="20"/>
+                <w:szCs w:val="20"/>
+              </w:rPr>
+              <w:t>El Área Solicitante designa un supervisor o punto de contacto de Plantabal que permanecerá disponible durante toda la jornada de trabajo del contratista para atender consultas, autorizar cambios de alcance y gestionar emergencias.</w:t>
             </w:r>
           </w:p>
         </w:tc>
@@ -4494,7 +4885,16 @@
             <w:vAlign w:val="center"/>
           </w:tcPr>
           <w:p>
-            <w:pPr/>
+            <w:pPr>
+              <w:jc w:val="center"/>
+            </w:pPr>
+            <w:r>
+              <w:rPr>
+                <w:sz w:val="20"/>
+                <w:szCs w:val="20"/>
+              </w:rPr>
+              <w:t>Área Solicitante</w:t>
+            </w:r>
           </w:p>
         </w:tc>
         <w:tc>
@@ -4516,7 +4916,16 @@
             <w:vAlign w:val="center"/>
           </w:tcPr>
           <w:p>
-            <w:pPr/>
+            <w:pPr>
+              <w:jc w:val="center"/>
+            </w:pPr>
+            <w:r>
+              <w:rPr>
+                <w:sz w:val="20"/>
+                <w:szCs w:val="20"/>
+              </w:rPr>
+              <w:t>Equipo de E&amp;S</w:t>
+            </w:r>
           </w:p>
         </w:tc>
       </w:tr>
@@ -4543,6 +4952,28 @@
             <w:vAlign w:val="center"/>
           </w:tcPr>
           <w:p>
+            <w:pPr/>
+          </w:p>
+        </w:tc>
+        <w:tc>
+          <w:tcPr>
+            <w:tcW w:w="5888" w:type="dxa"/>
+            <w:tcBorders>
+              <w:top w:val="single" w:sz="4" w:space="0" w:color="000000"/>
+              <w:left w:val="single" w:sz="4" w:space="0" w:color="000000"/>
+              <w:bottom w:val="single" w:sz="4" w:space="0" w:color="000000"/>
+              <w:right w:val="single" w:sz="4" w:space="0" w:color="000000"/>
+            </w:tcBorders>
+            <w:shd w:val="clear" w:color="auto" w:fill="D9D9D9"/>
+            <w:tcMar>
+              <w:top w:w="70" w:type="dxa"/>
+              <w:left w:w="100" w:type="dxa"/>
+              <w:bottom w:w="70" w:type="dxa"/>
+              <w:right w:w="100" w:type="dxa"/>
+            </w:tcMar>
+            <w:vAlign w:val="center"/>
+          </w:tcPr>
+          <w:p>
             <w:pPr>
               <w:jc w:val="center"/>
             </w:pPr>
@@ -4552,13 +4983,13 @@
                 <w:sz w:val="20"/>
                 <w:szCs w:val="20"/>
               </w:rPr>
-              <w:t>5.1</w:t>
-            </w:r>
-          </w:p>
-        </w:tc>
-        <w:tc>
-          <w:tcPr>
-            <w:tcW w:w="5888" w:type="dxa"/>
+              <w:t>FASE 5: ART Y PERMISOS DE TRABAJO</w:t>
+            </w:r>
+          </w:p>
+        </w:tc>
+        <w:tc>
+          <w:tcPr>
+            <w:tcW w:w="1900" w:type="dxa"/>
             <w:tcBorders>
               <w:top w:val="single" w:sz="4" w:space="0" w:color="000000"/>
               <w:left w:val="single" w:sz="4" w:space="0" w:color="000000"/>
@@ -4576,44 +5007,6 @@
           </w:tcPr>
           <w:p>
             <w:pPr/>
-            <w:r>
-              <w:rPr>
-                <w:sz w:val="20"/>
-                <w:szCs w:val="20"/>
-              </w:rPr>
-              <w:t>Primer incumplimiento (falta leve): advertencia verbal al trabajador y a su supervisor. Corrección inmediata del incumplimiento antes de continuar con la actividad. Registro del evento por parte de E&amp;S.</w:t>
-            </w:r>
-          </w:p>
-        </w:tc>
-        <w:tc>
-          <w:tcPr>
-            <w:tcW w:w="1900" w:type="dxa"/>
-            <w:tcBorders>
-              <w:top w:val="single" w:sz="4" w:space="0" w:color="000000"/>
-              <w:left w:val="single" w:sz="4" w:space="0" w:color="000000"/>
-              <w:bottom w:val="single" w:sz="4" w:space="0" w:color="000000"/>
-              <w:right w:val="single" w:sz="4" w:space="0" w:color="000000"/>
-            </w:tcBorders>
-            <w:shd w:val="clear" w:color="auto" w:fill="D9D9D9"/>
-            <w:tcMar>
-              <w:top w:w="70" w:type="dxa"/>
-              <w:left w:w="100" w:type="dxa"/>
-              <w:bottom w:w="70" w:type="dxa"/>
-              <w:right w:w="100" w:type="dxa"/>
-            </w:tcMar>
-            <w:vAlign w:val="center"/>
-          </w:tcPr>
-          <w:p>
-            <w:pPr>
-              <w:jc w:val="center"/>
-            </w:pPr>
-            <w:r>
-              <w:rPr>
-                <w:sz w:val="20"/>
-                <w:szCs w:val="20"/>
-              </w:rPr>
-              <w:t>Equipo de E&amp;S</w:t>
-            </w:r>
           </w:p>
         </w:tc>
         <w:tc>
@@ -4635,16 +5028,7 @@
             <w:vAlign w:val="center"/>
           </w:tcPr>
           <w:p>
-            <w:pPr>
-              <w:jc w:val="center"/>
-            </w:pPr>
-            <w:r>
-              <w:rPr>
-                <w:sz w:val="20"/>
-                <w:szCs w:val="20"/>
-              </w:rPr>
-              <w:t>Supervisor de Área</w:t>
-            </w:r>
+            <w:pPr/>
           </w:p>
         </w:tc>
       </w:tr>
@@ -4680,7 +5064,7 @@
                 <w:sz w:val="20"/>
                 <w:szCs w:val="20"/>
               </w:rPr>
-              <w:t>5.2</w:t>
+              <w:t>5.1</w:t>
             </w:r>
           </w:p>
         </w:tc>
@@ -4709,7 +5093,7 @@
                 <w:sz w:val="20"/>
                 <w:szCs w:val="20"/>
               </w:rPr>
-              <w:t>Segundo incumplimiento o incumplimiento moderado: paralización del trabajo hasta subsanar la condición + notificación formal escrita al representante legal o gerente de la empresa contratista.</w:t>
+              <w:t>Antes de iniciar cualquier actividad, el supervisor del contratista lidera el ART (Análisis de Riesgo en el Trabajo) con todos los trabajadores participantes. El ART desglosa la tarea paso a paso, identifica los peligros por cada paso y define los controles a aplicar. El ART debe ser firmado por todos los participantes y queda en sitio durante la ejecución.</w:t>
             </w:r>
           </w:p>
         </w:tc>
@@ -4740,38 +5124,38 @@
                 <w:sz w:val="20"/>
                 <w:szCs w:val="20"/>
               </w:rPr>
+              <w:t>Supervisor Contratista</w:t>
+            </w:r>
+          </w:p>
+        </w:tc>
+        <w:tc>
+          <w:tcPr>
+            <w:tcW w:w="1300" w:type="dxa"/>
+            <w:tcBorders>
+              <w:top w:val="single" w:sz="4" w:space="0" w:color="000000"/>
+              <w:left w:val="single" w:sz="4" w:space="0" w:color="000000"/>
+              <w:bottom w:val="single" w:sz="4" w:space="0" w:color="000000"/>
+              <w:right w:val="single" w:sz="4" w:space="0" w:color="000000"/>
+            </w:tcBorders>
+            <w:shd w:val="clear" w:color="auto" w:fill="D9D9D9"/>
+            <w:tcMar>
+              <w:top w:w="70" w:type="dxa"/>
+              <w:left w:w="100" w:type="dxa"/>
+              <w:bottom w:w="70" w:type="dxa"/>
+              <w:right w:w="100" w:type="dxa"/>
+            </w:tcMar>
+            <w:vAlign w:val="center"/>
+          </w:tcPr>
+          <w:p>
+            <w:pPr>
+              <w:jc w:val="center"/>
+            </w:pPr>
+            <w:r>
+              <w:rPr>
+                <w:sz w:val="20"/>
+                <w:szCs w:val="20"/>
+              </w:rPr>
               <w:t>Equipo de E&amp;S</w:t>
-            </w:r>
-          </w:p>
-        </w:tc>
-        <w:tc>
-          <w:tcPr>
-            <w:tcW w:w="1300" w:type="dxa"/>
-            <w:tcBorders>
-              <w:top w:val="single" w:sz="4" w:space="0" w:color="000000"/>
-              <w:left w:val="single" w:sz="4" w:space="0" w:color="000000"/>
-              <w:bottom w:val="single" w:sz="4" w:space="0" w:color="000000"/>
-              <w:right w:val="single" w:sz="4" w:space="0" w:color="000000"/>
-            </w:tcBorders>
-            <w:shd w:val="clear" w:color="auto" w:fill="D9D9D9"/>
-            <w:tcMar>
-              <w:top w:w="70" w:type="dxa"/>
-              <w:left w:w="100" w:type="dxa"/>
-              <w:bottom w:w="70" w:type="dxa"/>
-              <w:right w:w="100" w:type="dxa"/>
-            </w:tcMar>
-            <w:vAlign w:val="center"/>
-          </w:tcPr>
-          <w:p>
-            <w:pPr>
-              <w:jc w:val="center"/>
-            </w:pPr>
-            <w:r>
-              <w:rPr>
-                <w:sz w:val="20"/>
-                <w:szCs w:val="20"/>
-              </w:rPr>
-              <w:t>Gerencia de Planta</w:t>
             </w:r>
           </w:p>
         </w:tc>
@@ -4808,7 +5192,7 @@
                 <w:sz w:val="20"/>
                 <w:szCs w:val="20"/>
               </w:rPr>
-              <w:t>5.3</w:t>
+              <w:t>5.2</w:t>
             </w:r>
           </w:p>
         </w:tc>
@@ -4837,7 +5221,7 @@
                 <w:sz w:val="20"/>
                 <w:szCs w:val="20"/>
               </w:rPr>
-              <w:t>Tercer incumplimiento, incumplimiento grave o reincidente: suspensión de todas las actividades de la empresa contratista en planta + reporte a Gerencia General + evaluación de continuidad del contrato.</w:t>
+              <w:t>Para actividades de bajo a mediano riesgo (trabajos generales de mantenimiento, instalaciones menores, limpieza de equipos): solicitar Permiso de Trabajo General al Área Solicitante. El permiso debe especificar: fecha, área, descripción de la tarea, nombre del contratista y responsable de Plantabal. Firmado por Área Solicitante y E&amp;S.</w:t>
             </w:r>
           </w:p>
         </w:tc>
@@ -4868,7 +5252,7 @@
                 <w:sz w:val="20"/>
                 <w:szCs w:val="20"/>
               </w:rPr>
-              <w:t>Gerencia de Planta</w:t>
+              <w:t>Área Solicitante / Equipo de E&amp;S</w:t>
             </w:r>
           </w:p>
         </w:tc>
@@ -4899,7 +5283,7 @@
                 <w:sz w:val="20"/>
                 <w:szCs w:val="20"/>
               </w:rPr>
-              <w:t>Gerencia General</w:t>
+              <w:t>Supervisor Contratista</w:t>
             </w:r>
           </w:p>
         </w:tc>
@@ -4936,7 +5320,1877 @@
                 <w:sz w:val="20"/>
                 <w:szCs w:val="20"/>
               </w:rPr>
+              <w:t>5.3</w:t>
+            </w:r>
+          </w:p>
+        </w:tc>
+        <w:tc>
+          <w:tcPr>
+            <w:tcW w:w="5888" w:type="dxa"/>
+            <w:tcBorders>
+              <w:top w:val="single" w:sz="4" w:space="0" w:color="000000"/>
+              <w:left w:val="single" w:sz="4" w:space="0" w:color="000000"/>
+              <w:bottom w:val="single" w:sz="4" w:space="0" w:color="000000"/>
+              <w:right w:val="single" w:sz="4" w:space="0" w:color="000000"/>
+            </w:tcBorders>
+            <w:shd w:val="clear" w:color="auto" w:fill="D9D9D9"/>
+            <w:tcMar>
+              <w:top w:w="70" w:type="dxa"/>
+              <w:left w:w="100" w:type="dxa"/>
+              <w:bottom w:w="70" w:type="dxa"/>
+              <w:right w:w="100" w:type="dxa"/>
+            </w:tcMar>
+            <w:vAlign w:val="center"/>
+          </w:tcPr>
+          <w:p>
+            <w:pPr/>
+            <w:r>
+              <w:rPr>
+                <w:sz w:val="20"/>
+                <w:szCs w:val="20"/>
+              </w:rPr>
+              <w:t>Para trabajo en altura (≥1,8 m): solicitar Permiso de Trabajo Especial — Altura. Incluye: verificación del arnés y líneas de vida, identificación de puntos de anclaje, plan de rescate en caso de caída. Firmado por E&amp;S, Área Solicitante y supervisor del contratista. Válido solo por la jornada indicada.</w:t>
+            </w:r>
+          </w:p>
+        </w:tc>
+        <w:tc>
+          <w:tcPr>
+            <w:tcW w:w="1900" w:type="dxa"/>
+            <w:tcBorders>
+              <w:top w:val="single" w:sz="4" w:space="0" w:color="000000"/>
+              <w:left w:val="single" w:sz="4" w:space="0" w:color="000000"/>
+              <w:bottom w:val="single" w:sz="4" w:space="0" w:color="000000"/>
+              <w:right w:val="single" w:sz="4" w:space="0" w:color="000000"/>
+            </w:tcBorders>
+            <w:shd w:val="clear" w:color="auto" w:fill="D9D9D9"/>
+            <w:tcMar>
+              <w:top w:w="70" w:type="dxa"/>
+              <w:left w:w="100" w:type="dxa"/>
+              <w:bottom w:w="70" w:type="dxa"/>
+              <w:right w:w="100" w:type="dxa"/>
+            </w:tcMar>
+            <w:vAlign w:val="center"/>
+          </w:tcPr>
+          <w:p>
+            <w:pPr>
+              <w:jc w:val="center"/>
+            </w:pPr>
+            <w:r>
+              <w:rPr>
+                <w:sz w:val="20"/>
+                <w:szCs w:val="20"/>
+              </w:rPr>
+              <w:t>Equipo de E&amp;S</w:t>
+            </w:r>
+          </w:p>
+        </w:tc>
+        <w:tc>
+          <w:tcPr>
+            <w:tcW w:w="1300" w:type="dxa"/>
+            <w:tcBorders>
+              <w:top w:val="single" w:sz="4" w:space="0" w:color="000000"/>
+              <w:left w:val="single" w:sz="4" w:space="0" w:color="000000"/>
+              <w:bottom w:val="single" w:sz="4" w:space="0" w:color="000000"/>
+              <w:right w:val="single" w:sz="4" w:space="0" w:color="000000"/>
+            </w:tcBorders>
+            <w:shd w:val="clear" w:color="auto" w:fill="D9D9D9"/>
+            <w:tcMar>
+              <w:top w:w="70" w:type="dxa"/>
+              <w:left w:w="100" w:type="dxa"/>
+              <w:bottom w:w="70" w:type="dxa"/>
+              <w:right w:w="100" w:type="dxa"/>
+            </w:tcMar>
+            <w:vAlign w:val="center"/>
+          </w:tcPr>
+          <w:p>
+            <w:pPr>
+              <w:jc w:val="center"/>
+            </w:pPr>
+            <w:r>
+              <w:rPr>
+                <w:sz w:val="20"/>
+                <w:szCs w:val="20"/>
+              </w:rPr>
+              <w:t>Área Solicitante</w:t>
+            </w:r>
+          </w:p>
+        </w:tc>
+      </w:tr>
+      <w:tr>
+        <w:trPr>
+          <w:tblHeader/>
+        </w:trPr>
+        <w:tc>
+          <w:tcPr>
+            <w:tcW w:w="550" w:type="dxa"/>
+            <w:tcBorders>
+              <w:top w:val="single" w:sz="4" w:space="0" w:color="000000"/>
+              <w:left w:val="single" w:sz="4" w:space="0" w:color="000000"/>
+              <w:bottom w:val="single" w:sz="4" w:space="0" w:color="000000"/>
+              <w:right w:val="single" w:sz="4" w:space="0" w:color="000000"/>
+            </w:tcBorders>
+            <w:shd w:val="clear" w:color="auto" w:fill="D9D9D9"/>
+            <w:tcMar>
+              <w:top w:w="70" w:type="dxa"/>
+              <w:left w:w="100" w:type="dxa"/>
+              <w:bottom w:w="70" w:type="dxa"/>
+              <w:right w:w="100" w:type="dxa"/>
+            </w:tcMar>
+            <w:vAlign w:val="center"/>
+          </w:tcPr>
+          <w:p>
+            <w:pPr>
+              <w:jc w:val="center"/>
+            </w:pPr>
+            <w:r>
+              <w:rPr>
+                <w:b/>
+                <w:sz w:val="20"/>
+                <w:szCs w:val="20"/>
+              </w:rPr>
               <w:t>5.4</w:t>
+            </w:r>
+          </w:p>
+        </w:tc>
+        <w:tc>
+          <w:tcPr>
+            <w:tcW w:w="5888" w:type="dxa"/>
+            <w:tcBorders>
+              <w:top w:val="single" w:sz="4" w:space="0" w:color="000000"/>
+              <w:left w:val="single" w:sz="4" w:space="0" w:color="000000"/>
+              <w:bottom w:val="single" w:sz="4" w:space="0" w:color="000000"/>
+              <w:right w:val="single" w:sz="4" w:space="0" w:color="000000"/>
+            </w:tcBorders>
+            <w:shd w:val="clear" w:color="auto" w:fill="D9D9D9"/>
+            <w:tcMar>
+              <w:top w:w="70" w:type="dxa"/>
+              <w:left w:w="100" w:type="dxa"/>
+              <w:bottom w:w="70" w:type="dxa"/>
+              <w:right w:w="100" w:type="dxa"/>
+            </w:tcMar>
+            <w:vAlign w:val="center"/>
+          </w:tcPr>
+          <w:p>
+            <w:pPr/>
+            <w:r>
+              <w:rPr>
+                <w:sz w:val="20"/>
+                <w:szCs w:val="20"/>
+              </w:rPr>
+              <w:t>Para trabajo en caliente (soldadura, corte, esmerilado): solicitar Permiso de Trabajo Especial — Caliente. Incluye: eliminación de materiales inflamables en radio de 10 m, extintor disponible, vigía de fuego designado, revisión post-trabajo a los 30 minutos. Firmado por E&amp;S y Área Solicitante.</w:t>
+            </w:r>
+          </w:p>
+        </w:tc>
+        <w:tc>
+          <w:tcPr>
+            <w:tcW w:w="1900" w:type="dxa"/>
+            <w:tcBorders>
+              <w:top w:val="single" w:sz="4" w:space="0" w:color="000000"/>
+              <w:left w:val="single" w:sz="4" w:space="0" w:color="000000"/>
+              <w:bottom w:val="single" w:sz="4" w:space="0" w:color="000000"/>
+              <w:right w:val="single" w:sz="4" w:space="0" w:color="000000"/>
+            </w:tcBorders>
+            <w:shd w:val="clear" w:color="auto" w:fill="D9D9D9"/>
+            <w:tcMar>
+              <w:top w:w="70" w:type="dxa"/>
+              <w:left w:w="100" w:type="dxa"/>
+              <w:bottom w:w="70" w:type="dxa"/>
+              <w:right w:w="100" w:type="dxa"/>
+            </w:tcMar>
+            <w:vAlign w:val="center"/>
+          </w:tcPr>
+          <w:p>
+            <w:pPr>
+              <w:jc w:val="center"/>
+            </w:pPr>
+            <w:r>
+              <w:rPr>
+                <w:sz w:val="20"/>
+                <w:szCs w:val="20"/>
+              </w:rPr>
+              <w:t>Equipo de E&amp;S</w:t>
+            </w:r>
+          </w:p>
+        </w:tc>
+        <w:tc>
+          <w:tcPr>
+            <w:tcW w:w="1300" w:type="dxa"/>
+            <w:tcBorders>
+              <w:top w:val="single" w:sz="4" w:space="0" w:color="000000"/>
+              <w:left w:val="single" w:sz="4" w:space="0" w:color="000000"/>
+              <w:bottom w:val="single" w:sz="4" w:space="0" w:color="000000"/>
+              <w:right w:val="single" w:sz="4" w:space="0" w:color="000000"/>
+            </w:tcBorders>
+            <w:shd w:val="clear" w:color="auto" w:fill="D9D9D9"/>
+            <w:tcMar>
+              <w:top w:w="70" w:type="dxa"/>
+              <w:left w:w="100" w:type="dxa"/>
+              <w:bottom w:w="70" w:type="dxa"/>
+              <w:right w:w="100" w:type="dxa"/>
+            </w:tcMar>
+            <w:vAlign w:val="center"/>
+          </w:tcPr>
+          <w:p>
+            <w:pPr>
+              <w:jc w:val="center"/>
+            </w:pPr>
+            <w:r>
+              <w:rPr>
+                <w:sz w:val="20"/>
+                <w:szCs w:val="20"/>
+              </w:rPr>
+              <w:t>Área Solicitante</w:t>
+            </w:r>
+          </w:p>
+        </w:tc>
+      </w:tr>
+      <w:tr>
+        <w:trPr>
+          <w:tblHeader/>
+        </w:trPr>
+        <w:tc>
+          <w:tcPr>
+            <w:tcW w:w="550" w:type="dxa"/>
+            <w:tcBorders>
+              <w:top w:val="single" w:sz="4" w:space="0" w:color="000000"/>
+              <w:left w:val="single" w:sz="4" w:space="0" w:color="000000"/>
+              <w:bottom w:val="single" w:sz="4" w:space="0" w:color="000000"/>
+              <w:right w:val="single" w:sz="4" w:space="0" w:color="000000"/>
+            </w:tcBorders>
+            <w:shd w:val="clear" w:color="auto" w:fill="D9D9D9"/>
+            <w:tcMar>
+              <w:top w:w="70" w:type="dxa"/>
+              <w:left w:w="100" w:type="dxa"/>
+              <w:bottom w:w="70" w:type="dxa"/>
+              <w:right w:w="100" w:type="dxa"/>
+            </w:tcMar>
+            <w:vAlign w:val="center"/>
+          </w:tcPr>
+          <w:p>
+            <w:pPr>
+              <w:jc w:val="center"/>
+            </w:pPr>
+            <w:r>
+              <w:rPr>
+                <w:b/>
+                <w:sz w:val="20"/>
+                <w:szCs w:val="20"/>
+              </w:rPr>
+              <w:t>5.5</w:t>
+            </w:r>
+          </w:p>
+        </w:tc>
+        <w:tc>
+          <w:tcPr>
+            <w:tcW w:w="5888" w:type="dxa"/>
+            <w:tcBorders>
+              <w:top w:val="single" w:sz="4" w:space="0" w:color="000000"/>
+              <w:left w:val="single" w:sz="4" w:space="0" w:color="000000"/>
+              <w:bottom w:val="single" w:sz="4" w:space="0" w:color="000000"/>
+              <w:right w:val="single" w:sz="4" w:space="0" w:color="000000"/>
+            </w:tcBorders>
+            <w:shd w:val="clear" w:color="auto" w:fill="D9D9D9"/>
+            <w:tcMar>
+              <w:top w:w="70" w:type="dxa"/>
+              <w:left w:w="100" w:type="dxa"/>
+              <w:bottom w:w="70" w:type="dxa"/>
+              <w:right w:w="100" w:type="dxa"/>
+            </w:tcMar>
+            <w:vAlign w:val="center"/>
+          </w:tcPr>
+          <w:p>
+            <w:pPr/>
+            <w:r>
+              <w:rPr>
+                <w:sz w:val="20"/>
+                <w:szCs w:val="20"/>
+              </w:rPr>
+              <w:t>Para espacios confinados: solicitar Permiso de Trabajo Especial — Espacio Confinado. Incluye: medición de gases antes del ingreso (O₂ 19,5%-23,5%, CO &lt;25 ppm, H₂S &lt;10 ppm, LEL &lt;10%), lista de verificación de equipo de rescate, vigía externo permanente, protocolo de comunicación. El permiso debe ser re-evaluado si las condiciones cambian.</w:t>
+            </w:r>
+          </w:p>
+        </w:tc>
+        <w:tc>
+          <w:tcPr>
+            <w:tcW w:w="1900" w:type="dxa"/>
+            <w:tcBorders>
+              <w:top w:val="single" w:sz="4" w:space="0" w:color="000000"/>
+              <w:left w:val="single" w:sz="4" w:space="0" w:color="000000"/>
+              <w:bottom w:val="single" w:sz="4" w:space="0" w:color="000000"/>
+              <w:right w:val="single" w:sz="4" w:space="0" w:color="000000"/>
+            </w:tcBorders>
+            <w:shd w:val="clear" w:color="auto" w:fill="D9D9D9"/>
+            <w:tcMar>
+              <w:top w:w="70" w:type="dxa"/>
+              <w:left w:w="100" w:type="dxa"/>
+              <w:bottom w:w="70" w:type="dxa"/>
+              <w:right w:w="100" w:type="dxa"/>
+            </w:tcMar>
+            <w:vAlign w:val="center"/>
+          </w:tcPr>
+          <w:p>
+            <w:pPr>
+              <w:jc w:val="center"/>
+            </w:pPr>
+            <w:r>
+              <w:rPr>
+                <w:sz w:val="20"/>
+                <w:szCs w:val="20"/>
+              </w:rPr>
+              <w:t>Equipo de E&amp;S</w:t>
+            </w:r>
+          </w:p>
+        </w:tc>
+        <w:tc>
+          <w:tcPr>
+            <w:tcW w:w="1300" w:type="dxa"/>
+            <w:tcBorders>
+              <w:top w:val="single" w:sz="4" w:space="0" w:color="000000"/>
+              <w:left w:val="single" w:sz="4" w:space="0" w:color="000000"/>
+              <w:bottom w:val="single" w:sz="4" w:space="0" w:color="000000"/>
+              <w:right w:val="single" w:sz="4" w:space="0" w:color="000000"/>
+            </w:tcBorders>
+            <w:shd w:val="clear" w:color="auto" w:fill="D9D9D9"/>
+            <w:tcMar>
+              <w:top w:w="70" w:type="dxa"/>
+              <w:left w:w="100" w:type="dxa"/>
+              <w:bottom w:w="70" w:type="dxa"/>
+              <w:right w:w="100" w:type="dxa"/>
+            </w:tcMar>
+            <w:vAlign w:val="center"/>
+          </w:tcPr>
+          <w:p>
+            <w:pPr>
+              <w:jc w:val="center"/>
+            </w:pPr>
+            <w:r>
+              <w:rPr>
+                <w:sz w:val="20"/>
+                <w:szCs w:val="20"/>
+              </w:rPr>
+              <w:t>Gerencia de Planta</w:t>
+            </w:r>
+          </w:p>
+        </w:tc>
+      </w:tr>
+      <w:tr>
+        <w:trPr>
+          <w:tblHeader/>
+        </w:trPr>
+        <w:tc>
+          <w:tcPr>
+            <w:tcW w:w="550" w:type="dxa"/>
+            <w:tcBorders>
+              <w:top w:val="single" w:sz="4" w:space="0" w:color="000000"/>
+              <w:left w:val="single" w:sz="4" w:space="0" w:color="000000"/>
+              <w:bottom w:val="single" w:sz="4" w:space="0" w:color="000000"/>
+              <w:right w:val="single" w:sz="4" w:space="0" w:color="000000"/>
+            </w:tcBorders>
+            <w:shd w:val="clear" w:color="auto" w:fill="D9D9D9"/>
+            <w:tcMar>
+              <w:top w:w="70" w:type="dxa"/>
+              <w:left w:w="100" w:type="dxa"/>
+              <w:bottom w:w="70" w:type="dxa"/>
+              <w:right w:w="100" w:type="dxa"/>
+            </w:tcMar>
+            <w:vAlign w:val="center"/>
+          </w:tcPr>
+          <w:p>
+            <w:pPr>
+              <w:jc w:val="center"/>
+            </w:pPr>
+            <w:r>
+              <w:rPr>
+                <w:b/>
+                <w:sz w:val="20"/>
+                <w:szCs w:val="20"/>
+              </w:rPr>
+              <w:t>5.6</w:t>
+            </w:r>
+          </w:p>
+        </w:tc>
+        <w:tc>
+          <w:tcPr>
+            <w:tcW w:w="5888" w:type="dxa"/>
+            <w:tcBorders>
+              <w:top w:val="single" w:sz="4" w:space="0" w:color="000000"/>
+              <w:left w:val="single" w:sz="4" w:space="0" w:color="000000"/>
+              <w:bottom w:val="single" w:sz="4" w:space="0" w:color="000000"/>
+              <w:right w:val="single" w:sz="4" w:space="0" w:color="000000"/>
+            </w:tcBorders>
+            <w:shd w:val="clear" w:color="auto" w:fill="D9D9D9"/>
+            <w:tcMar>
+              <w:top w:w="70" w:type="dxa"/>
+              <w:left w:w="100" w:type="dxa"/>
+              <w:bottom w:w="70" w:type="dxa"/>
+              <w:right w:w="100" w:type="dxa"/>
+            </w:tcMar>
+            <w:vAlign w:val="center"/>
+          </w:tcPr>
+          <w:p>
+            <w:pPr/>
+            <w:r>
+              <w:rPr>
+                <w:sz w:val="20"/>
+                <w:szCs w:val="20"/>
+              </w:rPr>
+              <w:t>Para trabajos eléctricos o bloqueo de energía (LOTO): solicitar Permiso de Trabajo Especial — Eléctrico / LOTO. Incluye: identificación de todos los puntos de energía a aislar, candados y tarjetas por cada trabajador que interviene, verificación de ausencia de tensión antes de iniciar. Solo personal habilitado puede ejecutarlo.</w:t>
+            </w:r>
+          </w:p>
+        </w:tc>
+        <w:tc>
+          <w:tcPr>
+            <w:tcW w:w="1900" w:type="dxa"/>
+            <w:tcBorders>
+              <w:top w:val="single" w:sz="4" w:space="0" w:color="000000"/>
+              <w:left w:val="single" w:sz="4" w:space="0" w:color="000000"/>
+              <w:bottom w:val="single" w:sz="4" w:space="0" w:color="000000"/>
+              <w:right w:val="single" w:sz="4" w:space="0" w:color="000000"/>
+            </w:tcBorders>
+            <w:shd w:val="clear" w:color="auto" w:fill="D9D9D9"/>
+            <w:tcMar>
+              <w:top w:w="70" w:type="dxa"/>
+              <w:left w:w="100" w:type="dxa"/>
+              <w:bottom w:w="70" w:type="dxa"/>
+              <w:right w:w="100" w:type="dxa"/>
+            </w:tcMar>
+            <w:vAlign w:val="center"/>
+          </w:tcPr>
+          <w:p>
+            <w:pPr>
+              <w:jc w:val="center"/>
+            </w:pPr>
+            <w:r>
+              <w:rPr>
+                <w:sz w:val="20"/>
+                <w:szCs w:val="20"/>
+              </w:rPr>
+              <w:t>Equipo de E&amp;S</w:t>
+            </w:r>
+          </w:p>
+        </w:tc>
+        <w:tc>
+          <w:tcPr>
+            <w:tcW w:w="1300" w:type="dxa"/>
+            <w:tcBorders>
+              <w:top w:val="single" w:sz="4" w:space="0" w:color="000000"/>
+              <w:left w:val="single" w:sz="4" w:space="0" w:color="000000"/>
+              <w:bottom w:val="single" w:sz="4" w:space="0" w:color="000000"/>
+              <w:right w:val="single" w:sz="4" w:space="0" w:color="000000"/>
+            </w:tcBorders>
+            <w:shd w:val="clear" w:color="auto" w:fill="D9D9D9"/>
+            <w:tcMar>
+              <w:top w:w="70" w:type="dxa"/>
+              <w:left w:w="100" w:type="dxa"/>
+              <w:bottom w:w="70" w:type="dxa"/>
+              <w:right w:w="100" w:type="dxa"/>
+            </w:tcMar>
+            <w:vAlign w:val="center"/>
+          </w:tcPr>
+          <w:p>
+            <w:pPr>
+              <w:jc w:val="center"/>
+            </w:pPr>
+            <w:r>
+              <w:rPr>
+                <w:sz w:val="20"/>
+                <w:szCs w:val="20"/>
+              </w:rPr>
+              <w:t>Área Solicitante</w:t>
+            </w:r>
+          </w:p>
+        </w:tc>
+      </w:tr>
+      <w:tr>
+        <w:trPr>
+          <w:tblHeader/>
+        </w:trPr>
+        <w:tc>
+          <w:tcPr>
+            <w:tcW w:w="550" w:type="dxa"/>
+            <w:tcBorders>
+              <w:top w:val="single" w:sz="4" w:space="0" w:color="000000"/>
+              <w:left w:val="single" w:sz="4" w:space="0" w:color="000000"/>
+              <w:bottom w:val="single" w:sz="4" w:space="0" w:color="000000"/>
+              <w:right w:val="single" w:sz="4" w:space="0" w:color="000000"/>
+            </w:tcBorders>
+            <w:shd w:val="clear" w:color="auto" w:fill="D9D9D9"/>
+            <w:tcMar>
+              <w:top w:w="70" w:type="dxa"/>
+              <w:left w:w="100" w:type="dxa"/>
+              <w:bottom w:w="70" w:type="dxa"/>
+              <w:right w:w="100" w:type="dxa"/>
+            </w:tcMar>
+            <w:vAlign w:val="center"/>
+          </w:tcPr>
+          <w:p>
+            <w:pPr>
+              <w:jc w:val="center"/>
+            </w:pPr>
+            <w:r>
+              <w:rPr>
+                <w:b/>
+                <w:sz w:val="20"/>
+                <w:szCs w:val="20"/>
+              </w:rPr>
+              <w:t>5.7</w:t>
+            </w:r>
+          </w:p>
+        </w:tc>
+        <w:tc>
+          <w:tcPr>
+            <w:tcW w:w="5888" w:type="dxa"/>
+            <w:tcBorders>
+              <w:top w:val="single" w:sz="4" w:space="0" w:color="000000"/>
+              <w:left w:val="single" w:sz="4" w:space="0" w:color="000000"/>
+              <w:bottom w:val="single" w:sz="4" w:space="0" w:color="000000"/>
+              <w:right w:val="single" w:sz="4" w:space="0" w:color="000000"/>
+            </w:tcBorders>
+            <w:shd w:val="clear" w:color="auto" w:fill="D9D9D9"/>
+            <w:tcMar>
+              <w:top w:w="70" w:type="dxa"/>
+              <w:left w:w="100" w:type="dxa"/>
+              <w:bottom w:w="70" w:type="dxa"/>
+              <w:right w:w="100" w:type="dxa"/>
+            </w:tcMar>
+            <w:vAlign w:val="center"/>
+          </w:tcPr>
+          <w:p>
+            <w:pPr/>
+            <w:r>
+              <w:rPr>
+                <w:sz w:val="20"/>
+                <w:szCs w:val="20"/>
+              </w:rPr>
+              <w:t>Confirmar habilitaciones individuales del personal para trabajos especiales: certificados vigentes de trabajo en altura, espacio confinado, trabajos en caliente o LOTO según la actividad. Ningún trabajador sin habilitación vigente puede ejecutar la tarea especial, aunque porte el EPP.</w:t>
+            </w:r>
+          </w:p>
+        </w:tc>
+        <w:tc>
+          <w:tcPr>
+            <w:tcW w:w="1900" w:type="dxa"/>
+            <w:tcBorders>
+              <w:top w:val="single" w:sz="4" w:space="0" w:color="000000"/>
+              <w:left w:val="single" w:sz="4" w:space="0" w:color="000000"/>
+              <w:bottom w:val="single" w:sz="4" w:space="0" w:color="000000"/>
+              <w:right w:val="single" w:sz="4" w:space="0" w:color="000000"/>
+            </w:tcBorders>
+            <w:shd w:val="clear" w:color="auto" w:fill="D9D9D9"/>
+            <w:tcMar>
+              <w:top w:w="70" w:type="dxa"/>
+              <w:left w:w="100" w:type="dxa"/>
+              <w:bottom w:w="70" w:type="dxa"/>
+              <w:right w:w="100" w:type="dxa"/>
+            </w:tcMar>
+            <w:vAlign w:val="center"/>
+          </w:tcPr>
+          <w:p>
+            <w:pPr>
+              <w:jc w:val="center"/>
+            </w:pPr>
+            <w:r>
+              <w:rPr>
+                <w:sz w:val="20"/>
+                <w:szCs w:val="20"/>
+              </w:rPr>
+              <w:t>Equipo de E&amp;S</w:t>
+            </w:r>
+          </w:p>
+        </w:tc>
+        <w:tc>
+          <w:tcPr>
+            <w:tcW w:w="1300" w:type="dxa"/>
+            <w:tcBorders>
+              <w:top w:val="single" w:sz="4" w:space="0" w:color="000000"/>
+              <w:left w:val="single" w:sz="4" w:space="0" w:color="000000"/>
+              <w:bottom w:val="single" w:sz="4" w:space="0" w:color="000000"/>
+              <w:right w:val="single" w:sz="4" w:space="0" w:color="000000"/>
+            </w:tcBorders>
+            <w:shd w:val="clear" w:color="auto" w:fill="D9D9D9"/>
+            <w:tcMar>
+              <w:top w:w="70" w:type="dxa"/>
+              <w:left w:w="100" w:type="dxa"/>
+              <w:bottom w:w="70" w:type="dxa"/>
+              <w:right w:w="100" w:type="dxa"/>
+            </w:tcMar>
+            <w:vAlign w:val="center"/>
+          </w:tcPr>
+          <w:p>
+            <w:pPr>
+              <w:jc w:val="center"/>
+            </w:pPr>
+            <w:r>
+              <w:rPr>
+                <w:sz w:val="20"/>
+                <w:szCs w:val="20"/>
+              </w:rPr>
+              <w:t>Área Solicitante</w:t>
+            </w:r>
+          </w:p>
+        </w:tc>
+      </w:tr>
+      <w:tr>
+        <w:trPr>
+          <w:tblHeader/>
+        </w:trPr>
+        <w:tc>
+          <w:tcPr>
+            <w:tcW w:w="550" w:type="dxa"/>
+            <w:tcBorders>
+              <w:top w:val="single" w:sz="4" w:space="0" w:color="000000"/>
+              <w:left w:val="single" w:sz="4" w:space="0" w:color="000000"/>
+              <w:bottom w:val="single" w:sz="4" w:space="0" w:color="000000"/>
+              <w:right w:val="single" w:sz="4" w:space="0" w:color="000000"/>
+            </w:tcBorders>
+            <w:shd w:val="clear" w:color="auto" w:fill="D9D9D9"/>
+            <w:tcMar>
+              <w:top w:w="70" w:type="dxa"/>
+              <w:left w:w="100" w:type="dxa"/>
+              <w:bottom w:w="70" w:type="dxa"/>
+              <w:right w:w="100" w:type="dxa"/>
+            </w:tcMar>
+            <w:vAlign w:val="center"/>
+          </w:tcPr>
+          <w:p>
+            <w:pPr/>
+          </w:p>
+        </w:tc>
+        <w:tc>
+          <w:tcPr>
+            <w:tcW w:w="5888" w:type="dxa"/>
+            <w:tcBorders>
+              <w:top w:val="single" w:sz="4" w:space="0" w:color="000000"/>
+              <w:left w:val="single" w:sz="4" w:space="0" w:color="000000"/>
+              <w:bottom w:val="single" w:sz="4" w:space="0" w:color="000000"/>
+              <w:right w:val="single" w:sz="4" w:space="0" w:color="000000"/>
+            </w:tcBorders>
+            <w:shd w:val="clear" w:color="auto" w:fill="D9D9D9"/>
+            <w:tcMar>
+              <w:top w:w="70" w:type="dxa"/>
+              <w:left w:w="100" w:type="dxa"/>
+              <w:bottom w:w="70" w:type="dxa"/>
+              <w:right w:w="100" w:type="dxa"/>
+            </w:tcMar>
+            <w:vAlign w:val="center"/>
+          </w:tcPr>
+          <w:p>
+            <w:pPr>
+              <w:jc w:val="center"/>
+            </w:pPr>
+            <w:r>
+              <w:rPr>
+                <w:b/>
+                <w:sz w:val="20"/>
+                <w:szCs w:val="20"/>
+              </w:rPr>
+              <w:t>FASE 6: DISPOSICIÓN DE RESIDUOS</w:t>
+            </w:r>
+          </w:p>
+        </w:tc>
+        <w:tc>
+          <w:tcPr>
+            <w:tcW w:w="1900" w:type="dxa"/>
+            <w:tcBorders>
+              <w:top w:val="single" w:sz="4" w:space="0" w:color="000000"/>
+              <w:left w:val="single" w:sz="4" w:space="0" w:color="000000"/>
+              <w:bottom w:val="single" w:sz="4" w:space="0" w:color="000000"/>
+              <w:right w:val="single" w:sz="4" w:space="0" w:color="000000"/>
+            </w:tcBorders>
+            <w:shd w:val="clear" w:color="auto" w:fill="D9D9D9"/>
+            <w:tcMar>
+              <w:top w:w="70" w:type="dxa"/>
+              <w:left w:w="100" w:type="dxa"/>
+              <w:bottom w:w="70" w:type="dxa"/>
+              <w:right w:w="100" w:type="dxa"/>
+            </w:tcMar>
+            <w:vAlign w:val="center"/>
+          </w:tcPr>
+          <w:p>
+            <w:pPr/>
+          </w:p>
+        </w:tc>
+        <w:tc>
+          <w:tcPr>
+            <w:tcW w:w="1300" w:type="dxa"/>
+            <w:tcBorders>
+              <w:top w:val="single" w:sz="4" w:space="0" w:color="000000"/>
+              <w:left w:val="single" w:sz="4" w:space="0" w:color="000000"/>
+              <w:bottom w:val="single" w:sz="4" w:space="0" w:color="000000"/>
+              <w:right w:val="single" w:sz="4" w:space="0" w:color="000000"/>
+            </w:tcBorders>
+            <w:shd w:val="clear" w:color="auto" w:fill="D9D9D9"/>
+            <w:tcMar>
+              <w:top w:w="70" w:type="dxa"/>
+              <w:left w:w="100" w:type="dxa"/>
+              <w:bottom w:w="70" w:type="dxa"/>
+              <w:right w:w="100" w:type="dxa"/>
+            </w:tcMar>
+            <w:vAlign w:val="center"/>
+          </w:tcPr>
+          <w:p>
+            <w:pPr/>
+          </w:p>
+        </w:tc>
+      </w:tr>
+      <w:tr>
+        <w:trPr>
+          <w:tblHeader/>
+        </w:trPr>
+        <w:tc>
+          <w:tcPr>
+            <w:tcW w:w="550" w:type="dxa"/>
+            <w:tcBorders>
+              <w:top w:val="single" w:sz="4" w:space="0" w:color="000000"/>
+              <w:left w:val="single" w:sz="4" w:space="0" w:color="000000"/>
+              <w:bottom w:val="single" w:sz="4" w:space="0" w:color="000000"/>
+              <w:right w:val="single" w:sz="4" w:space="0" w:color="000000"/>
+            </w:tcBorders>
+            <w:shd w:val="clear" w:color="auto" w:fill="D9D9D9"/>
+            <w:tcMar>
+              <w:top w:w="70" w:type="dxa"/>
+              <w:left w:w="100" w:type="dxa"/>
+              <w:bottom w:w="70" w:type="dxa"/>
+              <w:right w:w="100" w:type="dxa"/>
+            </w:tcMar>
+            <w:vAlign w:val="center"/>
+          </w:tcPr>
+          <w:p>
+            <w:pPr>
+              <w:jc w:val="center"/>
+            </w:pPr>
+            <w:r>
+              <w:rPr>
+                <w:b/>
+                <w:sz w:val="20"/>
+                <w:szCs w:val="20"/>
+              </w:rPr>
+              <w:t>6.1</w:t>
+            </w:r>
+          </w:p>
+        </w:tc>
+        <w:tc>
+          <w:tcPr>
+            <w:tcW w:w="5888" w:type="dxa"/>
+            <w:tcBorders>
+              <w:top w:val="single" w:sz="4" w:space="0" w:color="000000"/>
+              <w:left w:val="single" w:sz="4" w:space="0" w:color="000000"/>
+              <w:bottom w:val="single" w:sz="4" w:space="0" w:color="000000"/>
+              <w:right w:val="single" w:sz="4" w:space="0" w:color="000000"/>
+            </w:tcBorders>
+            <w:shd w:val="clear" w:color="auto" w:fill="D9D9D9"/>
+            <w:tcMar>
+              <w:top w:w="70" w:type="dxa"/>
+              <w:left w:w="100" w:type="dxa"/>
+              <w:bottom w:w="70" w:type="dxa"/>
+              <w:right w:w="100" w:type="dxa"/>
+            </w:tcMar>
+            <w:vAlign w:val="center"/>
+          </w:tcPr>
+          <w:p>
+            <w:pPr/>
+            <w:r>
+              <w:rPr>
+                <w:sz w:val="20"/>
+                <w:szCs w:val="20"/>
+              </w:rPr>
+              <w:t>Antes de iniciar, el supervisor del contratista coordinará con el Área Solicitante la identificación y ubicación de los contenedores de residuos disponibles en el área: residuos comunes (negro/gris), reciclables (azul/verde), peligrosos (rojo/naranja) y chatarra/metal (contenedor específico de planta).</w:t>
+            </w:r>
+          </w:p>
+        </w:tc>
+        <w:tc>
+          <w:tcPr>
+            <w:tcW w:w="1900" w:type="dxa"/>
+            <w:tcBorders>
+              <w:top w:val="single" w:sz="4" w:space="0" w:color="000000"/>
+              <w:left w:val="single" w:sz="4" w:space="0" w:color="000000"/>
+              <w:bottom w:val="single" w:sz="4" w:space="0" w:color="000000"/>
+              <w:right w:val="single" w:sz="4" w:space="0" w:color="000000"/>
+            </w:tcBorders>
+            <w:shd w:val="clear" w:color="auto" w:fill="D9D9D9"/>
+            <w:tcMar>
+              <w:top w:w="70" w:type="dxa"/>
+              <w:left w:w="100" w:type="dxa"/>
+              <w:bottom w:w="70" w:type="dxa"/>
+              <w:right w:w="100" w:type="dxa"/>
+            </w:tcMar>
+            <w:vAlign w:val="center"/>
+          </w:tcPr>
+          <w:p>
+            <w:pPr>
+              <w:jc w:val="center"/>
+            </w:pPr>
+            <w:r>
+              <w:rPr>
+                <w:sz w:val="20"/>
+                <w:szCs w:val="20"/>
+              </w:rPr>
+              <w:t>Supervisor Contratista / Área Solicitante</w:t>
+            </w:r>
+          </w:p>
+        </w:tc>
+        <w:tc>
+          <w:tcPr>
+            <w:tcW w:w="1300" w:type="dxa"/>
+            <w:tcBorders>
+              <w:top w:val="single" w:sz="4" w:space="0" w:color="000000"/>
+              <w:left w:val="single" w:sz="4" w:space="0" w:color="000000"/>
+              <w:bottom w:val="single" w:sz="4" w:space="0" w:color="000000"/>
+              <w:right w:val="single" w:sz="4" w:space="0" w:color="000000"/>
+            </w:tcBorders>
+            <w:shd w:val="clear" w:color="auto" w:fill="D9D9D9"/>
+            <w:tcMar>
+              <w:top w:w="70" w:type="dxa"/>
+              <w:left w:w="100" w:type="dxa"/>
+              <w:bottom w:w="70" w:type="dxa"/>
+              <w:right w:w="100" w:type="dxa"/>
+            </w:tcMar>
+            <w:vAlign w:val="center"/>
+          </w:tcPr>
+          <w:p>
+            <w:pPr>
+              <w:jc w:val="center"/>
+            </w:pPr>
+            <w:r>
+              <w:rPr>
+                <w:sz w:val="20"/>
+                <w:szCs w:val="20"/>
+              </w:rPr>
+              <w:t>Equipo de E&amp;S</w:t>
+            </w:r>
+          </w:p>
+        </w:tc>
+      </w:tr>
+      <w:tr>
+        <w:trPr>
+          <w:tblHeader/>
+        </w:trPr>
+        <w:tc>
+          <w:tcPr>
+            <w:tcW w:w="550" w:type="dxa"/>
+            <w:tcBorders>
+              <w:top w:val="single" w:sz="4" w:space="0" w:color="000000"/>
+              <w:left w:val="single" w:sz="4" w:space="0" w:color="000000"/>
+              <w:bottom w:val="single" w:sz="4" w:space="0" w:color="000000"/>
+              <w:right w:val="single" w:sz="4" w:space="0" w:color="000000"/>
+            </w:tcBorders>
+            <w:shd w:val="clear" w:color="auto" w:fill="D9D9D9"/>
+            <w:tcMar>
+              <w:top w:w="70" w:type="dxa"/>
+              <w:left w:w="100" w:type="dxa"/>
+              <w:bottom w:w="70" w:type="dxa"/>
+              <w:right w:w="100" w:type="dxa"/>
+            </w:tcMar>
+            <w:vAlign w:val="center"/>
+          </w:tcPr>
+          <w:p>
+            <w:pPr>
+              <w:jc w:val="center"/>
+            </w:pPr>
+            <w:r>
+              <w:rPr>
+                <w:b/>
+                <w:sz w:val="20"/>
+                <w:szCs w:val="20"/>
+              </w:rPr>
+              <w:t>6.2</w:t>
+            </w:r>
+          </w:p>
+        </w:tc>
+        <w:tc>
+          <w:tcPr>
+            <w:tcW w:w="5888" w:type="dxa"/>
+            <w:tcBorders>
+              <w:top w:val="single" w:sz="4" w:space="0" w:color="000000"/>
+              <w:left w:val="single" w:sz="4" w:space="0" w:color="000000"/>
+              <w:bottom w:val="single" w:sz="4" w:space="0" w:color="000000"/>
+              <w:right w:val="single" w:sz="4" w:space="0" w:color="000000"/>
+            </w:tcBorders>
+            <w:shd w:val="clear" w:color="auto" w:fill="D9D9D9"/>
+            <w:tcMar>
+              <w:top w:w="70" w:type="dxa"/>
+              <w:left w:w="100" w:type="dxa"/>
+              <w:bottom w:w="70" w:type="dxa"/>
+              <w:right w:w="100" w:type="dxa"/>
+            </w:tcMar>
+            <w:vAlign w:val="center"/>
+          </w:tcPr>
+          <w:p>
+            <w:pPr/>
+            <w:r>
+              <w:rPr>
+                <w:sz w:val="20"/>
+                <w:szCs w:val="20"/>
+              </w:rPr>
+              <w:t>Los residuos generados por el contratista deben segregarse en el punto de generación. Está prohibido mezclar residuos peligrosos con residuos comunes. Los trapos con aceite, solventes, pinturas o productos químicos se depositan en el contenedor de residuos peligrosos, nunca en la basura común.</w:t>
+            </w:r>
+          </w:p>
+        </w:tc>
+        <w:tc>
+          <w:tcPr>
+            <w:tcW w:w="1900" w:type="dxa"/>
+            <w:tcBorders>
+              <w:top w:val="single" w:sz="4" w:space="0" w:color="000000"/>
+              <w:left w:val="single" w:sz="4" w:space="0" w:color="000000"/>
+              <w:bottom w:val="single" w:sz="4" w:space="0" w:color="000000"/>
+              <w:right w:val="single" w:sz="4" w:space="0" w:color="000000"/>
+            </w:tcBorders>
+            <w:shd w:val="clear" w:color="auto" w:fill="D9D9D9"/>
+            <w:tcMar>
+              <w:top w:w="70" w:type="dxa"/>
+              <w:left w:w="100" w:type="dxa"/>
+              <w:bottom w:w="70" w:type="dxa"/>
+              <w:right w:w="100" w:type="dxa"/>
+            </w:tcMar>
+            <w:vAlign w:val="center"/>
+          </w:tcPr>
+          <w:p>
+            <w:pPr>
+              <w:jc w:val="center"/>
+            </w:pPr>
+            <w:r>
+              <w:rPr>
+                <w:sz w:val="20"/>
+                <w:szCs w:val="20"/>
+              </w:rPr>
+              <w:t>Supervisor Contratista</w:t>
+            </w:r>
+          </w:p>
+        </w:tc>
+        <w:tc>
+          <w:tcPr>
+            <w:tcW w:w="1300" w:type="dxa"/>
+            <w:tcBorders>
+              <w:top w:val="single" w:sz="4" w:space="0" w:color="000000"/>
+              <w:left w:val="single" w:sz="4" w:space="0" w:color="000000"/>
+              <w:bottom w:val="single" w:sz="4" w:space="0" w:color="000000"/>
+              <w:right w:val="single" w:sz="4" w:space="0" w:color="000000"/>
+            </w:tcBorders>
+            <w:shd w:val="clear" w:color="auto" w:fill="D9D9D9"/>
+            <w:tcMar>
+              <w:top w:w="70" w:type="dxa"/>
+              <w:left w:w="100" w:type="dxa"/>
+              <w:bottom w:w="70" w:type="dxa"/>
+              <w:right w:w="100" w:type="dxa"/>
+            </w:tcMar>
+            <w:vAlign w:val="center"/>
+          </w:tcPr>
+          <w:p>
+            <w:pPr>
+              <w:jc w:val="center"/>
+            </w:pPr>
+            <w:r>
+              <w:rPr>
+                <w:sz w:val="20"/>
+                <w:szCs w:val="20"/>
+              </w:rPr>
+              <w:t>Equipo de E&amp;S</w:t>
+            </w:r>
+          </w:p>
+        </w:tc>
+      </w:tr>
+      <w:tr>
+        <w:trPr>
+          <w:tblHeader/>
+        </w:trPr>
+        <w:tc>
+          <w:tcPr>
+            <w:tcW w:w="550" w:type="dxa"/>
+            <w:tcBorders>
+              <w:top w:val="single" w:sz="4" w:space="0" w:color="000000"/>
+              <w:left w:val="single" w:sz="4" w:space="0" w:color="000000"/>
+              <w:bottom w:val="single" w:sz="4" w:space="0" w:color="000000"/>
+              <w:right w:val="single" w:sz="4" w:space="0" w:color="000000"/>
+            </w:tcBorders>
+            <w:shd w:val="clear" w:color="auto" w:fill="D9D9D9"/>
+            <w:tcMar>
+              <w:top w:w="70" w:type="dxa"/>
+              <w:left w:w="100" w:type="dxa"/>
+              <w:bottom w:w="70" w:type="dxa"/>
+              <w:right w:w="100" w:type="dxa"/>
+            </w:tcMar>
+            <w:vAlign w:val="center"/>
+          </w:tcPr>
+          <w:p>
+            <w:pPr>
+              <w:jc w:val="center"/>
+            </w:pPr>
+            <w:r>
+              <w:rPr>
+                <w:b/>
+                <w:sz w:val="20"/>
+                <w:szCs w:val="20"/>
+              </w:rPr>
+              <w:t>6.3</w:t>
+            </w:r>
+          </w:p>
+        </w:tc>
+        <w:tc>
+          <w:tcPr>
+            <w:tcW w:w="5888" w:type="dxa"/>
+            <w:tcBorders>
+              <w:top w:val="single" w:sz="4" w:space="0" w:color="000000"/>
+              <w:left w:val="single" w:sz="4" w:space="0" w:color="000000"/>
+              <w:bottom w:val="single" w:sz="4" w:space="0" w:color="000000"/>
+              <w:right w:val="single" w:sz="4" w:space="0" w:color="000000"/>
+            </w:tcBorders>
+            <w:shd w:val="clear" w:color="auto" w:fill="D9D9D9"/>
+            <w:tcMar>
+              <w:top w:w="70" w:type="dxa"/>
+              <w:left w:w="100" w:type="dxa"/>
+              <w:bottom w:w="70" w:type="dxa"/>
+              <w:right w:w="100" w:type="dxa"/>
+            </w:tcMar>
+            <w:vAlign w:val="center"/>
+          </w:tcPr>
+          <w:p>
+            <w:pPr/>
+            <w:r>
+              <w:rPr>
+                <w:sz w:val="20"/>
+                <w:szCs w:val="20"/>
+              </w:rPr>
+              <w:t>Los residuos peligrosos generados por el contratista (envases de químicos, trapos contaminados, filtros de aceite, baterías, fluorescentes) deben ser retirados por el propio contratista con gestor ambiental autorizado, o depositados en el área de almacenamiento temporal de residuos peligrosos de Plantabal previa autorización. El contratista debe presentar el manifiesto de disposición si se le solicita.</w:t>
+            </w:r>
+          </w:p>
+        </w:tc>
+        <w:tc>
+          <w:tcPr>
+            <w:tcW w:w="1900" w:type="dxa"/>
+            <w:tcBorders>
+              <w:top w:val="single" w:sz="4" w:space="0" w:color="000000"/>
+              <w:left w:val="single" w:sz="4" w:space="0" w:color="000000"/>
+              <w:bottom w:val="single" w:sz="4" w:space="0" w:color="000000"/>
+              <w:right w:val="single" w:sz="4" w:space="0" w:color="000000"/>
+            </w:tcBorders>
+            <w:shd w:val="clear" w:color="auto" w:fill="D9D9D9"/>
+            <w:tcMar>
+              <w:top w:w="70" w:type="dxa"/>
+              <w:left w:w="100" w:type="dxa"/>
+              <w:bottom w:w="70" w:type="dxa"/>
+              <w:right w:w="100" w:type="dxa"/>
+            </w:tcMar>
+            <w:vAlign w:val="center"/>
+          </w:tcPr>
+          <w:p>
+            <w:pPr>
+              <w:jc w:val="center"/>
+            </w:pPr>
+            <w:r>
+              <w:rPr>
+                <w:sz w:val="20"/>
+                <w:szCs w:val="20"/>
+              </w:rPr>
+              <w:t>Supervisor Contratista</w:t>
+            </w:r>
+          </w:p>
+        </w:tc>
+        <w:tc>
+          <w:tcPr>
+            <w:tcW w:w="1300" w:type="dxa"/>
+            <w:tcBorders>
+              <w:top w:val="single" w:sz="4" w:space="0" w:color="000000"/>
+              <w:left w:val="single" w:sz="4" w:space="0" w:color="000000"/>
+              <w:bottom w:val="single" w:sz="4" w:space="0" w:color="000000"/>
+              <w:right w:val="single" w:sz="4" w:space="0" w:color="000000"/>
+            </w:tcBorders>
+            <w:shd w:val="clear" w:color="auto" w:fill="D9D9D9"/>
+            <w:tcMar>
+              <w:top w:w="70" w:type="dxa"/>
+              <w:left w:w="100" w:type="dxa"/>
+              <w:bottom w:w="70" w:type="dxa"/>
+              <w:right w:w="100" w:type="dxa"/>
+            </w:tcMar>
+            <w:vAlign w:val="center"/>
+          </w:tcPr>
+          <w:p>
+            <w:pPr>
+              <w:jc w:val="center"/>
+            </w:pPr>
+            <w:r>
+              <w:rPr>
+                <w:sz w:val="20"/>
+                <w:szCs w:val="20"/>
+              </w:rPr>
+              <w:t>Equipo de E&amp;S / Área Solicitante</w:t>
+            </w:r>
+          </w:p>
+        </w:tc>
+      </w:tr>
+      <w:tr>
+        <w:trPr>
+          <w:tblHeader/>
+        </w:trPr>
+        <w:tc>
+          <w:tcPr>
+            <w:tcW w:w="550" w:type="dxa"/>
+            <w:tcBorders>
+              <w:top w:val="single" w:sz="4" w:space="0" w:color="000000"/>
+              <w:left w:val="single" w:sz="4" w:space="0" w:color="000000"/>
+              <w:bottom w:val="single" w:sz="4" w:space="0" w:color="000000"/>
+              <w:right w:val="single" w:sz="4" w:space="0" w:color="000000"/>
+            </w:tcBorders>
+            <w:shd w:val="clear" w:color="auto" w:fill="D9D9D9"/>
+            <w:tcMar>
+              <w:top w:w="70" w:type="dxa"/>
+              <w:left w:w="100" w:type="dxa"/>
+              <w:bottom w:w="70" w:type="dxa"/>
+              <w:right w:w="100" w:type="dxa"/>
+            </w:tcMar>
+            <w:vAlign w:val="center"/>
+          </w:tcPr>
+          <w:p>
+            <w:pPr>
+              <w:jc w:val="center"/>
+            </w:pPr>
+            <w:r>
+              <w:rPr>
+                <w:b/>
+                <w:sz w:val="20"/>
+                <w:szCs w:val="20"/>
+              </w:rPr>
+              <w:t>6.4</w:t>
+            </w:r>
+          </w:p>
+        </w:tc>
+        <w:tc>
+          <w:tcPr>
+            <w:tcW w:w="5888" w:type="dxa"/>
+            <w:tcBorders>
+              <w:top w:val="single" w:sz="4" w:space="0" w:color="000000"/>
+              <w:left w:val="single" w:sz="4" w:space="0" w:color="000000"/>
+              <w:bottom w:val="single" w:sz="4" w:space="0" w:color="000000"/>
+              <w:right w:val="single" w:sz="4" w:space="0" w:color="000000"/>
+            </w:tcBorders>
+            <w:shd w:val="clear" w:color="auto" w:fill="D9D9D9"/>
+            <w:tcMar>
+              <w:top w:w="70" w:type="dxa"/>
+              <w:left w:w="100" w:type="dxa"/>
+              <w:bottom w:w="70" w:type="dxa"/>
+              <w:right w:w="100" w:type="dxa"/>
+            </w:tcMar>
+            <w:vAlign w:val="center"/>
+          </w:tcPr>
+          <w:p>
+            <w:pPr/>
+            <w:r>
+              <w:rPr>
+                <w:sz w:val="20"/>
+                <w:szCs w:val="20"/>
+              </w:rPr>
+              <w:t>Al finalizar cada jornada y al término del contrato, el contratista debe dejar el área de trabajo completamente libre de residuos, materiales sobrantes, herramientas y equipos propios. El Área Solicitante y E&amp;S verifican el estado del área antes de dar por finalizada la actividad.</w:t>
+            </w:r>
+          </w:p>
+        </w:tc>
+        <w:tc>
+          <w:tcPr>
+            <w:tcW w:w="1900" w:type="dxa"/>
+            <w:tcBorders>
+              <w:top w:val="single" w:sz="4" w:space="0" w:color="000000"/>
+              <w:left w:val="single" w:sz="4" w:space="0" w:color="000000"/>
+              <w:bottom w:val="single" w:sz="4" w:space="0" w:color="000000"/>
+              <w:right w:val="single" w:sz="4" w:space="0" w:color="000000"/>
+            </w:tcBorders>
+            <w:shd w:val="clear" w:color="auto" w:fill="D9D9D9"/>
+            <w:tcMar>
+              <w:top w:w="70" w:type="dxa"/>
+              <w:left w:w="100" w:type="dxa"/>
+              <w:bottom w:w="70" w:type="dxa"/>
+              <w:right w:w="100" w:type="dxa"/>
+            </w:tcMar>
+            <w:vAlign w:val="center"/>
+          </w:tcPr>
+          <w:p>
+            <w:pPr>
+              <w:jc w:val="center"/>
+            </w:pPr>
+            <w:r>
+              <w:rPr>
+                <w:sz w:val="20"/>
+                <w:szCs w:val="20"/>
+              </w:rPr>
+              <w:t>Supervisor Contratista</w:t>
+            </w:r>
+          </w:p>
+        </w:tc>
+        <w:tc>
+          <w:tcPr>
+            <w:tcW w:w="1300" w:type="dxa"/>
+            <w:tcBorders>
+              <w:top w:val="single" w:sz="4" w:space="0" w:color="000000"/>
+              <w:left w:val="single" w:sz="4" w:space="0" w:color="000000"/>
+              <w:bottom w:val="single" w:sz="4" w:space="0" w:color="000000"/>
+              <w:right w:val="single" w:sz="4" w:space="0" w:color="000000"/>
+            </w:tcBorders>
+            <w:shd w:val="clear" w:color="auto" w:fill="D9D9D9"/>
+            <w:tcMar>
+              <w:top w:w="70" w:type="dxa"/>
+              <w:left w:w="100" w:type="dxa"/>
+              <w:bottom w:w="70" w:type="dxa"/>
+              <w:right w:w="100" w:type="dxa"/>
+            </w:tcMar>
+            <w:vAlign w:val="center"/>
+          </w:tcPr>
+          <w:p>
+            <w:pPr>
+              <w:jc w:val="center"/>
+            </w:pPr>
+            <w:r>
+              <w:rPr>
+                <w:sz w:val="20"/>
+                <w:szCs w:val="20"/>
+              </w:rPr>
+              <w:t>Área Solicitante / Equipo de E&amp;S</w:t>
+            </w:r>
+          </w:p>
+        </w:tc>
+      </w:tr>
+      <w:tr>
+        <w:trPr>
+          <w:tblHeader/>
+        </w:trPr>
+        <w:tc>
+          <w:tcPr>
+            <w:tcW w:w="550" w:type="dxa"/>
+            <w:tcBorders>
+              <w:top w:val="single" w:sz="4" w:space="0" w:color="000000"/>
+              <w:left w:val="single" w:sz="4" w:space="0" w:color="000000"/>
+              <w:bottom w:val="single" w:sz="4" w:space="0" w:color="000000"/>
+              <w:right w:val="single" w:sz="4" w:space="0" w:color="000000"/>
+            </w:tcBorders>
+            <w:shd w:val="clear" w:color="auto" w:fill="D9D9D9"/>
+            <w:tcMar>
+              <w:top w:w="70" w:type="dxa"/>
+              <w:left w:w="100" w:type="dxa"/>
+              <w:bottom w:w="70" w:type="dxa"/>
+              <w:right w:w="100" w:type="dxa"/>
+            </w:tcMar>
+            <w:vAlign w:val="center"/>
+          </w:tcPr>
+          <w:p>
+            <w:pPr>
+              <w:jc w:val="center"/>
+            </w:pPr>
+            <w:r>
+              <w:rPr>
+                <w:b/>
+                <w:sz w:val="20"/>
+                <w:szCs w:val="20"/>
+              </w:rPr>
+              <w:t>6.5</w:t>
+            </w:r>
+          </w:p>
+        </w:tc>
+        <w:tc>
+          <w:tcPr>
+            <w:tcW w:w="5888" w:type="dxa"/>
+            <w:tcBorders>
+              <w:top w:val="single" w:sz="4" w:space="0" w:color="000000"/>
+              <w:left w:val="single" w:sz="4" w:space="0" w:color="000000"/>
+              <w:bottom w:val="single" w:sz="4" w:space="0" w:color="000000"/>
+              <w:right w:val="single" w:sz="4" w:space="0" w:color="000000"/>
+            </w:tcBorders>
+            <w:shd w:val="clear" w:color="auto" w:fill="D9D9D9"/>
+            <w:tcMar>
+              <w:top w:w="70" w:type="dxa"/>
+              <w:left w:w="100" w:type="dxa"/>
+              <w:bottom w:w="70" w:type="dxa"/>
+              <w:right w:w="100" w:type="dxa"/>
+            </w:tcMar>
+            <w:vAlign w:val="center"/>
+          </w:tcPr>
+          <w:p>
+            <w:pPr/>
+            <w:r>
+              <w:rPr>
+                <w:sz w:val="20"/>
+                <w:szCs w:val="20"/>
+              </w:rPr>
+              <w:t>Está prohibido el vertimiento de líquidos (aceites, solventes, pinturas, aguas de lavado contaminadas) en el sistema de alcantarillado, suelo o cuerpos de agua de la planta. En caso de derrame accidental, el contratista debe notificar de inmediato al Área Solicitante y a E&amp;S, y ejecutar el plan de respuesta a derrames.</w:t>
+            </w:r>
+          </w:p>
+        </w:tc>
+        <w:tc>
+          <w:tcPr>
+            <w:tcW w:w="1900" w:type="dxa"/>
+            <w:tcBorders>
+              <w:top w:val="single" w:sz="4" w:space="0" w:color="000000"/>
+              <w:left w:val="single" w:sz="4" w:space="0" w:color="000000"/>
+              <w:bottom w:val="single" w:sz="4" w:space="0" w:color="000000"/>
+              <w:right w:val="single" w:sz="4" w:space="0" w:color="000000"/>
+            </w:tcBorders>
+            <w:shd w:val="clear" w:color="auto" w:fill="D9D9D9"/>
+            <w:tcMar>
+              <w:top w:w="70" w:type="dxa"/>
+              <w:left w:w="100" w:type="dxa"/>
+              <w:bottom w:w="70" w:type="dxa"/>
+              <w:right w:w="100" w:type="dxa"/>
+            </w:tcMar>
+            <w:vAlign w:val="center"/>
+          </w:tcPr>
+          <w:p>
+            <w:pPr>
+              <w:jc w:val="center"/>
+            </w:pPr>
+            <w:r>
+              <w:rPr>
+                <w:sz w:val="20"/>
+                <w:szCs w:val="20"/>
+              </w:rPr>
+              <w:t>Supervisor Contratista</w:t>
+            </w:r>
+          </w:p>
+        </w:tc>
+        <w:tc>
+          <w:tcPr>
+            <w:tcW w:w="1300" w:type="dxa"/>
+            <w:tcBorders>
+              <w:top w:val="single" w:sz="4" w:space="0" w:color="000000"/>
+              <w:left w:val="single" w:sz="4" w:space="0" w:color="000000"/>
+              <w:bottom w:val="single" w:sz="4" w:space="0" w:color="000000"/>
+              <w:right w:val="single" w:sz="4" w:space="0" w:color="000000"/>
+            </w:tcBorders>
+            <w:shd w:val="clear" w:color="auto" w:fill="D9D9D9"/>
+            <w:tcMar>
+              <w:top w:w="70" w:type="dxa"/>
+              <w:left w:w="100" w:type="dxa"/>
+              <w:bottom w:w="70" w:type="dxa"/>
+              <w:right w:w="100" w:type="dxa"/>
+            </w:tcMar>
+            <w:vAlign w:val="center"/>
+          </w:tcPr>
+          <w:p>
+            <w:pPr>
+              <w:jc w:val="center"/>
+            </w:pPr>
+            <w:r>
+              <w:rPr>
+                <w:sz w:val="20"/>
+                <w:szCs w:val="20"/>
+              </w:rPr>
+              <w:t>Equipo de E&amp;S / Área Solicitante</w:t>
+            </w:r>
+          </w:p>
+        </w:tc>
+      </w:tr>
+      <w:tr>
+        <w:trPr>
+          <w:tblHeader/>
+        </w:trPr>
+        <w:tc>
+          <w:tcPr>
+            <w:tcW w:w="550" w:type="dxa"/>
+            <w:tcBorders>
+              <w:top w:val="single" w:sz="4" w:space="0" w:color="000000"/>
+              <w:left w:val="single" w:sz="4" w:space="0" w:color="000000"/>
+              <w:bottom w:val="single" w:sz="4" w:space="0" w:color="000000"/>
+              <w:right w:val="single" w:sz="4" w:space="0" w:color="000000"/>
+            </w:tcBorders>
+            <w:shd w:val="clear" w:color="auto" w:fill="D9D9D9"/>
+            <w:tcMar>
+              <w:top w:w="70" w:type="dxa"/>
+              <w:left w:w="100" w:type="dxa"/>
+              <w:bottom w:w="70" w:type="dxa"/>
+              <w:right w:w="100" w:type="dxa"/>
+            </w:tcMar>
+            <w:vAlign w:val="center"/>
+          </w:tcPr>
+          <w:p>
+            <w:pPr/>
+          </w:p>
+        </w:tc>
+        <w:tc>
+          <w:tcPr>
+            <w:tcW w:w="5888" w:type="dxa"/>
+            <w:tcBorders>
+              <w:top w:val="single" w:sz="4" w:space="0" w:color="000000"/>
+              <w:left w:val="single" w:sz="4" w:space="0" w:color="000000"/>
+              <w:bottom w:val="single" w:sz="4" w:space="0" w:color="000000"/>
+              <w:right w:val="single" w:sz="4" w:space="0" w:color="000000"/>
+            </w:tcBorders>
+            <w:shd w:val="clear" w:color="auto" w:fill="D9D9D9"/>
+            <w:tcMar>
+              <w:top w:w="70" w:type="dxa"/>
+              <w:left w:w="100" w:type="dxa"/>
+              <w:bottom w:w="70" w:type="dxa"/>
+              <w:right w:w="100" w:type="dxa"/>
+            </w:tcMar>
+            <w:vAlign w:val="center"/>
+          </w:tcPr>
+          <w:p>
+            <w:pPr>
+              <w:jc w:val="center"/>
+            </w:pPr>
+            <w:r>
+              <w:rPr>
+                <w:b/>
+                <w:sz w:val="20"/>
+                <w:szCs w:val="20"/>
+              </w:rPr>
+              <w:t>FASE 7: INCUMPLIMIENTOS Y SANCIONES</w:t>
+            </w:r>
+          </w:p>
+        </w:tc>
+        <w:tc>
+          <w:tcPr>
+            <w:tcW w:w="1900" w:type="dxa"/>
+            <w:tcBorders>
+              <w:top w:val="single" w:sz="4" w:space="0" w:color="000000"/>
+              <w:left w:val="single" w:sz="4" w:space="0" w:color="000000"/>
+              <w:bottom w:val="single" w:sz="4" w:space="0" w:color="000000"/>
+              <w:right w:val="single" w:sz="4" w:space="0" w:color="000000"/>
+            </w:tcBorders>
+            <w:shd w:val="clear" w:color="auto" w:fill="D9D9D9"/>
+            <w:tcMar>
+              <w:top w:w="70" w:type="dxa"/>
+              <w:left w:w="100" w:type="dxa"/>
+              <w:bottom w:w="70" w:type="dxa"/>
+              <w:right w:w="100" w:type="dxa"/>
+            </w:tcMar>
+            <w:vAlign w:val="center"/>
+          </w:tcPr>
+          <w:p>
+            <w:pPr/>
+          </w:p>
+        </w:tc>
+        <w:tc>
+          <w:tcPr>
+            <w:tcW w:w="1300" w:type="dxa"/>
+            <w:tcBorders>
+              <w:top w:val="single" w:sz="4" w:space="0" w:color="000000"/>
+              <w:left w:val="single" w:sz="4" w:space="0" w:color="000000"/>
+              <w:bottom w:val="single" w:sz="4" w:space="0" w:color="000000"/>
+              <w:right w:val="single" w:sz="4" w:space="0" w:color="000000"/>
+            </w:tcBorders>
+            <w:shd w:val="clear" w:color="auto" w:fill="D9D9D9"/>
+            <w:tcMar>
+              <w:top w:w="70" w:type="dxa"/>
+              <w:left w:w="100" w:type="dxa"/>
+              <w:bottom w:w="70" w:type="dxa"/>
+              <w:right w:w="100" w:type="dxa"/>
+            </w:tcMar>
+            <w:vAlign w:val="center"/>
+          </w:tcPr>
+          <w:p>
+            <w:pPr/>
+          </w:p>
+        </w:tc>
+      </w:tr>
+      <w:tr>
+        <w:trPr>
+          <w:tblHeader/>
+        </w:trPr>
+        <w:tc>
+          <w:tcPr>
+            <w:tcW w:w="550" w:type="dxa"/>
+            <w:tcBorders>
+              <w:top w:val="single" w:sz="4" w:space="0" w:color="000000"/>
+              <w:left w:val="single" w:sz="4" w:space="0" w:color="000000"/>
+              <w:bottom w:val="single" w:sz="4" w:space="0" w:color="000000"/>
+              <w:right w:val="single" w:sz="4" w:space="0" w:color="000000"/>
+            </w:tcBorders>
+            <w:shd w:val="clear" w:color="auto" w:fill="D9D9D9"/>
+            <w:tcMar>
+              <w:top w:w="70" w:type="dxa"/>
+              <w:left w:w="100" w:type="dxa"/>
+              <w:bottom w:w="70" w:type="dxa"/>
+              <w:right w:w="100" w:type="dxa"/>
+            </w:tcMar>
+            <w:vAlign w:val="center"/>
+          </w:tcPr>
+          <w:p>
+            <w:pPr>
+              <w:jc w:val="center"/>
+            </w:pPr>
+            <w:r>
+              <w:rPr>
+                <w:b/>
+                <w:sz w:val="20"/>
+                <w:szCs w:val="20"/>
+              </w:rPr>
+              <w:t>7.1</w:t>
+            </w:r>
+          </w:p>
+        </w:tc>
+        <w:tc>
+          <w:tcPr>
+            <w:tcW w:w="5888" w:type="dxa"/>
+            <w:tcBorders>
+              <w:top w:val="single" w:sz="4" w:space="0" w:color="000000"/>
+              <w:left w:val="single" w:sz="4" w:space="0" w:color="000000"/>
+              <w:bottom w:val="single" w:sz="4" w:space="0" w:color="000000"/>
+              <w:right w:val="single" w:sz="4" w:space="0" w:color="000000"/>
+            </w:tcBorders>
+            <w:shd w:val="clear" w:color="auto" w:fill="D9D9D9"/>
+            <w:tcMar>
+              <w:top w:w="70" w:type="dxa"/>
+              <w:left w:w="100" w:type="dxa"/>
+              <w:bottom w:w="70" w:type="dxa"/>
+              <w:right w:w="100" w:type="dxa"/>
+            </w:tcMar>
+            <w:vAlign w:val="center"/>
+          </w:tcPr>
+          <w:p>
+            <w:pPr/>
+            <w:r>
+              <w:rPr>
+                <w:sz w:val="20"/>
+                <w:szCs w:val="20"/>
+              </w:rPr>
+              <w:t>Primer incumplimiento (falta leve): advertencia verbal al trabajador y a su supervisor. Corrección inmediata del incumplimiento antes de continuar con la actividad. Registro del evento por parte de E&amp;S.</w:t>
+            </w:r>
+          </w:p>
+        </w:tc>
+        <w:tc>
+          <w:tcPr>
+            <w:tcW w:w="1900" w:type="dxa"/>
+            <w:tcBorders>
+              <w:top w:val="single" w:sz="4" w:space="0" w:color="000000"/>
+              <w:left w:val="single" w:sz="4" w:space="0" w:color="000000"/>
+              <w:bottom w:val="single" w:sz="4" w:space="0" w:color="000000"/>
+              <w:right w:val="single" w:sz="4" w:space="0" w:color="000000"/>
+            </w:tcBorders>
+            <w:shd w:val="clear" w:color="auto" w:fill="D9D9D9"/>
+            <w:tcMar>
+              <w:top w:w="70" w:type="dxa"/>
+              <w:left w:w="100" w:type="dxa"/>
+              <w:bottom w:w="70" w:type="dxa"/>
+              <w:right w:w="100" w:type="dxa"/>
+            </w:tcMar>
+            <w:vAlign w:val="center"/>
+          </w:tcPr>
+          <w:p>
+            <w:pPr>
+              <w:jc w:val="center"/>
+            </w:pPr>
+            <w:r>
+              <w:rPr>
+                <w:sz w:val="20"/>
+                <w:szCs w:val="20"/>
+              </w:rPr>
+              <w:t>Equipo de E&amp;S</w:t>
+            </w:r>
+          </w:p>
+        </w:tc>
+        <w:tc>
+          <w:tcPr>
+            <w:tcW w:w="1300" w:type="dxa"/>
+            <w:tcBorders>
+              <w:top w:val="single" w:sz="4" w:space="0" w:color="000000"/>
+              <w:left w:val="single" w:sz="4" w:space="0" w:color="000000"/>
+              <w:bottom w:val="single" w:sz="4" w:space="0" w:color="000000"/>
+              <w:right w:val="single" w:sz="4" w:space="0" w:color="000000"/>
+            </w:tcBorders>
+            <w:shd w:val="clear" w:color="auto" w:fill="D9D9D9"/>
+            <w:tcMar>
+              <w:top w:w="70" w:type="dxa"/>
+              <w:left w:w="100" w:type="dxa"/>
+              <w:bottom w:w="70" w:type="dxa"/>
+              <w:right w:w="100" w:type="dxa"/>
+            </w:tcMar>
+            <w:vAlign w:val="center"/>
+          </w:tcPr>
+          <w:p>
+            <w:pPr>
+              <w:jc w:val="center"/>
+            </w:pPr>
+            <w:r>
+              <w:rPr>
+                <w:sz w:val="20"/>
+                <w:szCs w:val="20"/>
+              </w:rPr>
+              <w:t>Supervisor de Área</w:t>
+            </w:r>
+          </w:p>
+        </w:tc>
+      </w:tr>
+      <w:tr>
+        <w:trPr>
+          <w:tblHeader/>
+        </w:trPr>
+        <w:tc>
+          <w:tcPr>
+            <w:tcW w:w="550" w:type="dxa"/>
+            <w:tcBorders>
+              <w:top w:val="single" w:sz="4" w:space="0" w:color="000000"/>
+              <w:left w:val="single" w:sz="4" w:space="0" w:color="000000"/>
+              <w:bottom w:val="single" w:sz="4" w:space="0" w:color="000000"/>
+              <w:right w:val="single" w:sz="4" w:space="0" w:color="000000"/>
+            </w:tcBorders>
+            <w:shd w:val="clear" w:color="auto" w:fill="D9D9D9"/>
+            <w:tcMar>
+              <w:top w:w="70" w:type="dxa"/>
+              <w:left w:w="100" w:type="dxa"/>
+              <w:bottom w:w="70" w:type="dxa"/>
+              <w:right w:w="100" w:type="dxa"/>
+            </w:tcMar>
+            <w:vAlign w:val="center"/>
+          </w:tcPr>
+          <w:p>
+            <w:pPr>
+              <w:jc w:val="center"/>
+            </w:pPr>
+            <w:r>
+              <w:rPr>
+                <w:b/>
+                <w:sz w:val="20"/>
+                <w:szCs w:val="20"/>
+              </w:rPr>
+              <w:t>7.2</w:t>
+            </w:r>
+          </w:p>
+        </w:tc>
+        <w:tc>
+          <w:tcPr>
+            <w:tcW w:w="5888" w:type="dxa"/>
+            <w:tcBorders>
+              <w:top w:val="single" w:sz="4" w:space="0" w:color="000000"/>
+              <w:left w:val="single" w:sz="4" w:space="0" w:color="000000"/>
+              <w:bottom w:val="single" w:sz="4" w:space="0" w:color="000000"/>
+              <w:right w:val="single" w:sz="4" w:space="0" w:color="000000"/>
+            </w:tcBorders>
+            <w:shd w:val="clear" w:color="auto" w:fill="D9D9D9"/>
+            <w:tcMar>
+              <w:top w:w="70" w:type="dxa"/>
+              <w:left w:w="100" w:type="dxa"/>
+              <w:bottom w:w="70" w:type="dxa"/>
+              <w:right w:w="100" w:type="dxa"/>
+            </w:tcMar>
+            <w:vAlign w:val="center"/>
+          </w:tcPr>
+          <w:p>
+            <w:pPr/>
+            <w:r>
+              <w:rPr>
+                <w:sz w:val="20"/>
+                <w:szCs w:val="20"/>
+              </w:rPr>
+              <w:t>Segundo incumplimiento o incumplimiento moderado: paralización del trabajo hasta subsanar la condición + notificación formal escrita al representante legal o gerente de la empresa contratista.</w:t>
+            </w:r>
+          </w:p>
+        </w:tc>
+        <w:tc>
+          <w:tcPr>
+            <w:tcW w:w="1900" w:type="dxa"/>
+            <w:tcBorders>
+              <w:top w:val="single" w:sz="4" w:space="0" w:color="000000"/>
+              <w:left w:val="single" w:sz="4" w:space="0" w:color="000000"/>
+              <w:bottom w:val="single" w:sz="4" w:space="0" w:color="000000"/>
+              <w:right w:val="single" w:sz="4" w:space="0" w:color="000000"/>
+            </w:tcBorders>
+            <w:shd w:val="clear" w:color="auto" w:fill="D9D9D9"/>
+            <w:tcMar>
+              <w:top w:w="70" w:type="dxa"/>
+              <w:left w:w="100" w:type="dxa"/>
+              <w:bottom w:w="70" w:type="dxa"/>
+              <w:right w:w="100" w:type="dxa"/>
+            </w:tcMar>
+            <w:vAlign w:val="center"/>
+          </w:tcPr>
+          <w:p>
+            <w:pPr>
+              <w:jc w:val="center"/>
+            </w:pPr>
+            <w:r>
+              <w:rPr>
+                <w:sz w:val="20"/>
+                <w:szCs w:val="20"/>
+              </w:rPr>
+              <w:t>Equipo de E&amp;S</w:t>
+            </w:r>
+          </w:p>
+        </w:tc>
+        <w:tc>
+          <w:tcPr>
+            <w:tcW w:w="1300" w:type="dxa"/>
+            <w:tcBorders>
+              <w:top w:val="single" w:sz="4" w:space="0" w:color="000000"/>
+              <w:left w:val="single" w:sz="4" w:space="0" w:color="000000"/>
+              <w:bottom w:val="single" w:sz="4" w:space="0" w:color="000000"/>
+              <w:right w:val="single" w:sz="4" w:space="0" w:color="000000"/>
+            </w:tcBorders>
+            <w:shd w:val="clear" w:color="auto" w:fill="D9D9D9"/>
+            <w:tcMar>
+              <w:top w:w="70" w:type="dxa"/>
+              <w:left w:w="100" w:type="dxa"/>
+              <w:bottom w:w="70" w:type="dxa"/>
+              <w:right w:w="100" w:type="dxa"/>
+            </w:tcMar>
+            <w:vAlign w:val="center"/>
+          </w:tcPr>
+          <w:p>
+            <w:pPr>
+              <w:jc w:val="center"/>
+            </w:pPr>
+            <w:r>
+              <w:rPr>
+                <w:sz w:val="20"/>
+                <w:szCs w:val="20"/>
+              </w:rPr>
+              <w:t>Gerencia de Planta</w:t>
+            </w:r>
+          </w:p>
+        </w:tc>
+      </w:tr>
+      <w:tr>
+        <w:trPr>
+          <w:tblHeader/>
+        </w:trPr>
+        <w:tc>
+          <w:tcPr>
+            <w:tcW w:w="550" w:type="dxa"/>
+            <w:tcBorders>
+              <w:top w:val="single" w:sz="4" w:space="0" w:color="000000"/>
+              <w:left w:val="single" w:sz="4" w:space="0" w:color="000000"/>
+              <w:bottom w:val="single" w:sz="4" w:space="0" w:color="000000"/>
+              <w:right w:val="single" w:sz="4" w:space="0" w:color="000000"/>
+            </w:tcBorders>
+            <w:shd w:val="clear" w:color="auto" w:fill="D9D9D9"/>
+            <w:tcMar>
+              <w:top w:w="70" w:type="dxa"/>
+              <w:left w:w="100" w:type="dxa"/>
+              <w:bottom w:w="70" w:type="dxa"/>
+              <w:right w:w="100" w:type="dxa"/>
+            </w:tcMar>
+            <w:vAlign w:val="center"/>
+          </w:tcPr>
+          <w:p>
+            <w:pPr>
+              <w:jc w:val="center"/>
+            </w:pPr>
+            <w:r>
+              <w:rPr>
+                <w:b/>
+                <w:sz w:val="20"/>
+                <w:szCs w:val="20"/>
+              </w:rPr>
+              <w:t>7.3</w:t>
+            </w:r>
+          </w:p>
+        </w:tc>
+        <w:tc>
+          <w:tcPr>
+            <w:tcW w:w="5888" w:type="dxa"/>
+            <w:tcBorders>
+              <w:top w:val="single" w:sz="4" w:space="0" w:color="000000"/>
+              <w:left w:val="single" w:sz="4" w:space="0" w:color="000000"/>
+              <w:bottom w:val="single" w:sz="4" w:space="0" w:color="000000"/>
+              <w:right w:val="single" w:sz="4" w:space="0" w:color="000000"/>
+            </w:tcBorders>
+            <w:shd w:val="clear" w:color="auto" w:fill="D9D9D9"/>
+            <w:tcMar>
+              <w:top w:w="70" w:type="dxa"/>
+              <w:left w:w="100" w:type="dxa"/>
+              <w:bottom w:w="70" w:type="dxa"/>
+              <w:right w:w="100" w:type="dxa"/>
+            </w:tcMar>
+            <w:vAlign w:val="center"/>
+          </w:tcPr>
+          <w:p>
+            <w:pPr/>
+            <w:r>
+              <w:rPr>
+                <w:sz w:val="20"/>
+                <w:szCs w:val="20"/>
+              </w:rPr>
+              <w:t>Tercer incumplimiento, incumplimiento grave o reincidente: suspensión de todas las actividades de la empresa contratista en planta + reporte a Gerencia General + evaluación de continuidad del contrato.</w:t>
+            </w:r>
+          </w:p>
+        </w:tc>
+        <w:tc>
+          <w:tcPr>
+            <w:tcW w:w="1900" w:type="dxa"/>
+            <w:tcBorders>
+              <w:top w:val="single" w:sz="4" w:space="0" w:color="000000"/>
+              <w:left w:val="single" w:sz="4" w:space="0" w:color="000000"/>
+              <w:bottom w:val="single" w:sz="4" w:space="0" w:color="000000"/>
+              <w:right w:val="single" w:sz="4" w:space="0" w:color="000000"/>
+            </w:tcBorders>
+            <w:shd w:val="clear" w:color="auto" w:fill="D9D9D9"/>
+            <w:tcMar>
+              <w:top w:w="70" w:type="dxa"/>
+              <w:left w:w="100" w:type="dxa"/>
+              <w:bottom w:w="70" w:type="dxa"/>
+              <w:right w:w="100" w:type="dxa"/>
+            </w:tcMar>
+            <w:vAlign w:val="center"/>
+          </w:tcPr>
+          <w:p>
+            <w:pPr>
+              <w:jc w:val="center"/>
+            </w:pPr>
+            <w:r>
+              <w:rPr>
+                <w:sz w:val="20"/>
+                <w:szCs w:val="20"/>
+              </w:rPr>
+              <w:t>Gerencia de Planta</w:t>
+            </w:r>
+          </w:p>
+        </w:tc>
+        <w:tc>
+          <w:tcPr>
+            <w:tcW w:w="1300" w:type="dxa"/>
+            <w:tcBorders>
+              <w:top w:val="single" w:sz="4" w:space="0" w:color="000000"/>
+              <w:left w:val="single" w:sz="4" w:space="0" w:color="000000"/>
+              <w:bottom w:val="single" w:sz="4" w:space="0" w:color="000000"/>
+              <w:right w:val="single" w:sz="4" w:space="0" w:color="000000"/>
+            </w:tcBorders>
+            <w:shd w:val="clear" w:color="auto" w:fill="D9D9D9"/>
+            <w:tcMar>
+              <w:top w:w="70" w:type="dxa"/>
+              <w:left w:w="100" w:type="dxa"/>
+              <w:bottom w:w="70" w:type="dxa"/>
+              <w:right w:w="100" w:type="dxa"/>
+            </w:tcMar>
+            <w:vAlign w:val="center"/>
+          </w:tcPr>
+          <w:p>
+            <w:pPr>
+              <w:jc w:val="center"/>
+            </w:pPr>
+            <w:r>
+              <w:rPr>
+                <w:sz w:val="20"/>
+                <w:szCs w:val="20"/>
+              </w:rPr>
+              <w:t>Gerencia General</w:t>
+            </w:r>
+          </w:p>
+        </w:tc>
+      </w:tr>
+      <w:tr>
+        <w:trPr>
+          <w:tblHeader/>
+        </w:trPr>
+        <w:tc>
+          <w:tcPr>
+            <w:tcW w:w="550" w:type="dxa"/>
+            <w:tcBorders>
+              <w:top w:val="single" w:sz="4" w:space="0" w:color="000000"/>
+              <w:left w:val="single" w:sz="4" w:space="0" w:color="000000"/>
+              <w:bottom w:val="single" w:sz="4" w:space="0" w:color="000000"/>
+              <w:right w:val="single" w:sz="4" w:space="0" w:color="000000"/>
+            </w:tcBorders>
+            <w:shd w:val="clear" w:color="auto" w:fill="D9D9D9"/>
+            <w:tcMar>
+              <w:top w:w="70" w:type="dxa"/>
+              <w:left w:w="100" w:type="dxa"/>
+              <w:bottom w:w="70" w:type="dxa"/>
+              <w:right w:w="100" w:type="dxa"/>
+            </w:tcMar>
+            <w:vAlign w:val="center"/>
+          </w:tcPr>
+          <w:p>
+            <w:pPr>
+              <w:jc w:val="center"/>
+            </w:pPr>
+            <w:r>
+              <w:rPr>
+                <w:b/>
+                <w:sz w:val="20"/>
+                <w:szCs w:val="20"/>
+              </w:rPr>
+              <w:t>7.4</w:t>
             </w:r>
           </w:p>
         </w:tc>

</xml_diff>

<commit_message>
refactor(estandar-sitio): reescritura completa siguiendo flujo real Plantabal
- Flujo: ingreso R34 → dispensario (TAR, tiempo límite 20 min) → ART en sitio
  → PT por tipo TAR → señalización/dispositivos → ejecución → cierre → residuos
- Trabajo de Alto Riesgo reemplaza Permiso Especial; 6 tipos TAR definidos
- Agrega: procedimientos de trabajo, dispositivos de seguridad, uso extintores PASS
- Definiciones compactas y pegadas en pág 1 (sin salto de página)
- 8 fases, 30 actividades

Co-Authored-By: Claude Sonnet 4.6 <noreply@anthropic.com>
Claude-Session: https://claude.ai/code/session_01Mu84mNMmRhshwom6voaTeY
</commit_message>
<xml_diff>
--- a/GE-SO-I002_Estandar_Requerimientos_Sitio_Contratistas_v01.docx
+++ b/GE-SO-I002_Estandar_Requerimientos_Sitio_Contratistas_v01.docx
@@ -73,13 +73,15 @@
             </w:tcMar>
           </w:tcPr>
           <w:p>
-            <w:pPr/>
-            <w:r>
-              <w:rPr>
-                <w:sz w:val="20"/>
-                <w:szCs w:val="20"/>
-              </w:rPr>
-              <w:t>Establecer los estándares mínimos de seguridad que deben cumplir los contratistas y su personal durante la ejecución de actividades dentro de las instalaciones de Plantabal S.A. / 3A Core Materials, en materia de Equipos de Protección Personal (EPP), herramientas, equipos y condiciones generales de seguridad en sitio, previniendo accidentes, enfermedades ocupacionales y daños a terceros o a las instalaciones.</w:t>
+            <w:pPr>
+              <w:spacing w:before="0" w:after="40"/>
+            </w:pPr>
+            <w:r>
+              <w:rPr>
+                <w:sz w:val="20"/>
+                <w:szCs w:val="20"/>
+              </w:rPr>
+              <w:t>Establecer los requerimientos mínimos de seguridad que debe cumplir el personal contratista durante el ingreso y la ejecución de actividades dentro de las instalaciones de Plantabal S.A. / 3A Core Materials, abarcando: equipos de protección personal (EPP), herramientas y equipos, procedimientos y dispositivos de seguridad, trabajos de alto riesgo, disposición de residuos y condiciones generales en sitio.</w:t>
             </w:r>
           </w:p>
         </w:tc>
@@ -135,7 +137,7 @@
           </w:tcPr>
           <w:p>
             <w:pPr>
-              <w:spacing w:after="60"/>
+              <w:spacing w:before="0" w:after="40"/>
             </w:pPr>
             <w:r>
               <w:rPr>
@@ -148,36 +150,38 @@
           </w:p>
           <w:p>
             <w:pPr>
-              <w:spacing w:after="60"/>
-            </w:pPr>
-            <w:r>
-              <w:rPr>
-                <w:sz w:val="20"/>
-                <w:szCs w:val="20"/>
-              </w:rPr>
-              <w:t>Actividad Inicial: Arribo del contratista al sitio de trabajo para iniciar labores.</w:t>
-            </w:r>
-          </w:p>
-          <w:p>
-            <w:pPr>
-              <w:spacing w:after="60"/>
-            </w:pPr>
-            <w:r>
-              <w:rPr>
-                <w:sz w:val="20"/>
-                <w:szCs w:val="20"/>
-              </w:rPr>
-              <w:t>Actividad Final: Verificación del cumplimiento de todos los estándares y autorización para el inicio de actividades.</w:t>
-            </w:r>
-          </w:p>
-          <w:p>
-            <w:pPr/>
-            <w:r>
-              <w:rPr>
-                <w:sz w:val="20"/>
-                <w:szCs w:val="20"/>
-              </w:rPr>
-              <w:t>Aplica a: Todas las empresas contratistas y sus trabajadores que ejecuten actividades dentro de las instalaciones de Plantabal S.A., independientemente del tipo de trabajo o duración del contrato.</w:t>
+              <w:spacing w:before="0" w:after="40"/>
+            </w:pPr>
+            <w:r>
+              <w:rPr>
+                <w:sz w:val="20"/>
+                <w:szCs w:val="20"/>
+              </w:rPr>
+              <w:t>Actividad Inicial: Ingreso del personal contratista a las instalaciones de Plantabal (verificación GE-SO-R34).</w:t>
+            </w:r>
+          </w:p>
+          <w:p>
+            <w:pPr>
+              <w:spacing w:before="0" w:after="40"/>
+            </w:pPr>
+            <w:r>
+              <w:rPr>
+                <w:sz w:val="20"/>
+                <w:szCs w:val="20"/>
+              </w:rPr>
+              <w:t>Actividad Final: Cierre del permiso de trabajo, retiro de señalización, limpieza del área y salida del personal contratista.</w:t>
+            </w:r>
+          </w:p>
+          <w:p>
+            <w:pPr>
+              <w:spacing w:before="0" w:after="40"/>
+            </w:pPr>
+            <w:r>
+              <w:rPr>
+                <w:sz w:val="20"/>
+                <w:szCs w:val="20"/>
+              </w:rPr>
+              <w:t>Aplica a: Toda empresa contratista y su personal que ejecute actividades dentro de las instalaciones, independientemente del tipo o duración del trabajo.</w:t>
             </w:r>
           </w:p>
         </w:tc>
@@ -185,7 +189,7 @@
     </w:tbl>
     <w:p>
       <w:pPr>
-        <w:spacing w:before="120"/>
+        <w:spacing w:before="0" w:after="0"/>
       </w:pPr>
     </w:p>
     <w:p>
@@ -197,7 +201,7 @@
           <w:right w:val="single" w:sz="4" w:space="0" w:color="000000"/>
         </w:pBdr>
         <w:shd w:val="clear" w:color="auto" w:fill="D9D9D9"/>
-        <w:spacing w:before="160" w:after="80"/>
+        <w:spacing w:before="60" w:after="40"/>
       </w:pPr>
       <w:r>
         <w:rPr>
@@ -320,7 +324,9 @@
             <w:vAlign w:val="center"/>
           </w:tcPr>
           <w:p>
-            <w:pPr/>
+            <w:pPr>
+              <w:spacing w:before="0" w:after="40"/>
+            </w:pPr>
             <w:r>
               <w:rPr>
                 <w:b/>
@@ -350,13 +356,15 @@
             <w:vAlign w:val="center"/>
           </w:tcPr>
           <w:p>
-            <w:pPr/>
-            <w:r>
-              <w:rPr>
-                <w:sz w:val="20"/>
-                <w:szCs w:val="20"/>
-              </w:rPr>
-              <w:t>Dispositivos, accesorios o indumentaria utilizados por el trabajador para protegerlo de riesgos presentes en el ambiente laboral que no pueden eliminarse o controlarse adecuadamente por otros medios.</w:t>
+            <w:pPr>
+              <w:spacing w:before="0" w:after="40"/>
+            </w:pPr>
+            <w:r>
+              <w:rPr>
+                <w:sz w:val="20"/>
+                <w:szCs w:val="20"/>
+              </w:rPr>
+              <w:t>Dispositivos e indumentaria que protegen al trabajador de riesgos del ambiente laboral. De uso obligatorio en todo momento dentro de las instalaciones.</w:t>
             </w:r>
           </w:p>
         </w:tc>
@@ -384,7 +392,9 @@
             <w:vAlign w:val="center"/>
           </w:tcPr>
           <w:p>
-            <w:pPr/>
+            <w:pPr>
+              <w:spacing w:before="0" w:after="40"/>
+            </w:pPr>
             <w:r>
               <w:rPr>
                 <w:b/>
@@ -414,13 +424,15 @@
             <w:vAlign w:val="center"/>
           </w:tcPr>
           <w:p>
-            <w:pPr/>
-            <w:r>
-              <w:rPr>
-                <w:sz w:val="20"/>
-                <w:szCs w:val="20"/>
-              </w:rPr>
-              <w:t>Empresa o persona natural que presta servicios a Plantabal S.A. bajo contrato, con personal que opera dentro de sus instalaciones.</w:t>
+            <w:pPr>
+              <w:spacing w:before="0" w:after="40"/>
+            </w:pPr>
+            <w:r>
+              <w:rPr>
+                <w:sz w:val="20"/>
+                <w:szCs w:val="20"/>
+              </w:rPr>
+              <w:t>Empresa o persona natural que presta servicios a Plantabal bajo contrato, con personal que opera dentro de sus instalaciones.</w:t>
             </w:r>
           </w:p>
         </w:tc>
@@ -448,14 +460,16 @@
             <w:vAlign w:val="center"/>
           </w:tcPr>
           <w:p>
-            <w:pPr/>
+            <w:pPr>
+              <w:spacing w:before="0" w:after="40"/>
+            </w:pPr>
             <w:r>
               <w:rPr>
                 <w:b/>
                 <w:sz w:val="20"/>
                 <w:szCs w:val="20"/>
               </w:rPr>
-              <w:t>Permiso de Trabajo</w:t>
+              <w:t>Área Solicitante</w:t>
             </w:r>
           </w:p>
         </w:tc>
@@ -478,13 +492,15 @@
             <w:vAlign w:val="center"/>
           </w:tcPr>
           <w:p>
-            <w:pPr/>
-            <w:r>
-              <w:rPr>
-                <w:sz w:val="20"/>
-                <w:szCs w:val="20"/>
-              </w:rPr>
-              <w:t>Documento formal que autoriza la ejecución de actividades de alto riesgo (altura, espacios confinados, trabajos en caliente, LOTO, excavaciones), válido únicamente para la fecha, lugar y actividad indicados.</w:t>
+            <w:pPr>
+              <w:spacing w:before="0" w:after="40"/>
+            </w:pPr>
+            <w:r>
+              <w:rPr>
+                <w:sz w:val="20"/>
+                <w:szCs w:val="20"/>
+              </w:rPr>
+              <w:t>Jefatura o supervisor de Plantabal que requiere y autoriza el trabajo contratado. Define el alcance, facilita condiciones de acceso y supervisa la ejecución.</w:t>
             </w:r>
           </w:p>
         </w:tc>
@@ -512,14 +528,16 @@
             <w:vAlign w:val="center"/>
           </w:tcPr>
           <w:p>
-            <w:pPr/>
+            <w:pPr>
+              <w:spacing w:before="0" w:after="40"/>
+            </w:pPr>
             <w:r>
               <w:rPr>
                 <w:b/>
                 <w:sz w:val="20"/>
                 <w:szCs w:val="20"/>
               </w:rPr>
-              <w:t>IPERC</w:t>
+              <w:t>GE-SO-R34</w:t>
             </w:r>
           </w:p>
         </w:tc>
@@ -542,13 +560,15 @@
             <w:vAlign w:val="center"/>
           </w:tcPr>
           <w:p>
-            <w:pPr/>
-            <w:r>
-              <w:rPr>
-                <w:sz w:val="20"/>
-                <w:szCs w:val="20"/>
-              </w:rPr>
-              <w:t>Identificación de Peligros, Evaluación de Riesgos y Controles. Análisis previo obligatorio a toda actividad que identifica los riesgos y las medidas de control a implementar.</w:t>
+            <w:pPr>
+              <w:spacing w:before="0" w:after="40"/>
+            </w:pPr>
+            <w:r>
+              <w:rPr>
+                <w:sz w:val="20"/>
+                <w:szCs w:val="20"/>
+              </w:rPr>
+              <w:t>Formulario de Autorización de Ingreso de Contratistas. Documento obligatorio que acredita que el personal contratista cumple con la inducción, habilitaciones y requisitos administrativos para ingresar a planta.</w:t>
             </w:r>
           </w:p>
         </w:tc>
@@ -576,14 +596,16 @@
             <w:vAlign w:val="center"/>
           </w:tcPr>
           <w:p>
-            <w:pPr/>
+            <w:pPr>
+              <w:spacing w:before="0" w:after="40"/>
+            </w:pPr>
             <w:r>
               <w:rPr>
                 <w:b/>
                 <w:sz w:val="20"/>
                 <w:szCs w:val="20"/>
               </w:rPr>
-              <w:t>Área de Trabajo</w:t>
+              <w:t>ART (Análisis de Riesgo en el Trabajo)</w:t>
             </w:r>
           </w:p>
         </w:tc>
@@ -606,13 +628,15 @@
             <w:vAlign w:val="center"/>
           </w:tcPr>
           <w:p>
-            <w:pPr/>
-            <w:r>
-              <w:rPr>
-                <w:sz w:val="20"/>
-                <w:szCs w:val="20"/>
-              </w:rPr>
-              <w:t>Zona delimitada dentro de las instalaciones donde el contratista ejecuta sus actividades. Debe estar señalizada y delimitada antes de iniciar.</w:t>
+            <w:pPr>
+              <w:spacing w:before="0" w:after="40"/>
+            </w:pPr>
+            <w:r>
+              <w:rPr>
+                <w:sz w:val="20"/>
+                <w:szCs w:val="20"/>
+              </w:rPr>
+              <w:t>Análisis participativo realizado por el equipo de trabajo inmediatamente antes de iniciar la tarea. Desglosa la actividad paso a paso, identifica peligros por paso y define medidas de control específicas. Firmado por todos los participantes.</w:t>
             </w:r>
           </w:p>
         </w:tc>
@@ -640,14 +664,16 @@
             <w:vAlign w:val="center"/>
           </w:tcPr>
           <w:p>
-            <w:pPr/>
+            <w:pPr>
+              <w:spacing w:before="0" w:after="40"/>
+            </w:pPr>
             <w:r>
               <w:rPr>
                 <w:b/>
                 <w:sz w:val="20"/>
                 <w:szCs w:val="20"/>
               </w:rPr>
-              <w:t>Señalización de Seguridad</w:t>
+              <w:t>Permiso de Trabajo</w:t>
             </w:r>
           </w:p>
         </w:tc>
@@ -670,13 +696,15 @@
             <w:vAlign w:val="center"/>
           </w:tcPr>
           <w:p>
-            <w:pPr/>
-            <w:r>
-              <w:rPr>
-                <w:sz w:val="20"/>
-                <w:szCs w:val="20"/>
-              </w:rPr>
-              <w:t>Señales, conos, cintas de peligro u otros dispositivos visuales que advierten sobre zonas de riesgo, condiciones peligrosas o instrucciones de seguridad obligatorias.</w:t>
+            <w:pPr>
+              <w:spacing w:before="0" w:after="40"/>
+            </w:pPr>
+            <w:r>
+              <w:rPr>
+                <w:sz w:val="20"/>
+                <w:szCs w:val="20"/>
+              </w:rPr>
+              <w:t>Documento formal que autoriza la ejecución de una actividad específica. Se distingue entre Permiso General (actividades de bajo a mediano riesgo) y Permiso para Trabajo de Alto Riesgo (requiere valoración médica previa en dispensario).</w:t>
             </w:r>
           </w:p>
         </w:tc>
@@ -704,14 +732,16 @@
             <w:vAlign w:val="center"/>
           </w:tcPr>
           <w:p>
-            <w:pPr/>
+            <w:pPr>
+              <w:spacing w:before="0" w:after="40"/>
+            </w:pPr>
             <w:r>
               <w:rPr>
                 <w:b/>
                 <w:sz w:val="20"/>
                 <w:szCs w:val="20"/>
               </w:rPr>
-              <w:t>Trabajo en Altura</w:t>
+              <w:t>Trabajo de Alto Riesgo (TAR)</w:t>
             </w:r>
           </w:p>
         </w:tc>
@@ -734,13 +764,15 @@
             <w:vAlign w:val="center"/>
           </w:tcPr>
           <w:p>
-            <w:pPr/>
-            <w:r>
-              <w:rPr>
-                <w:sz w:val="20"/>
-                <w:szCs w:val="20"/>
-              </w:rPr>
-              <w:t>Toda actividad que se realiza a 1,8 metros o más sobre el nivel del piso o sobre una superficie desde la que una caída puede generar lesión.</w:t>
+            <w:pPr>
+              <w:spacing w:before="0" w:after="40"/>
+            </w:pPr>
+            <w:r>
+              <w:rPr>
+                <w:sz w:val="20"/>
+                <w:szCs w:val="20"/>
+              </w:rPr>
+              <w:t>Actividad con potencial de causar lesión grave o fatal. En Plantabal se clasifican como TAR: trabajo en caliente, trabajo eléctrico/LOTO, trabajo en altura (≥1,8 m), trabajo en espacio confinado, excavaciones e izaje de cargas críticas.</w:t>
             </w:r>
           </w:p>
         </w:tc>
@@ -768,14 +800,16 @@
             <w:vAlign w:val="center"/>
           </w:tcPr>
           <w:p>
-            <w:pPr/>
+            <w:pPr>
+              <w:spacing w:before="0" w:after="40"/>
+            </w:pPr>
             <w:r>
               <w:rPr>
                 <w:b/>
                 <w:sz w:val="20"/>
                 <w:szCs w:val="20"/>
               </w:rPr>
-              <w:t>Trabajo en Caliente</w:t>
+              <w:t>Dispensario Médico</w:t>
             </w:r>
           </w:p>
         </w:tc>
@@ -798,13 +832,15 @@
             <w:vAlign w:val="center"/>
           </w:tcPr>
           <w:p>
-            <w:pPr/>
-            <w:r>
-              <w:rPr>
-                <w:sz w:val="20"/>
-                <w:szCs w:val="20"/>
-              </w:rPr>
-              <w:t>Actividad que genera llamas, chispas o calor suficiente para ignitar materiales inflamables: soldadura, corte oxiacetilénico, esmerilado, entre otros.</w:t>
+            <w:pPr>
+              <w:spacing w:before="0" w:after="40"/>
+            </w:pPr>
+            <w:r>
+              <w:rPr>
+                <w:sz w:val="20"/>
+                <w:szCs w:val="20"/>
+              </w:rPr>
+              <w:t>Punto de valoración médica de Plantabal donde la enfermera realiza la evaluación previa al inicio de un Trabajo de Alto Riesgo: toma de signos vitales, verificación del estado de salud del trabajador y firma del permiso correspondiente.</w:t>
             </w:r>
           </w:p>
         </w:tc>
@@ -832,14 +868,16 @@
             <w:vAlign w:val="center"/>
           </w:tcPr>
           <w:p>
-            <w:pPr/>
+            <w:pPr>
+              <w:spacing w:before="0" w:after="40"/>
+            </w:pPr>
             <w:r>
               <w:rPr>
                 <w:b/>
                 <w:sz w:val="20"/>
                 <w:szCs w:val="20"/>
               </w:rPr>
-              <w:t>Espacio Confinado</w:t>
+              <w:t>Dispositivo de Seguridad</w:t>
             </w:r>
           </w:p>
         </w:tc>
@@ -862,13 +900,15 @@
             <w:vAlign w:val="center"/>
           </w:tcPr>
           <w:p>
-            <w:pPr/>
-            <w:r>
-              <w:rPr>
-                <w:sz w:val="20"/>
-                <w:szCs w:val="20"/>
-              </w:rPr>
-              <w:t>Recinto con aberturas limitadas de entrada y salida, ventilación natural insuficiente y no diseñado para ocupación continua: tanques, silos, pozos, cámaras subterráneas.</w:t>
+            <w:pPr>
+              <w:spacing w:before="0" w:after="40"/>
+            </w:pPr>
+            <w:r>
+              <w:rPr>
+                <w:sz w:val="20"/>
+                <w:szCs w:val="20"/>
+              </w:rPr>
+              <w:t>Elemento físico o electrónico instalado para prevenir accidentes: guardas de maquinaria, barreras, detectores de gases, sistemas de bloqueo (candados/tarjetas LOTO), válvulas de alivio, interruptores de emergencia.</w:t>
             </w:r>
           </w:p>
         </w:tc>
@@ -896,14 +936,16 @@
             <w:vAlign w:val="center"/>
           </w:tcPr>
           <w:p>
-            <w:pPr/>
+            <w:pPr>
+              <w:spacing w:before="0" w:after="40"/>
+            </w:pPr>
             <w:r>
               <w:rPr>
                 <w:b/>
                 <w:sz w:val="20"/>
                 <w:szCs w:val="20"/>
               </w:rPr>
-              <w:t>LOTO</w:t>
+              <w:t>Procedimiento de Trabajo Seguro</w:t>
             </w:r>
           </w:p>
         </w:tc>
@@ -926,13 +968,15 @@
             <w:vAlign w:val="center"/>
           </w:tcPr>
           <w:p>
-            <w:pPr/>
-            <w:r>
-              <w:rPr>
-                <w:sz w:val="20"/>
-                <w:szCs w:val="20"/>
-              </w:rPr>
-              <w:t>Lockout/Tagout: procedimiento para bloquear y etiquetar fuentes de energía peligrosas antes de intervenir equipos, garantizando que no se energicen accidentalmente.</w:t>
+            <w:pPr>
+              <w:spacing w:before="0" w:after="40"/>
+            </w:pPr>
+            <w:r>
+              <w:rPr>
+                <w:sz w:val="20"/>
+                <w:szCs w:val="20"/>
+              </w:rPr>
+              <w:t>Descripción paso a paso de cómo ejecutar una tarea reduciendo los riesgos al mínimo. Incluye: secuencia de operaciones, EPP requerido por paso, medidas de control y acciones de emergencia.</w:t>
             </w:r>
           </w:p>
         </w:tc>
@@ -960,14 +1004,16 @@
             <w:vAlign w:val="center"/>
           </w:tcPr>
           <w:p>
-            <w:pPr/>
+            <w:pPr>
+              <w:spacing w:before="0" w:after="40"/>
+            </w:pPr>
             <w:r>
               <w:rPr>
                 <w:b/>
                 <w:sz w:val="20"/>
                 <w:szCs w:val="20"/>
               </w:rPr>
-              <w:t>SDS / HDS</w:t>
+              <w:t>Señalización de Seguridad</w:t>
             </w:r>
           </w:p>
         </w:tc>
@@ -990,13 +1036,15 @@
             <w:vAlign w:val="center"/>
           </w:tcPr>
           <w:p>
-            <w:pPr/>
-            <w:r>
-              <w:rPr>
-                <w:sz w:val="20"/>
-                <w:szCs w:val="20"/>
-              </w:rPr>
-              <w:t>Hoja de Datos de Seguridad (Safety Data Sheet). Documento con información sobre riesgos, manejo seguro, EPP requerido y medidas de emergencia para sustancias químicas.</w:t>
+            <w:pPr>
+              <w:spacing w:before="0" w:after="40"/>
+            </w:pPr>
+            <w:r>
+              <w:rPr>
+                <w:sz w:val="20"/>
+                <w:szCs w:val="20"/>
+              </w:rPr>
+              <w:t>Señales, conos, cintas y barreras que delimitan el área de trabajo y advierten sobre riesgos. Debe instalarse antes de iniciar y retirarse únicamente al cierre del permiso.</w:t>
             </w:r>
           </w:p>
         </w:tc>
@@ -1024,14 +1072,16 @@
             <w:vAlign w:val="center"/>
           </w:tcPr>
           <w:p>
-            <w:pPr/>
+            <w:pPr>
+              <w:spacing w:before="0" w:after="40"/>
+            </w:pPr>
             <w:r>
               <w:rPr>
                 <w:b/>
                 <w:sz w:val="20"/>
                 <w:szCs w:val="20"/>
               </w:rPr>
-              <w:t>ART (Análisis de Riesgo en el Trabajo)</w:t>
+              <w:t>Extintor Portátil</w:t>
             </w:r>
           </w:p>
         </w:tc>
@@ -1054,13 +1104,15 @@
             <w:vAlign w:val="center"/>
           </w:tcPr>
           <w:p>
-            <w:pPr/>
-            <w:r>
-              <w:rPr>
-                <w:sz w:val="20"/>
-                <w:szCs w:val="20"/>
-              </w:rPr>
-              <w:t>Análisis participativo realizado por el equipo de trabajo inmediatamente antes de iniciar cada tarea, identificando paso a paso los peligros específicos y los controles a aplicar. Complementa el IPERC y es obligatorio para toda actividad en las instalaciones de Plantabal.</w:t>
+            <w:pPr>
+              <w:spacing w:before="0" w:after="40"/>
+            </w:pPr>
+            <w:r>
+              <w:rPr>
+                <w:sz w:val="20"/>
+                <w:szCs w:val="20"/>
+              </w:rPr>
+              <w:t>Equipo de primera intervención contra incendio. Clasificación: PQS (fuegos A, B, C), CO₂ (equipos eléctricos), agua pressurizada (fuegos clase A). Uso: técnica PASS — Jalar pasador, Apuntar a la base, presionar la Palanca, barrer de lado a lado (Sweep).</w:t>
             </w:r>
           </w:p>
         </w:tc>
@@ -1088,14 +1140,16 @@
             <w:vAlign w:val="center"/>
           </w:tcPr>
           <w:p>
-            <w:pPr/>
+            <w:pPr>
+              <w:spacing w:before="0" w:after="40"/>
+            </w:pPr>
             <w:r>
               <w:rPr>
                 <w:b/>
                 <w:sz w:val="20"/>
                 <w:szCs w:val="20"/>
               </w:rPr>
-              <w:t>Área Solicitante</w:t>
+              <w:t>Disposición de Residuos</w:t>
             </w:r>
           </w:p>
         </w:tc>
@@ -1118,13 +1172,15 @@
             <w:vAlign w:val="center"/>
           </w:tcPr>
           <w:p>
-            <w:pPr/>
-            <w:r>
-              <w:rPr>
-                <w:sz w:val="20"/>
-                <w:szCs w:val="20"/>
-              </w:rPr>
-              <w:t>Jefatura o supervisor de Plantabal S.A. que requiere y autoriza la ejecución de trabajos por parte de una empresa contratista. Es responsable de definir el alcance, facilitar las condiciones de acceso y verificar el cumplimiento de los estándares en su área.</w:t>
+            <w:pPr>
+              <w:spacing w:before="0" w:after="40"/>
+            </w:pPr>
+            <w:r>
+              <w:rPr>
+                <w:sz w:val="20"/>
+                <w:szCs w:val="20"/>
+              </w:rPr>
+              <w:t>Proceso de segregación, almacenamiento temporal y entrega de residuos para su gestión final conforme a la normativa ambiental vigente. El contratista es responsable de los residuos que genera.</w:t>
             </w:r>
           </w:p>
         </w:tc>
@@ -1152,14 +1208,16 @@
             <w:vAlign w:val="center"/>
           </w:tcPr>
           <w:p>
-            <w:pPr/>
+            <w:pPr>
+              <w:spacing w:before="0" w:after="40"/>
+            </w:pPr>
             <w:r>
               <w:rPr>
                 <w:b/>
                 <w:sz w:val="20"/>
                 <w:szCs w:val="20"/>
               </w:rPr>
-              <w:t>Permiso de Trabajo General</w:t>
+              <w:t>IPERC</w:t>
             </w:r>
           </w:p>
         </w:tc>
@@ -1182,13 +1240,15 @@
             <w:vAlign w:val="center"/>
           </w:tcPr>
           <w:p>
-            <w:pPr/>
-            <w:r>
-              <w:rPr>
-                <w:sz w:val="20"/>
-                <w:szCs w:val="20"/>
-              </w:rPr>
-              <w:t>Documento que autoriza actividades de bajo a mediano riesgo dentro de las instalaciones. Emitido por el Área Solicitante con conocimiento de E&amp;S.</w:t>
+            <w:pPr>
+              <w:spacing w:before="0" w:after="40"/>
+            </w:pPr>
+            <w:r>
+              <w:rPr>
+                <w:sz w:val="20"/>
+                <w:szCs w:val="20"/>
+              </w:rPr>
+              <w:t>Identificación de Peligros, Evaluación de Riesgos y Controles. Documento base que el contratista elabora previo al inicio, complementado por el ART en sitio.</w:t>
             </w:r>
           </w:p>
         </w:tc>
@@ -1216,14 +1276,16 @@
             <w:vAlign w:val="center"/>
           </w:tcPr>
           <w:p>
-            <w:pPr/>
+            <w:pPr>
+              <w:spacing w:before="0" w:after="40"/>
+            </w:pPr>
             <w:r>
               <w:rPr>
                 <w:b/>
                 <w:sz w:val="20"/>
                 <w:szCs w:val="20"/>
               </w:rPr>
-              <w:t>Permiso de Trabajo Especial</w:t>
+              <w:t>LOTO</w:t>
             </w:r>
           </w:p>
         </w:tc>
@@ -1246,13 +1308,15 @@
             <w:vAlign w:val="center"/>
           </w:tcPr>
           <w:p>
-            <w:pPr/>
-            <w:r>
-              <w:rPr>
-                <w:sz w:val="20"/>
-                <w:szCs w:val="20"/>
-              </w:rPr>
-              <w:t>Documento que autoriza actividades de alto riesgo: trabajo en altura, espacio confinado, trabajo en caliente, LOTO, excavaciones. Emitido y firmado por E&amp;S y el Supervisor de Área. Válido solo por la jornada indicada.</w:t>
+            <w:pPr>
+              <w:spacing w:before="0" w:after="40"/>
+            </w:pPr>
+            <w:r>
+              <w:rPr>
+                <w:sz w:val="20"/>
+                <w:szCs w:val="20"/>
+              </w:rPr>
+              <w:t>Lockout/Tagout: bloqueo y etiquetado de fuentes de energía peligrosas antes de intervenir equipos. Cada trabajador coloca su propio candado y tarjeta; ninguno puede retirar el de otro.</w:t>
             </w:r>
           </w:p>
         </w:tc>
@@ -1280,14 +1344,16 @@
             <w:vAlign w:val="center"/>
           </w:tcPr>
           <w:p>
-            <w:pPr/>
+            <w:pPr>
+              <w:spacing w:before="0" w:after="40"/>
+            </w:pPr>
             <w:r>
               <w:rPr>
                 <w:b/>
                 <w:sz w:val="20"/>
                 <w:szCs w:val="20"/>
               </w:rPr>
-              <w:t>Residuo Peligroso</w:t>
+              <w:t>SDS / HDS</w:t>
             </w:r>
           </w:p>
         </w:tc>
@@ -1310,77 +1376,15 @@
             <w:vAlign w:val="center"/>
           </w:tcPr>
           <w:p>
-            <w:pPr/>
-            <w:r>
-              <w:rPr>
-                <w:sz w:val="20"/>
-                <w:szCs w:val="20"/>
-              </w:rPr>
-              <w:t>Desecho que por sus características (inflamabilidad, corrosividad, toxicidad, reactividad) representa riesgo para la salud o el medio ambiente. Requiere manejo, almacenamiento temporal y disposición según la normativa ambiental vigente.</w:t>
-            </w:r>
-          </w:p>
-        </w:tc>
-      </w:tr>
-      <w:tr>
-        <w:trPr>
-          <w:tblHeader/>
-        </w:trPr>
-        <w:tc>
-          <w:tcPr>
-            <w:tcW w:w="2600" w:type="dxa"/>
-            <w:tcBorders>
-              <w:top w:val="single" w:sz="4" w:space="0" w:color="000000"/>
-              <w:left w:val="single" w:sz="4" w:space="0" w:color="000000"/>
-              <w:bottom w:val="single" w:sz="4" w:space="0" w:color="000000"/>
-              <w:right w:val="single" w:sz="4" w:space="0" w:color="000000"/>
-            </w:tcBorders>
-            <w:shd w:val="clear" w:color="auto" w:fill="D9D9D9"/>
-            <w:tcMar>
-              <w:top w:w="70" w:type="dxa"/>
-              <w:left w:w="100" w:type="dxa"/>
-              <w:bottom w:w="70" w:type="dxa"/>
-              <w:right w:w="100" w:type="dxa"/>
-            </w:tcMar>
-            <w:vAlign w:val="center"/>
-          </w:tcPr>
-          <w:p>
-            <w:pPr/>
-            <w:r>
-              <w:rPr>
-                <w:b/>
-                <w:sz w:val="20"/>
-                <w:szCs w:val="20"/>
-              </w:rPr>
-              <w:t>Incumplimiento</w:t>
-            </w:r>
-          </w:p>
-        </w:tc>
-        <w:tc>
-          <w:tcPr>
-            <w:tcW w:w="7038" w:type="dxa"/>
-            <w:tcBorders>
-              <w:top w:val="single" w:sz="4" w:space="0" w:color="000000"/>
-              <w:left w:val="single" w:sz="4" w:space="0" w:color="000000"/>
-              <w:bottom w:val="single" w:sz="4" w:space="0" w:color="000000"/>
-              <w:right w:val="single" w:sz="4" w:space="0" w:color="000000"/>
-            </w:tcBorders>
-            <w:shd w:val="clear" w:color="auto" w:fill="D9D9D9"/>
-            <w:tcMar>
-              <w:top w:w="70" w:type="dxa"/>
-              <w:left w:w="100" w:type="dxa"/>
-              <w:bottom w:w="70" w:type="dxa"/>
-              <w:right w:w="100" w:type="dxa"/>
-            </w:tcMar>
-            <w:vAlign w:val="center"/>
-          </w:tcPr>
-          <w:p>
-            <w:pPr/>
-            <w:r>
-              <w:rPr>
-                <w:sz w:val="20"/>
-                <w:szCs w:val="20"/>
-              </w:rPr>
-              <w:t>Inobservancia de uno o más requisitos de este estándar por parte del contratista o su personal, que puede derivar en la paralización de actividades.</w:t>
+            <w:pPr>
+              <w:spacing w:before="0" w:after="40"/>
+            </w:pPr>
+            <w:r>
+              <w:rPr>
+                <w:sz w:val="20"/>
+                <w:szCs w:val="20"/>
+              </w:rPr>
+              <w:t>Hoja de Datos de Seguridad. Información sobre riesgos, EPP requerido, manejo seguro y respuesta ante emergencias de una sustancia química.</w:t>
             </w:r>
           </w:p>
         </w:tc>
@@ -1388,22 +1392,22 @@
     </w:tbl>
     <w:p>
       <w:pPr>
-        <w:spacing w:before="120"/>
+        <w:spacing w:before="0" w:after="0"/>
       </w:pPr>
     </w:p>
     <w:p>
       <w:pPr>
-        <w:spacing w:before="120"/>
+        <w:spacing w:before="0" w:after="0"/>
       </w:pPr>
     </w:p>
     <w:p>
       <w:pPr>
-        <w:spacing w:before="120"/>
+        <w:spacing w:before="0" w:after="0"/>
       </w:pPr>
     </w:p>
     <w:p>
       <w:pPr>
-        <w:spacing w:before="120"/>
+        <w:spacing w:before="0" w:after="0"/>
       </w:pPr>
     </w:p>
     <w:p>
@@ -1415,7 +1419,7 @@
           <w:right w:val="single" w:sz="4" w:space="0" w:color="000000"/>
         </w:pBdr>
         <w:shd w:val="clear" w:color="auto" w:fill="D9D9D9"/>
-        <w:spacing w:before="160" w:after="80"/>
+        <w:spacing w:before="60" w:after="40"/>
       </w:pPr>
       <w:r>
         <w:rPr>
@@ -1539,7 +1543,9 @@
             <w:vAlign w:val="center"/>
           </w:tcPr>
           <w:p>
-            <w:pPr/>
+            <w:pPr>
+              <w:spacing w:before="0" w:after="40"/>
+            </w:pPr>
             <w:r>
               <w:rPr>
                 <w:b/>
@@ -1569,13 +1575,15 @@
             <w:vAlign w:val="center"/>
           </w:tcPr>
           <w:p>
-            <w:pPr/>
-            <w:r>
-              <w:rPr>
-                <w:sz w:val="20"/>
-                <w:szCs w:val="20"/>
-              </w:rPr>
-              <w:t>Verificar el cumplimiento de los estándares de EPP, herramientas y condiciones antes y durante las actividades de los contratistas; detener trabajos que incumplan los requisitos; registrar incumplimientos y aplicar las sanciones correspondientes.</w:t>
+            <w:pPr>
+              <w:spacing w:before="0" w:after="40"/>
+            </w:pPr>
+            <w:r>
+              <w:rPr>
+                <w:sz w:val="20"/>
+                <w:szCs w:val="20"/>
+              </w:rPr>
+              <w:t>Verificar cumplimiento de EPP, herramientas y documentación en ingreso y durante la actividad. Emitir y firmar permisos para TAR. Realizar acompañamiento en ART. Registrar incumplimientos y aplicar sanciones. Detener trabajos inseguros.</w:t>
             </w:r>
           </w:p>
         </w:tc>
@@ -1603,14 +1611,16 @@
             <w:vAlign w:val="center"/>
           </w:tcPr>
           <w:p>
-            <w:pPr/>
+            <w:pPr>
+              <w:spacing w:before="0" w:after="40"/>
+            </w:pPr>
             <w:r>
               <w:rPr>
                 <w:b/>
                 <w:sz w:val="20"/>
                 <w:szCs w:val="20"/>
               </w:rPr>
-              <w:t>Supervisor / Jefe de Contratista</w:t>
+              <w:t>Área Solicitante / Jefe de Área (Plantabal)</w:t>
             </w:r>
           </w:p>
         </w:tc>
@@ -1633,13 +1643,15 @@
             <w:vAlign w:val="center"/>
           </w:tcPr>
           <w:p>
-            <w:pPr/>
-            <w:r>
-              <w:rPr>
-                <w:sz w:val="20"/>
-                <w:szCs w:val="20"/>
-              </w:rPr>
-              <w:t>Asegurar que su personal porte y use correctamente el EPP obligatorio; verificar el estado de herramientas y equipos antes de ingresar; presentar documentación habilitante requerida; reportar inmediatamente cualquier incidente o condición insegura.</w:t>
+            <w:pPr>
+              <w:spacing w:before="0" w:after="40"/>
+            </w:pPr>
+            <w:r>
+              <w:rPr>
+                <w:sz w:val="20"/>
+                <w:szCs w:val="20"/>
+              </w:rPr>
+              <w:t>Definir el alcance del trabajo contratado. Coordinar con E&amp;S la inspección previa. Verificar condiciones seguras del área antes del ingreso. Firmar permisos de trabajo. Designar punto de contacto disponible durante toda la jornada.</w:t>
             </w:r>
           </w:p>
         </w:tc>
@@ -1667,14 +1679,16 @@
             <w:vAlign w:val="center"/>
           </w:tcPr>
           <w:p>
-            <w:pPr/>
+            <w:pPr>
+              <w:spacing w:before="0" w:after="40"/>
+            </w:pPr>
             <w:r>
               <w:rPr>
                 <w:b/>
                 <w:sz w:val="20"/>
                 <w:szCs w:val="20"/>
               </w:rPr>
-              <w:t>Trabajador Contratista</w:t>
+              <w:t>Supervisor del Contratista</w:t>
             </w:r>
           </w:p>
         </w:tc>
@@ -1697,13 +1711,15 @@
             <w:vAlign w:val="center"/>
           </w:tcPr>
           <w:p>
-            <w:pPr/>
-            <w:r>
-              <w:rPr>
-                <w:sz w:val="20"/>
-                <w:szCs w:val="20"/>
-              </w:rPr>
-              <w:t>Utilizar correctamente el EPP asignado en todo momento dentro de las instalaciones; mantener el área de trabajo ordenada y limpia; no iniciar actividades sin el permiso de trabajo vigente; reportar condiciones inseguras a su supervisor.</w:t>
+            <w:pPr>
+              <w:spacing w:before="0" w:after="40"/>
+            </w:pPr>
+            <w:r>
+              <w:rPr>
+                <w:sz w:val="20"/>
+                <w:szCs w:val="20"/>
+              </w:rPr>
+              <w:t>Asegurar que su personal ingrese con GE-SO-R34 y EPP completo. Liderar el ART antes de iniciar. Cumplir los tiempos establecidos para presentarse en área tras obtener el permiso en dispensario. Reportar incidentes y condiciones inseguras de inmediato.</w:t>
             </w:r>
           </w:p>
         </w:tc>
@@ -1731,14 +1747,16 @@
             <w:vAlign w:val="center"/>
           </w:tcPr>
           <w:p>
-            <w:pPr/>
+            <w:pPr>
+              <w:spacing w:before="0" w:after="40"/>
+            </w:pPr>
             <w:r>
               <w:rPr>
                 <w:b/>
                 <w:sz w:val="20"/>
                 <w:szCs w:val="20"/>
               </w:rPr>
-              <w:t>Jefe / Supervisor de Área (Plantabal)</w:t>
+              <w:t>Trabajador Contratista</w:t>
             </w:r>
           </w:p>
         </w:tc>
@@ -1761,13 +1779,15 @@
             <w:vAlign w:val="center"/>
           </w:tcPr>
           <w:p>
-            <w:pPr/>
-            <w:r>
-              <w:rPr>
-                <w:sz w:val="20"/>
-                <w:szCs w:val="20"/>
-              </w:rPr>
-              <w:t>Verificar que los contratistas que trabajan en su área de responsabilidad cumplan con los estándares de este instructivo; notificar al equipo de E&amp;S ante cualquier incumplimiento observado.</w:t>
+            <w:pPr>
+              <w:spacing w:before="0" w:after="40"/>
+            </w:pPr>
+            <w:r>
+              <w:rPr>
+                <w:sz w:val="20"/>
+                <w:szCs w:val="20"/>
+              </w:rPr>
+              <w:t>Portar y usar correctamente el EPP en todo momento. Participar activamente en el ART. No iniciar ninguna actividad sin permiso de trabajo vigente. Mantener el área ordenada y reportar condiciones inseguras a su supervisor.</w:t>
             </w:r>
           </w:p>
         </w:tc>
@@ -1795,14 +1815,16 @@
             <w:vAlign w:val="center"/>
           </w:tcPr>
           <w:p>
-            <w:pPr/>
+            <w:pPr>
+              <w:spacing w:before="0" w:after="40"/>
+            </w:pPr>
             <w:r>
               <w:rPr>
                 <w:b/>
                 <w:sz w:val="20"/>
                 <w:szCs w:val="20"/>
               </w:rPr>
-              <w:t>Área Solicitante / Jefe de Área (Plantabal)</w:t>
+              <w:t>Enfermera / Dispensario Médico</w:t>
             </w:r>
           </w:p>
         </w:tc>
@@ -1825,13 +1847,15 @@
             <w:vAlign w:val="center"/>
           </w:tcPr>
           <w:p>
-            <w:pPr/>
-            <w:r>
-              <w:rPr>
-                <w:sz w:val="20"/>
-                <w:szCs w:val="20"/>
-              </w:rPr>
-              <w:t>Definir el alcance detallado del trabajo a contratar; coordinar con E&amp;S la emisión del permiso de trabajo; garantizar que el área esté en condiciones seguras antes del inicio; supervisar el avance de los trabajos y verificar que el contratista cumple los estándares en todo momento.</w:t>
+            <w:pPr>
+              <w:spacing w:before="0" w:after="40"/>
+            </w:pPr>
+            <w:r>
+              <w:rPr>
+                <w:sz w:val="20"/>
+                <w:szCs w:val="20"/>
+              </w:rPr>
+              <w:t>Realizar la valoración médica previa a TAR: tomar signos vitales, evaluar aptitud del trabajador y firmar el permiso correspondiente. Registrar la evaluación y notificar a E&amp;S si el trabajador no está en condiciones de ejecutar la tarea.</w:t>
             </w:r>
           </w:p>
         </w:tc>
@@ -1859,7 +1883,9 @@
             <w:vAlign w:val="center"/>
           </w:tcPr>
           <w:p>
-            <w:pPr/>
+            <w:pPr>
+              <w:spacing w:before="0" w:after="40"/>
+            </w:pPr>
             <w:r>
               <w:rPr>
                 <w:b/>
@@ -1889,13 +1915,15 @@
             <w:vAlign w:val="center"/>
           </w:tcPr>
           <w:p>
-            <w:pPr/>
-            <w:r>
-              <w:rPr>
-                <w:sz w:val="20"/>
-                <w:szCs w:val="20"/>
-              </w:rPr>
-              <w:t>Aprobar y respaldar la aplicación de este estándar; tomar decisiones sobre la suspensión de contratos ante incumplimientos reiterados o graves que pongan en riesgo la seguridad de personas o instalaciones.</w:t>
+            <w:pPr>
+              <w:spacing w:before="0" w:after="40"/>
+            </w:pPr>
+            <w:r>
+              <w:rPr>
+                <w:sz w:val="20"/>
+                <w:szCs w:val="20"/>
+              </w:rPr>
+              <w:t>Respaldar la aplicación de este estándar. Resolver incumplimientos graves. Autorizar la reanudación de trabajos suspendidos. Decidir sobre la continuidad de contratos ante incumplimientos reiterados.</w:t>
             </w:r>
           </w:p>
         </w:tc>
@@ -1903,7 +1931,7 @@
     </w:tbl>
     <w:p>
       <w:pPr>
-        <w:spacing w:before="120"/>
+        <w:spacing w:before="0" w:after="0"/>
       </w:pPr>
     </w:p>
     <w:p>
@@ -1915,7 +1943,7 @@
           <w:right w:val="single" w:sz="4" w:space="0" w:color="000000"/>
         </w:pBdr>
         <w:shd w:val="clear" w:color="auto" w:fill="D9D9D9"/>
-        <w:spacing w:before="160" w:after="80"/>
+        <w:spacing w:before="60" w:after="40"/>
       </w:pPr>
       <w:r>
         <w:rPr>
@@ -2108,7 +2136,9 @@
             <w:vAlign w:val="center"/>
           </w:tcPr>
           <w:p>
-            <w:pPr/>
+            <w:pPr>
+              <w:spacing w:before="0" w:after="40"/>
+            </w:pPr>
           </w:p>
         </w:tc>
         <w:tc>
@@ -2132,6 +2162,7 @@
           <w:p>
             <w:pPr>
               <w:jc w:val="center"/>
+              <w:spacing w:before="0" w:after="40"/>
             </w:pPr>
             <w:r>
               <w:rPr>
@@ -2139,7 +2170,7 @@
                 <w:sz w:val="20"/>
                 <w:szCs w:val="20"/>
               </w:rPr>
-              <w:t>FASE 1: VERIFICACIÓN DE EPP MÍNIMO OBLIGATORIO</w:t>
+              <w:t>FASE 1: INGRESO Y VERIFICACIÓN DOCUMENTAL</w:t>
             </w:r>
           </w:p>
         </w:tc>
@@ -2162,7 +2193,9 @@
             <w:vAlign w:val="center"/>
           </w:tcPr>
           <w:p>
-            <w:pPr/>
+            <w:pPr>
+              <w:spacing w:before="0" w:after="40"/>
+            </w:pPr>
           </w:p>
         </w:tc>
         <w:tc>
@@ -2184,7 +2217,9 @@
             <w:vAlign w:val="center"/>
           </w:tcPr>
           <w:p>
-            <w:pPr/>
+            <w:pPr>
+              <w:spacing w:before="0" w:after="40"/>
+            </w:pPr>
           </w:p>
         </w:tc>
       </w:tr>
@@ -2213,6 +2248,7 @@
           <w:p>
             <w:pPr>
               <w:jc w:val="center"/>
+              <w:spacing w:before="0" w:after="40"/>
             </w:pPr>
             <w:r>
               <w:rPr>
@@ -2243,13 +2279,15 @@
             <w:vAlign w:val="center"/>
           </w:tcPr>
           <w:p>
-            <w:pPr/>
-            <w:r>
-              <w:rPr>
-                <w:sz w:val="20"/>
-                <w:szCs w:val="20"/>
-              </w:rPr>
-              <w:t>Verificar que todo trabajador contratista porte el EPP básico obligatorio antes de ingresar al área de trabajo: casco de seguridad (clase E o superior), gafas de seguridad claras, calzado de seguridad con punta de acero y suela antideslizante, ropa de trabajo de manga larga (no ropa de calle), guantes según tipo de actividad.</w:t>
+            <w:pPr>
+              <w:spacing w:before="0" w:after="40"/>
+            </w:pPr>
+            <w:r>
+              <w:rPr>
+                <w:sz w:val="20"/>
+                <w:szCs w:val="20"/>
+              </w:rPr>
+              <w:t>El personal contratista presenta en portería / E&amp;S el GE-SO-R34 vigente. Se verifica: inducción de seguridad activa, cert. médico vigente, habilitaciones individuales según el tipo de trabajo a realizar y filiación IESS del mes en curso. Sin GE-SO-R34 completo no se autoriza el ingreso.</w:t>
             </w:r>
           </w:p>
         </w:tc>
@@ -2274,13 +2312,14 @@
           <w:p>
             <w:pPr>
               <w:jc w:val="center"/>
-            </w:pPr>
-            <w:r>
-              <w:rPr>
-                <w:sz w:val="20"/>
-                <w:szCs w:val="20"/>
-              </w:rPr>
-              <w:t>Equipo de E&amp;S / Supervisor Contratista</w:t>
+              <w:spacing w:before="0" w:after="40"/>
+            </w:pPr>
+            <w:r>
+              <w:rPr>
+                <w:sz w:val="20"/>
+                <w:szCs w:val="20"/>
+              </w:rPr>
+              <w:t>Equipo de E&amp;S</w:t>
             </w:r>
           </w:p>
         </w:tc>
@@ -2305,13 +2344,14 @@
           <w:p>
             <w:pPr>
               <w:jc w:val="center"/>
-            </w:pPr>
-            <w:r>
-              <w:rPr>
-                <w:sz w:val="20"/>
-                <w:szCs w:val="20"/>
-              </w:rPr>
-              <w:t>Supervisor de Área</w:t>
+              <w:spacing w:before="0" w:after="40"/>
+            </w:pPr>
+            <w:r>
+              <w:rPr>
+                <w:sz w:val="20"/>
+                <w:szCs w:val="20"/>
+              </w:rPr>
+              <w:t>Supervisor Contratista</w:t>
             </w:r>
           </w:p>
         </w:tc>
@@ -2341,6 +2381,7 @@
           <w:p>
             <w:pPr>
               <w:jc w:val="center"/>
+              <w:spacing w:before="0" w:after="40"/>
             </w:pPr>
             <w:r>
               <w:rPr>
@@ -2371,13 +2412,15 @@
             <w:vAlign w:val="center"/>
           </w:tcPr>
           <w:p>
-            <w:pPr/>
-            <w:r>
-              <w:rPr>
-                <w:sz w:val="20"/>
-                <w:szCs w:val="20"/>
-              </w:rPr>
-              <w:t>Para trabajos en altura (≥1,8 m): verificar arnés de cuerpo completo certificado + línea de vida absorbente de impacto + casco con barbuquejo ajustado. El arnés debe estar inspeccionado y sin señales de deterioro.</w:t>
+            <w:pPr>
+              <w:spacing w:before="0" w:after="40"/>
+            </w:pPr>
+            <w:r>
+              <w:rPr>
+                <w:sz w:val="20"/>
+                <w:szCs w:val="20"/>
+              </w:rPr>
+              <w:t>E&amp;S verifica la identidad del trabajador contra el GE-SO-R34. El supervisor del contratista presenta la lista actualizada de personal que ingresará ese día y el tipo de actividad a ejecutar.</w:t>
             </w:r>
           </w:p>
         </w:tc>
@@ -2402,6 +2445,7 @@
           <w:p>
             <w:pPr>
               <w:jc w:val="center"/>
+              <w:spacing w:before="0" w:after="40"/>
             </w:pPr>
             <w:r>
               <w:rPr>
@@ -2433,13 +2477,14 @@
           <w:p>
             <w:pPr>
               <w:jc w:val="center"/>
-            </w:pPr>
-            <w:r>
-              <w:rPr>
-                <w:sz w:val="20"/>
-                <w:szCs w:val="20"/>
-              </w:rPr>
-              <w:t>Supervisor de Área</w:t>
+              <w:spacing w:before="0" w:after="40"/>
+            </w:pPr>
+            <w:r>
+              <w:rPr>
+                <w:sz w:val="20"/>
+                <w:szCs w:val="20"/>
+              </w:rPr>
+              <w:t>Área Solicitante</w:t>
             </w:r>
           </w:p>
         </w:tc>
@@ -2469,6 +2514,7 @@
           <w:p>
             <w:pPr>
               <w:jc w:val="center"/>
+              <w:spacing w:before="0" w:after="40"/>
             </w:pPr>
             <w:r>
               <w:rPr>
@@ -2499,13 +2545,15 @@
             <w:vAlign w:val="center"/>
           </w:tcPr>
           <w:p>
-            <w:pPr/>
-            <w:r>
-              <w:rPr>
-                <w:sz w:val="20"/>
-                <w:szCs w:val="20"/>
-              </w:rPr>
-              <w:t>Para trabajos en caliente (soldadura, corte, esmerilado): careta de soldador o gafas de esmerilar según tarea + delantal de cuero + guantes de cuero + protector auditivo si aplica.</w:t>
+            <w:pPr>
+              <w:spacing w:before="0" w:after="40"/>
+            </w:pPr>
+            <w:r>
+              <w:rPr>
+                <w:sz w:val="20"/>
+                <w:szCs w:val="20"/>
+              </w:rPr>
+              <w:t>Verificación de EPP en ingreso: casco clase E, gafas de seguridad, calzado con punta de acero, ropa de trabajo de manga larga. Si la actividad requiere EPP adicional (arnés, careta, guantes especializados), el contratista debe presentarlo en este punto para verificación. EPP deficiente = no ingresa.</w:t>
             </w:r>
           </w:p>
         </w:tc>
@@ -2530,6 +2578,7 @@
           <w:p>
             <w:pPr>
               <w:jc w:val="center"/>
+              <w:spacing w:before="0" w:after="40"/>
             </w:pPr>
             <w:r>
               <w:rPr>
@@ -2561,13 +2610,14 @@
           <w:p>
             <w:pPr>
               <w:jc w:val="center"/>
-            </w:pPr>
-            <w:r>
-              <w:rPr>
-                <w:sz w:val="20"/>
-                <w:szCs w:val="20"/>
-              </w:rPr>
-              <w:t>Supervisor de Área</w:t>
+              <w:spacing w:before="0" w:after="40"/>
+            </w:pPr>
+            <w:r>
+              <w:rPr>
+                <w:sz w:val="20"/>
+                <w:szCs w:val="20"/>
+              </w:rPr>
+              <w:t>Supervisor Contratista</w:t>
             </w:r>
           </w:p>
         </w:tc>
@@ -2597,6 +2647,7 @@
           <w:p>
             <w:pPr>
               <w:jc w:val="center"/>
+              <w:spacing w:before="0" w:after="40"/>
             </w:pPr>
             <w:r>
               <w:rPr>
@@ -2627,13 +2678,15 @@
             <w:vAlign w:val="center"/>
           </w:tcPr>
           <w:p>
-            <w:pPr/>
-            <w:r>
-              <w:rPr>
-                <w:sz w:val="20"/>
-                <w:szCs w:val="20"/>
-              </w:rPr>
-              <w:t>Para trabajos con productos químicos: respirador con cartucho adecuado según SDS + guantes resistentes a la sustancia + gafas tipo splash (no solo antiprojection). Verificar que el trabajador conoce el SDS del producto.</w:t>
+            <w:pPr>
+              <w:spacing w:before="0" w:after="40"/>
+            </w:pPr>
+            <w:r>
+              <w:rPr>
+                <w:sz w:val="20"/>
+                <w:szCs w:val="20"/>
+              </w:rPr>
+              <w:t>Verificación de herramientas y equipos: se realiza inspección visual en ingreso. Herramientas en mal estado, cables empalchados, equipos sin guardas o cilindros sin cadena no ingresan. El supervisor del contratista firma la lista de herramientas autorizadas.</w:t>
             </w:r>
           </w:p>
         </w:tc>
@@ -2658,6 +2711,7 @@
           <w:p>
             <w:pPr>
               <w:jc w:val="center"/>
+              <w:spacing w:before="0" w:after="40"/>
             </w:pPr>
             <w:r>
               <w:rPr>
@@ -2689,13 +2743,14 @@
           <w:p>
             <w:pPr>
               <w:jc w:val="center"/>
-            </w:pPr>
-            <w:r>
-              <w:rPr>
-                <w:sz w:val="20"/>
-                <w:szCs w:val="20"/>
-              </w:rPr>
-              <w:t>Supervisor de Área</w:t>
+              <w:spacing w:before="0" w:after="40"/>
+            </w:pPr>
+            <w:r>
+              <w:rPr>
+                <w:sz w:val="20"/>
+                <w:szCs w:val="20"/>
+              </w:rPr>
+              <w:t>Supervisor Contratista</w:t>
             </w:r>
           </w:p>
         </w:tc>
@@ -2724,7 +2779,32 @@
           </w:tcPr>
           <w:p>
             <w:pPr>
-              <w:jc w:val="center"/>
+              <w:spacing w:before="0" w:after="40"/>
+            </w:pPr>
+          </w:p>
+        </w:tc>
+        <w:tc>
+          <w:tcPr>
+            <w:tcW w:w="5888" w:type="dxa"/>
+            <w:tcBorders>
+              <w:top w:val="single" w:sz="4" w:space="0" w:color="000000"/>
+              <w:left w:val="single" w:sz="4" w:space="0" w:color="000000"/>
+              <w:bottom w:val="single" w:sz="4" w:space="0" w:color="000000"/>
+              <w:right w:val="single" w:sz="4" w:space="0" w:color="000000"/>
+            </w:tcBorders>
+            <w:shd w:val="clear" w:color="auto" w:fill="D9D9D9"/>
+            <w:tcMar>
+              <w:top w:w="70" w:type="dxa"/>
+              <w:left w:w="100" w:type="dxa"/>
+              <w:bottom w:w="70" w:type="dxa"/>
+              <w:right w:w="100" w:type="dxa"/>
+            </w:tcMar>
+            <w:vAlign w:val="center"/>
+          </w:tcPr>
+          <w:p>
+            <w:pPr>
+              <w:jc w:val="center"/>
+              <w:spacing w:before="0" w:after="40"/>
             </w:pPr>
             <w:r>
               <w:rPr>
@@ -2732,36 +2812,7 @@
                 <w:sz w:val="20"/>
                 <w:szCs w:val="20"/>
               </w:rPr>
-              <w:t>1.5</w:t>
-            </w:r>
-          </w:p>
-        </w:tc>
-        <w:tc>
-          <w:tcPr>
-            <w:tcW w:w="5888" w:type="dxa"/>
-            <w:tcBorders>
-              <w:top w:val="single" w:sz="4" w:space="0" w:color="000000"/>
-              <w:left w:val="single" w:sz="4" w:space="0" w:color="000000"/>
-              <w:bottom w:val="single" w:sz="4" w:space="0" w:color="000000"/>
-              <w:right w:val="single" w:sz="4" w:space="0" w:color="000000"/>
-            </w:tcBorders>
-            <w:shd w:val="clear" w:color="auto" w:fill="D9D9D9"/>
-            <w:tcMar>
-              <w:top w:w="70" w:type="dxa"/>
-              <w:left w:w="100" w:type="dxa"/>
-              <w:bottom w:w="70" w:type="dxa"/>
-              <w:right w:w="100" w:type="dxa"/>
-            </w:tcMar>
-            <w:vAlign w:val="center"/>
-          </w:tcPr>
-          <w:p>
-            <w:pPr/>
-            <w:r>
-              <w:rPr>
-                <w:sz w:val="20"/>
-                <w:szCs w:val="20"/>
-              </w:rPr>
-              <w:t>Para trabajos en espacios confinados: equipo de monitoreo de gases (O₂, CO, H₂S, LEL) con calibración vigente + equipo de rescate disponible en el exterior + radio de comunicación + vigía permanente en el exterior.</w:t>
+              <w:t>FASE 2: DISPENSARIO MÉDICO — VALORACIÓN PREVIA A TRABAJO DE ALTO RIESGO</w:t>
             </w:r>
           </w:p>
         </w:tc>
@@ -2785,15 +2836,8 @@
           </w:tcPr>
           <w:p>
             <w:pPr>
-              <w:jc w:val="center"/>
-            </w:pPr>
-            <w:r>
-              <w:rPr>
-                <w:sz w:val="20"/>
-                <w:szCs w:val="20"/>
-              </w:rPr>
-              <w:t>Equipo de E&amp;S</w:t>
-            </w:r>
+              <w:spacing w:before="0" w:after="40"/>
+            </w:pPr>
           </w:p>
         </w:tc>
         <w:tc>
@@ -2816,15 +2860,8 @@
           </w:tcPr>
           <w:p>
             <w:pPr>
-              <w:jc w:val="center"/>
-            </w:pPr>
-            <w:r>
-              <w:rPr>
-                <w:sz w:val="20"/>
-                <w:szCs w:val="20"/>
-              </w:rPr>
-              <w:t>Gerencia de Planta</w:t>
-            </w:r>
+              <w:spacing w:before="0" w:after="40"/>
+            </w:pPr>
           </w:p>
         </w:tc>
       </w:tr>
@@ -2851,7 +2888,18 @@
             <w:vAlign w:val="center"/>
           </w:tcPr>
           <w:p>
-            <w:pPr/>
+            <w:pPr>
+              <w:jc w:val="center"/>
+              <w:spacing w:before="0" w:after="40"/>
+            </w:pPr>
+            <w:r>
+              <w:rPr>
+                <w:b/>
+                <w:sz w:val="20"/>
+                <w:szCs w:val="20"/>
+              </w:rPr>
+              <w:t>2.1</w:t>
+            </w:r>
           </w:p>
         </w:tc>
         <w:tc>
@@ -2874,15 +2922,14 @@
           </w:tcPr>
           <w:p>
             <w:pPr>
-              <w:jc w:val="center"/>
-            </w:pPr>
-            <w:r>
-              <w:rPr>
-                <w:b/>
-                <w:sz w:val="20"/>
-                <w:szCs w:val="20"/>
-              </w:rPr>
-              <w:t>FASE 2: VERIFICACIÓN DE HERRAMIENTAS Y EQUIPOS</w:t>
+              <w:spacing w:before="0" w:after="40"/>
+            </w:pPr>
+            <w:r>
+              <w:rPr>
+                <w:sz w:val="20"/>
+                <w:szCs w:val="20"/>
+              </w:rPr>
+              <w:t>Todo trabajador contratista que vaya a ejecutar un Trabajo de Alto Riesgo (TAR) debe presentarse al dispensario médico ANTES de dirigirse al área de trabajo. La enfermera realiza: toma de signos vitales (presión, frecuencia cardíaca, saturación de O₂), evaluación del estado general y firma del permiso de trabajo.</w:t>
             </w:r>
           </w:p>
         </w:tc>
@@ -2905,7 +2952,17 @@
             <w:vAlign w:val="center"/>
           </w:tcPr>
           <w:p>
-            <w:pPr/>
+            <w:pPr>
+              <w:jc w:val="center"/>
+              <w:spacing w:before="0" w:after="40"/>
+            </w:pPr>
+            <w:r>
+              <w:rPr>
+                <w:sz w:val="20"/>
+                <w:szCs w:val="20"/>
+              </w:rPr>
+              <w:t>Enfermera / Dispensario</w:t>
+            </w:r>
           </w:p>
         </w:tc>
         <w:tc>
@@ -2927,7 +2984,17 @@
             <w:vAlign w:val="center"/>
           </w:tcPr>
           <w:p>
-            <w:pPr/>
+            <w:pPr>
+              <w:jc w:val="center"/>
+              <w:spacing w:before="0" w:after="40"/>
+            </w:pPr>
+            <w:r>
+              <w:rPr>
+                <w:sz w:val="20"/>
+                <w:szCs w:val="20"/>
+              </w:rPr>
+              <w:t>Equipo de E&amp;S</w:t>
+            </w:r>
           </w:p>
         </w:tc>
       </w:tr>
@@ -2956,6 +3023,7 @@
           <w:p>
             <w:pPr>
               <w:jc w:val="center"/>
+              <w:spacing w:before="0" w:after="40"/>
             </w:pPr>
             <w:r>
               <w:rPr>
@@ -2963,7 +3031,7 @@
                 <w:sz w:val="20"/>
                 <w:szCs w:val="20"/>
               </w:rPr>
-              <w:t>2.1</w:t>
+              <w:t>2.2</w:t>
             </w:r>
           </w:p>
         </w:tc>
@@ -2986,13 +3054,15 @@
             <w:vAlign w:val="center"/>
           </w:tcPr>
           <w:p>
-            <w:pPr/>
-            <w:r>
-              <w:rPr>
-                <w:sz w:val="20"/>
-                <w:szCs w:val="20"/>
-              </w:rPr>
-              <w:t>Inspeccionar herramientas manuales: mangos sin fisuras ni empalmes provisionales, filos o bordes protegidos en almacenamiento, herramientas libres de aceite o grasa en mangos. Retirar de uso toda herramienta en mal estado.</w:t>
+            <w:pPr>
+              <w:spacing w:before="0" w:after="40"/>
+            </w:pPr>
+            <w:r>
+              <w:rPr>
+                <w:sz w:val="20"/>
+                <w:szCs w:val="20"/>
+              </w:rPr>
+              <w:t>Tipos de TAR que requieren valoración en dispensario: trabajo en caliente (soldadura, corte, esmerilado), trabajo eléctrico / LOTO, trabajo en altura (≥1,8 m), trabajo en espacio confinado, excavaciones y trabajo de izaje de cargas críticas.</w:t>
             </w:r>
           </w:p>
         </w:tc>
@@ -3017,6 +3087,39 @@
           <w:p>
             <w:pPr>
               <w:jc w:val="center"/>
+              <w:spacing w:before="0" w:after="40"/>
+            </w:pPr>
+            <w:r>
+              <w:rPr>
+                <w:sz w:val="20"/>
+                <w:szCs w:val="20"/>
+              </w:rPr>
+              <w:t>Equipo de E&amp;S</w:t>
+            </w:r>
+          </w:p>
+        </w:tc>
+        <w:tc>
+          <w:tcPr>
+            <w:tcW w:w="1300" w:type="dxa"/>
+            <w:tcBorders>
+              <w:top w:val="single" w:sz="4" w:space="0" w:color="000000"/>
+              <w:left w:val="single" w:sz="4" w:space="0" w:color="000000"/>
+              <w:bottom w:val="single" w:sz="4" w:space="0" w:color="000000"/>
+              <w:right w:val="single" w:sz="4" w:space="0" w:color="000000"/>
+            </w:tcBorders>
+            <w:shd w:val="clear" w:color="auto" w:fill="D9D9D9"/>
+            <w:tcMar>
+              <w:top w:w="70" w:type="dxa"/>
+              <w:left w:w="100" w:type="dxa"/>
+              <w:bottom w:w="70" w:type="dxa"/>
+              <w:right w:w="100" w:type="dxa"/>
+            </w:tcMar>
+            <w:vAlign w:val="center"/>
+          </w:tcPr>
+          <w:p>
+            <w:pPr>
+              <w:jc w:val="center"/>
+              <w:spacing w:before="0" w:after="40"/>
             </w:pPr>
             <w:r>
               <w:rPr>
@@ -3024,37 +3127,6 @@
                 <w:szCs w:val="20"/>
               </w:rPr>
               <w:t>Supervisor Contratista</w:t>
-            </w:r>
-          </w:p>
-        </w:tc>
-        <w:tc>
-          <w:tcPr>
-            <w:tcW w:w="1300" w:type="dxa"/>
-            <w:tcBorders>
-              <w:top w:val="single" w:sz="4" w:space="0" w:color="000000"/>
-              <w:left w:val="single" w:sz="4" w:space="0" w:color="000000"/>
-              <w:bottom w:val="single" w:sz="4" w:space="0" w:color="000000"/>
-              <w:right w:val="single" w:sz="4" w:space="0" w:color="000000"/>
-            </w:tcBorders>
-            <w:shd w:val="clear" w:color="auto" w:fill="D9D9D9"/>
-            <w:tcMar>
-              <w:top w:w="70" w:type="dxa"/>
-              <w:left w:w="100" w:type="dxa"/>
-              <w:bottom w:w="70" w:type="dxa"/>
-              <w:right w:w="100" w:type="dxa"/>
-            </w:tcMar>
-            <w:vAlign w:val="center"/>
-          </w:tcPr>
-          <w:p>
-            <w:pPr>
-              <w:jc w:val="center"/>
-            </w:pPr>
-            <w:r>
-              <w:rPr>
-                <w:sz w:val="20"/>
-                <w:szCs w:val="20"/>
-              </w:rPr>
-              <w:t>Equipo de E&amp;S</w:t>
             </w:r>
           </w:p>
         </w:tc>
@@ -3084,6 +3156,7 @@
           <w:p>
             <w:pPr>
               <w:jc w:val="center"/>
+              <w:spacing w:before="0" w:after="40"/>
             </w:pPr>
             <w:r>
               <w:rPr>
@@ -3091,7 +3164,7 @@
                 <w:sz w:val="20"/>
                 <w:szCs w:val="20"/>
               </w:rPr>
-              <w:t>2.2</w:t>
+              <w:t>2.3</w:t>
             </w:r>
           </w:p>
         </w:tc>
@@ -3114,13 +3187,15 @@
             <w:vAlign w:val="center"/>
           </w:tcPr>
           <w:p>
-            <w:pPr/>
-            <w:r>
-              <w:rPr>
-                <w:sz w:val="20"/>
-                <w:szCs w:val="20"/>
-              </w:rPr>
-              <w:t>Herramientas eléctricas y neumáticas: cable de alimentación sin empalmes ni parches, enchufe en buen estado (sin pines doblados), guardas de protección instaladas y funcionales. Verificar conexión a tierra cuando aplique.</w:t>
+            <w:pPr>
+              <w:spacing w:before="0" w:after="40"/>
+            </w:pPr>
+            <w:r>
+              <w:rPr>
+                <w:sz w:val="20"/>
+                <w:szCs w:val="20"/>
+              </w:rPr>
+              <w:t>TIEMPO LÍMITE: Una vez emitido y firmado el permiso en dispensario, el trabajador o equipo contratista tiene un máximo de 20 minutos para presentarse en el área de trabajo con el Técnico de E&amp;S asignado. Pasado ese tiempo sin presentación, el técnico continuará con otras actividades y la atención del permiso quedará postergada hasta disponibilidad. El contratista deberá gestionar una nueva cita con E&amp;S.</w:t>
             </w:r>
           </w:p>
         </w:tc>
@@ -3145,6 +3220,7 @@
           <w:p>
             <w:pPr>
               <w:jc w:val="center"/>
+              <w:spacing w:before="0" w:after="40"/>
             </w:pPr>
             <w:r>
               <w:rPr>
@@ -3176,6 +3252,7 @@
           <w:p>
             <w:pPr>
               <w:jc w:val="center"/>
+              <w:spacing w:before="0" w:after="40"/>
             </w:pPr>
             <w:r>
               <w:rPr>
@@ -3212,6 +3289,7 @@
           <w:p>
             <w:pPr>
               <w:jc w:val="center"/>
+              <w:spacing w:before="0" w:after="40"/>
             </w:pPr>
             <w:r>
               <w:rPr>
@@ -3219,7 +3297,7 @@
                 <w:sz w:val="20"/>
                 <w:szCs w:val="20"/>
               </w:rPr>
-              <w:t>2.3</w:t>
+              <w:t>2.4</w:t>
             </w:r>
           </w:p>
         </w:tc>
@@ -3242,13 +3320,15 @@
             <w:vAlign w:val="center"/>
           </w:tcPr>
           <w:p>
-            <w:pPr/>
-            <w:r>
-              <w:rPr>
-                <w:sz w:val="20"/>
-                <w:szCs w:val="20"/>
-              </w:rPr>
-              <w:t>Equipos de izaje (grúas, eslingas, tecles, polipastos): verificar certificado de inspección vigente + capacidad de carga visible + eslingas sin cortes ni deformaciones + operador con certificación habilitante.</w:t>
+            <w:pPr>
+              <w:spacing w:before="0" w:after="40"/>
+            </w:pPr>
+            <w:r>
+              <w:rPr>
+                <w:sz w:val="20"/>
+                <w:szCs w:val="20"/>
+              </w:rPr>
+              <w:t>Si la enfermera determina que el trabajador no está en condiciones físicas para ejecutar el TAR (signos vitales fuera de rango, fatiga evidente, sospecha de consumo de alcohol o sustancias), notifica a E&amp;S y el permiso no es emitido. El trabajador deberá retirarse del área hasta nueva evaluación.</w:t>
             </w:r>
           </w:p>
         </w:tc>
@@ -3273,13 +3353,14 @@
           <w:p>
             <w:pPr>
               <w:jc w:val="center"/>
-            </w:pPr>
-            <w:r>
-              <w:rPr>
-                <w:sz w:val="20"/>
-                <w:szCs w:val="20"/>
-              </w:rPr>
-              <w:t>Equipo de E&amp;S</w:t>
+              <w:spacing w:before="0" w:after="40"/>
+            </w:pPr>
+            <w:r>
+              <w:rPr>
+                <w:sz w:val="20"/>
+                <w:szCs w:val="20"/>
+              </w:rPr>
+              <w:t>Enfermera / Dispensario</w:t>
             </w:r>
           </w:p>
         </w:tc>
@@ -3304,13 +3385,14 @@
           <w:p>
             <w:pPr>
               <w:jc w:val="center"/>
-            </w:pPr>
-            <w:r>
-              <w:rPr>
-                <w:sz w:val="20"/>
-                <w:szCs w:val="20"/>
-              </w:rPr>
-              <w:t>Gerencia de Planta</w:t>
+              <w:spacing w:before="0" w:after="40"/>
+            </w:pPr>
+            <w:r>
+              <w:rPr>
+                <w:sz w:val="20"/>
+                <w:szCs w:val="20"/>
+              </w:rPr>
+              <w:t>Equipo de E&amp;S / Área Solicitante</w:t>
             </w:r>
           </w:p>
         </w:tc>
@@ -3339,7 +3421,32 @@
           </w:tcPr>
           <w:p>
             <w:pPr>
-              <w:jc w:val="center"/>
+              <w:spacing w:before="0" w:after="40"/>
+            </w:pPr>
+          </w:p>
+        </w:tc>
+        <w:tc>
+          <w:tcPr>
+            <w:tcW w:w="5888" w:type="dxa"/>
+            <w:tcBorders>
+              <w:top w:val="single" w:sz="4" w:space="0" w:color="000000"/>
+              <w:left w:val="single" w:sz="4" w:space="0" w:color="000000"/>
+              <w:bottom w:val="single" w:sz="4" w:space="0" w:color="000000"/>
+              <w:right w:val="single" w:sz="4" w:space="0" w:color="000000"/>
+            </w:tcBorders>
+            <w:shd w:val="clear" w:color="auto" w:fill="D9D9D9"/>
+            <w:tcMar>
+              <w:top w:w="70" w:type="dxa"/>
+              <w:left w:w="100" w:type="dxa"/>
+              <w:bottom w:w="70" w:type="dxa"/>
+              <w:right w:w="100" w:type="dxa"/>
+            </w:tcMar>
+            <w:vAlign w:val="center"/>
+          </w:tcPr>
+          <w:p>
+            <w:pPr>
+              <w:jc w:val="center"/>
+              <w:spacing w:before="0" w:after="40"/>
             </w:pPr>
             <w:r>
               <w:rPr>
@@ -3347,36 +3454,7 @@
                 <w:sz w:val="20"/>
                 <w:szCs w:val="20"/>
               </w:rPr>
-              <w:t>2.4</w:t>
-            </w:r>
-          </w:p>
-        </w:tc>
-        <w:tc>
-          <w:tcPr>
-            <w:tcW w:w="5888" w:type="dxa"/>
-            <w:tcBorders>
-              <w:top w:val="single" w:sz="4" w:space="0" w:color="000000"/>
-              <w:left w:val="single" w:sz="4" w:space="0" w:color="000000"/>
-              <w:bottom w:val="single" w:sz="4" w:space="0" w:color="000000"/>
-              <w:right w:val="single" w:sz="4" w:space="0" w:color="000000"/>
-            </w:tcBorders>
-            <w:shd w:val="clear" w:color="auto" w:fill="D9D9D9"/>
-            <w:tcMar>
-              <w:top w:w="70" w:type="dxa"/>
-              <w:left w:w="100" w:type="dxa"/>
-              <w:bottom w:w="70" w:type="dxa"/>
-              <w:right w:w="100" w:type="dxa"/>
-            </w:tcMar>
-            <w:vAlign w:val="center"/>
-          </w:tcPr>
-          <w:p>
-            <w:pPr/>
-            <w:r>
-              <w:rPr>
-                <w:sz w:val="20"/>
-                <w:szCs w:val="20"/>
-              </w:rPr>
-              <w:t>Andamios y escaleras: inspección visual previa a cada uso (pernos, plataformas, barandas, patas niveladoras). Andamios deben tener tag de habilitación verde visible emitido por E&amp;S antes de su primer uso.</w:t>
+              <w:t>FASE 3: ART Y PERMISO DE TRABAJO EN SITIO</w:t>
             </w:r>
           </w:p>
         </w:tc>
@@ -3400,15 +3478,8 @@
           </w:tcPr>
           <w:p>
             <w:pPr>
-              <w:jc w:val="center"/>
-            </w:pPr>
-            <w:r>
-              <w:rPr>
-                <w:sz w:val="20"/>
-                <w:szCs w:val="20"/>
-              </w:rPr>
-              <w:t>Equipo de E&amp;S</w:t>
-            </w:r>
+              <w:spacing w:before="0" w:after="40"/>
+            </w:pPr>
           </w:p>
         </w:tc>
         <w:tc>
@@ -3431,15 +3502,8 @@
           </w:tcPr>
           <w:p>
             <w:pPr>
-              <w:jc w:val="center"/>
-            </w:pPr>
-            <w:r>
-              <w:rPr>
-                <w:sz w:val="20"/>
-                <w:szCs w:val="20"/>
-              </w:rPr>
-              <w:t>Supervisor de Área</w:t>
-            </w:r>
+              <w:spacing w:before="0" w:after="40"/>
+            </w:pPr>
           </w:p>
         </w:tc>
       </w:tr>
@@ -3468,6 +3532,7 @@
           <w:p>
             <w:pPr>
               <w:jc w:val="center"/>
+              <w:spacing w:before="0" w:after="40"/>
             </w:pPr>
             <w:r>
               <w:rPr>
@@ -3475,7 +3540,7 @@
                 <w:sz w:val="20"/>
                 <w:szCs w:val="20"/>
               </w:rPr>
-              <w:t>2.5</w:t>
+              <w:t>3.1</w:t>
             </w:r>
           </w:p>
         </w:tc>
@@ -3498,13 +3563,15 @@
             <w:vAlign w:val="center"/>
           </w:tcPr>
           <w:p>
-            <w:pPr/>
-            <w:r>
-              <w:rPr>
-                <w:sz w:val="20"/>
-                <w:szCs w:val="20"/>
-              </w:rPr>
-              <w:t>Equipos de corte y soldadura oxiacetilénica: manómetros con calibración vigente, mangueras sin deterioro ni fugas, válvulas antirretorno instaladas en ambos reguladores, cilindros asegurados verticalmente.</w:t>
+            <w:pPr>
+              <w:spacing w:before="0" w:after="40"/>
+            </w:pPr>
+            <w:r>
+              <w:rPr>
+                <w:sz w:val="20"/>
+                <w:szCs w:val="20"/>
+              </w:rPr>
+              <w:t>Al llegar al área de trabajo, el supervisor del contratista lidera el ART con todo el equipo participante. El ART desglosa la actividad paso a paso e identifica para cada paso: peligro específico, riesgo asociado y medida de control a aplicar. Ejemplo para trabajo en caliente: Paso 'encendido del soplete' → Peligro 'chispa / llama' → Riesgo 'incendio' → Control 'extintor PQS 6 kg a ≤10 m + careta soldador + delantal cuero + vigía de fuego'. El ART es firmado por todos los participantes y queda físicamente en el área durante la ejecución.</w:t>
             </w:r>
           </w:p>
         </w:tc>
@@ -3529,6 +3596,7 @@
           <w:p>
             <w:pPr>
               <w:jc w:val="center"/>
+              <w:spacing w:before="0" w:after="40"/>
             </w:pPr>
             <w:r>
               <w:rPr>
@@ -3560,6 +3628,7 @@
           <w:p>
             <w:pPr>
               <w:jc w:val="center"/>
+              <w:spacing w:before="0" w:after="40"/>
             </w:pPr>
             <w:r>
               <w:rPr>
@@ -3594,7 +3663,18 @@
             <w:vAlign w:val="center"/>
           </w:tcPr>
           <w:p>
-            <w:pPr/>
+            <w:pPr>
+              <w:jc w:val="center"/>
+              <w:spacing w:before="0" w:after="40"/>
+            </w:pPr>
+            <w:r>
+              <w:rPr>
+                <w:b/>
+                <w:sz w:val="20"/>
+                <w:szCs w:val="20"/>
+              </w:rPr>
+              <w:t>3.2</w:t>
+            </w:r>
           </w:p>
         </w:tc>
         <w:tc>
@@ -3617,15 +3697,14 @@
           </w:tcPr>
           <w:p>
             <w:pPr>
-              <w:jc w:val="center"/>
-            </w:pPr>
-            <w:r>
-              <w:rPr>
-                <w:b/>
-                <w:sz w:val="20"/>
-                <w:szCs w:val="20"/>
-              </w:rPr>
-              <w:t>FASE 3: CONDICIONES GENERALES DE SEGURIDAD EN SITIO</w:t>
+              <w:spacing w:before="0" w:after="40"/>
+            </w:pPr>
+            <w:r>
+              <w:rPr>
+                <w:sz w:val="20"/>
+                <w:szCs w:val="20"/>
+              </w:rPr>
+              <w:t>El Técnico de E&amp;S revisa el ART, verifica que las medidas de control estén disponibles en sitio y firma el permiso de trabajo. Sin la firma de E&amp;S el trabajo no puede iniciarse. El permiso es válido solo para la jornada y área indicadas; si el trabajo se extiende a otro día, se emite un nuevo permiso.</w:t>
             </w:r>
           </w:p>
         </w:tc>
@@ -3648,7 +3727,17 @@
             <w:vAlign w:val="center"/>
           </w:tcPr>
           <w:p>
-            <w:pPr/>
+            <w:pPr>
+              <w:jc w:val="center"/>
+              <w:spacing w:before="0" w:after="40"/>
+            </w:pPr>
+            <w:r>
+              <w:rPr>
+                <w:sz w:val="20"/>
+                <w:szCs w:val="20"/>
+              </w:rPr>
+              <w:t>Equipo de E&amp;S</w:t>
+            </w:r>
           </w:p>
         </w:tc>
         <w:tc>
@@ -3670,7 +3759,17 @@
             <w:vAlign w:val="center"/>
           </w:tcPr>
           <w:p>
-            <w:pPr/>
+            <w:pPr>
+              <w:jc w:val="center"/>
+              <w:spacing w:before="0" w:after="40"/>
+            </w:pPr>
+            <w:r>
+              <w:rPr>
+                <w:sz w:val="20"/>
+                <w:szCs w:val="20"/>
+              </w:rPr>
+              <w:t>Área Solicitante</w:t>
+            </w:r>
           </w:p>
         </w:tc>
       </w:tr>
@@ -3699,6 +3798,7 @@
           <w:p>
             <w:pPr>
               <w:jc w:val="center"/>
+              <w:spacing w:before="0" w:after="40"/>
             </w:pPr>
             <w:r>
               <w:rPr>
@@ -3706,7 +3806,7 @@
                 <w:sz w:val="20"/>
                 <w:szCs w:val="20"/>
               </w:rPr>
-              <w:t>3.1</w:t>
+              <w:t>3.3</w:t>
             </w:r>
           </w:p>
         </w:tc>
@@ -3729,13 +3829,15 @@
             <w:vAlign w:val="center"/>
           </w:tcPr>
           <w:p>
-            <w:pPr/>
-            <w:r>
-              <w:rPr>
-                <w:sz w:val="20"/>
-                <w:szCs w:val="20"/>
-              </w:rPr>
-              <w:t>Delimitar el área de trabajo con cinta de seguridad (amarilla/negra para precaución, roja/blanca para peligro) o barreras físicas antes de iniciar cualquier actividad. El área debe quedar claramente diferenciada del tránsito de personas y vehículos.</w:t>
+            <w:pPr>
+              <w:spacing w:before="0" w:after="40"/>
+            </w:pPr>
+            <w:r>
+              <w:rPr>
+                <w:sz w:val="20"/>
+                <w:szCs w:val="20"/>
+              </w:rPr>
+              <w:t>Permisos por tipo de Trabajo de Alto Riesgo y controles mínimos requeridos en sitio: (a) Caliente: extintor PQS ≥6 kg a ≤10 m, vigía de fuego, eliminar inflamables en radio 10 m, revisión post-trabajo a los 30 min. (b) Eléctrico/LOTO: candado y tarjeta por cada trabajador, verificación de ausencia de tensión, señalización eléctrica. (c) Altura: arnés + línea de vida, punto de anclaje verificado, plan de rescate. (d) Espacio Confinado: medición de gases (O₂ 19,5%-23,5%, CO &lt;25 ppm, H₂S &lt;10 ppm, LEL &lt;10%), vigía exterior, equipo de rescate. (e) Excavación: entibado o talud definido, barrera perimetral, señalización. (f) Izaje: certificado del equipo, eslinga sin daños, carga &lt;80% de capacidad nominal, operador habilitado.</w:t>
             </w:r>
           </w:p>
         </w:tc>
@@ -3760,13 +3862,14 @@
           <w:p>
             <w:pPr>
               <w:jc w:val="center"/>
-            </w:pPr>
-            <w:r>
-              <w:rPr>
-                <w:sz w:val="20"/>
-                <w:szCs w:val="20"/>
-              </w:rPr>
-              <w:t>Supervisor Contratista</w:t>
+              <w:spacing w:before="0" w:after="40"/>
+            </w:pPr>
+            <w:r>
+              <w:rPr>
+                <w:sz w:val="20"/>
+                <w:szCs w:val="20"/>
+              </w:rPr>
+              <w:t>Equipo de E&amp;S / Supervisor Contratista</w:t>
             </w:r>
           </w:p>
         </w:tc>
@@ -3791,13 +3894,14 @@
           <w:p>
             <w:pPr>
               <w:jc w:val="center"/>
-            </w:pPr>
-            <w:r>
-              <w:rPr>
-                <w:sz w:val="20"/>
-                <w:szCs w:val="20"/>
-              </w:rPr>
-              <w:t>Supervisor de Área</w:t>
+              <w:spacing w:before="0" w:after="40"/>
+            </w:pPr>
+            <w:r>
+              <w:rPr>
+                <w:sz w:val="20"/>
+                <w:szCs w:val="20"/>
+              </w:rPr>
+              <w:t>Área Solicitante</w:t>
             </w:r>
           </w:p>
         </w:tc>
@@ -3826,7 +3930,32 @@
           </w:tcPr>
           <w:p>
             <w:pPr>
-              <w:jc w:val="center"/>
+              <w:spacing w:before="0" w:after="40"/>
+            </w:pPr>
+          </w:p>
+        </w:tc>
+        <w:tc>
+          <w:tcPr>
+            <w:tcW w:w="5888" w:type="dxa"/>
+            <w:tcBorders>
+              <w:top w:val="single" w:sz="4" w:space="0" w:color="000000"/>
+              <w:left w:val="single" w:sz="4" w:space="0" w:color="000000"/>
+              <w:bottom w:val="single" w:sz="4" w:space="0" w:color="000000"/>
+              <w:right w:val="single" w:sz="4" w:space="0" w:color="000000"/>
+            </w:tcBorders>
+            <w:shd w:val="clear" w:color="auto" w:fill="D9D9D9"/>
+            <w:tcMar>
+              <w:top w:w="70" w:type="dxa"/>
+              <w:left w:w="100" w:type="dxa"/>
+              <w:bottom w:w="70" w:type="dxa"/>
+              <w:right w:w="100" w:type="dxa"/>
+            </w:tcMar>
+            <w:vAlign w:val="center"/>
+          </w:tcPr>
+          <w:p>
+            <w:pPr>
+              <w:jc w:val="center"/>
+              <w:spacing w:before="0" w:after="40"/>
             </w:pPr>
             <w:r>
               <w:rPr>
@@ -3834,36 +3963,7 @@
                 <w:sz w:val="20"/>
                 <w:szCs w:val="20"/>
               </w:rPr>
-              <w:t>3.2</w:t>
-            </w:r>
-          </w:p>
-        </w:tc>
-        <w:tc>
-          <w:tcPr>
-            <w:tcW w:w="5888" w:type="dxa"/>
-            <w:tcBorders>
-              <w:top w:val="single" w:sz="4" w:space="0" w:color="000000"/>
-              <w:left w:val="single" w:sz="4" w:space="0" w:color="000000"/>
-              <w:bottom w:val="single" w:sz="4" w:space="0" w:color="000000"/>
-              <w:right w:val="single" w:sz="4" w:space="0" w:color="000000"/>
-            </w:tcBorders>
-            <w:shd w:val="clear" w:color="auto" w:fill="D9D9D9"/>
-            <w:tcMar>
-              <w:top w:w="70" w:type="dxa"/>
-              <w:left w:w="100" w:type="dxa"/>
-              <w:bottom w:w="70" w:type="dxa"/>
-              <w:right w:w="100" w:type="dxa"/>
-            </w:tcMar>
-            <w:vAlign w:val="center"/>
-          </w:tcPr>
-          <w:p>
-            <w:pPr/>
-            <w:r>
-              <w:rPr>
-                <w:sz w:val="20"/>
-                <w:szCs w:val="20"/>
-              </w:rPr>
-              <w:t>Instalar señalización adecuada en el perímetro: señales de advertencia del riesgo específico (caída de objetos, riesgo eléctrico, trabajos en altura, etc.), señales de obligación de EPP y señales de prohibición según aplique.</w:t>
+              <w:t>FASE 4: SEÑALIZACIÓN, DISPOSITIVOS DE SEGURIDAD Y PROCEDIMIENTOS DE TRABAJO</w:t>
             </w:r>
           </w:p>
         </w:tc>
@@ -3887,15 +3987,8 @@
           </w:tcPr>
           <w:p>
             <w:pPr>
-              <w:jc w:val="center"/>
-            </w:pPr>
-            <w:r>
-              <w:rPr>
-                <w:sz w:val="20"/>
-                <w:szCs w:val="20"/>
-              </w:rPr>
-              <w:t>Supervisor Contratista</w:t>
-            </w:r>
+              <w:spacing w:before="0" w:after="40"/>
+            </w:pPr>
           </w:p>
         </w:tc>
         <w:tc>
@@ -3918,15 +4011,8 @@
           </w:tcPr>
           <w:p>
             <w:pPr>
-              <w:jc w:val="center"/>
-            </w:pPr>
-            <w:r>
-              <w:rPr>
-                <w:sz w:val="20"/>
-                <w:szCs w:val="20"/>
-              </w:rPr>
-              <w:t>Equipo de E&amp;S</w:t>
-            </w:r>
+              <w:spacing w:before="0" w:after="40"/>
+            </w:pPr>
           </w:p>
         </w:tc>
       </w:tr>
@@ -3955,6 +4041,7 @@
           <w:p>
             <w:pPr>
               <w:jc w:val="center"/>
+              <w:spacing w:before="0" w:after="40"/>
             </w:pPr>
             <w:r>
               <w:rPr>
@@ -3962,7 +4049,7 @@
                 <w:sz w:val="20"/>
                 <w:szCs w:val="20"/>
               </w:rPr>
-              <w:t>3.3</w:t>
+              <w:t>4.1</w:t>
             </w:r>
           </w:p>
         </w:tc>
@@ -3985,13 +4072,15 @@
             <w:vAlign w:val="center"/>
           </w:tcPr>
           <w:p>
-            <w:pPr/>
-            <w:r>
-              <w:rPr>
-                <w:sz w:val="20"/>
-                <w:szCs w:val="20"/>
-              </w:rPr>
-              <w:t>Mantener orden y limpieza permanente: pasillos y vías de evacuación libres de materiales, herramientas y equipos almacenados en zonas designadas, residuos en contenedores identificados, cables y mangueras sin cruzar pasillos sin protección.</w:t>
+            <w:pPr>
+              <w:spacing w:before="0" w:after="40"/>
+            </w:pPr>
+            <w:r>
+              <w:rPr>
+                <w:sz w:val="20"/>
+                <w:szCs w:val="20"/>
+              </w:rPr>
+              <w:t>Antes de iniciar, el contratista instala la señalización del área de trabajo: cinta amarilla/negra (precaución) o roja/blanca (peligro/prohibido paso) según el nivel de riesgo. Se colocan señales de advertencia del riesgo específico, obligación de EPP y prohibición según aplique. La señalización delimita claramente el área de terceros y del tránsito de personas y vehículos.</w:t>
             </w:r>
           </w:p>
         </w:tc>
@@ -4016,6 +4105,7 @@
           <w:p>
             <w:pPr>
               <w:jc w:val="center"/>
+              <w:spacing w:before="0" w:after="40"/>
             </w:pPr>
             <w:r>
               <w:rPr>
@@ -4047,13 +4137,14 @@
           <w:p>
             <w:pPr>
               <w:jc w:val="center"/>
-            </w:pPr>
-            <w:r>
-              <w:rPr>
-                <w:sz w:val="20"/>
-                <w:szCs w:val="20"/>
-              </w:rPr>
-              <w:t>Supervisor de Área</w:t>
+              <w:spacing w:before="0" w:after="40"/>
+            </w:pPr>
+            <w:r>
+              <w:rPr>
+                <w:sz w:val="20"/>
+                <w:szCs w:val="20"/>
+              </w:rPr>
+              <w:t>Equipo de E&amp;S</w:t>
             </w:r>
           </w:p>
         </w:tc>
@@ -4083,6 +4174,7 @@
           <w:p>
             <w:pPr>
               <w:jc w:val="center"/>
+              <w:spacing w:before="0" w:after="40"/>
             </w:pPr>
             <w:r>
               <w:rPr>
@@ -4090,7 +4182,7 @@
                 <w:sz w:val="20"/>
                 <w:szCs w:val="20"/>
               </w:rPr>
-              <w:t>3.4</w:t>
+              <w:t>4.2</w:t>
             </w:r>
           </w:p>
         </w:tc>
@@ -4113,13 +4205,15 @@
             <w:vAlign w:val="center"/>
           </w:tcPr>
           <w:p>
-            <w:pPr/>
-            <w:r>
-              <w:rPr>
-                <w:sz w:val="20"/>
-                <w:szCs w:val="20"/>
-              </w:rPr>
-              <w:t>Para todo trabajo en caliente: disponer extintor portátil de PQS (mínimo 6 kg) a no más de 10 m del punto de trabajo + vigía de fuego durante la ejecución + revisión del área 30 minutos después de finalizado el trabajo.</w:t>
+            <w:pPr>
+              <w:spacing w:before="0" w:after="40"/>
+            </w:pPr>
+            <w:r>
+              <w:rPr>
+                <w:sz w:val="20"/>
+                <w:szCs w:val="20"/>
+              </w:rPr>
+              <w:t>Verificar que todos los dispositivos de seguridad relevantes estén operativos antes de iniciar: guardas de maquinaria instaladas y fijas, barreras físicas colocadas, detectores de gases calibrados y encendidos (EC), sistemas de bloqueo activos (LOTO), válvulas de alivio operativas (equipos a presión), interruptores de emergencia accesibles y sin obstáculos.</w:t>
             </w:r>
           </w:p>
         </w:tc>
@@ -4144,13 +4238,14 @@
           <w:p>
             <w:pPr>
               <w:jc w:val="center"/>
-            </w:pPr>
-            <w:r>
-              <w:rPr>
-                <w:sz w:val="20"/>
-                <w:szCs w:val="20"/>
-              </w:rPr>
-              <w:t>Supervisor Contratista</w:t>
+              <w:spacing w:before="0" w:after="40"/>
+            </w:pPr>
+            <w:r>
+              <w:rPr>
+                <w:sz w:val="20"/>
+                <w:szCs w:val="20"/>
+              </w:rPr>
+              <w:t>Supervisor Contratista / Equipo de E&amp;S</w:t>
             </w:r>
           </w:p>
         </w:tc>
@@ -4175,13 +4270,14 @@
           <w:p>
             <w:pPr>
               <w:jc w:val="center"/>
-            </w:pPr>
-            <w:r>
-              <w:rPr>
-                <w:sz w:val="20"/>
-                <w:szCs w:val="20"/>
-              </w:rPr>
-              <w:t>Equipo de E&amp;S</w:t>
+              <w:spacing w:before="0" w:after="40"/>
+            </w:pPr>
+            <w:r>
+              <w:rPr>
+                <w:sz w:val="20"/>
+                <w:szCs w:val="20"/>
+              </w:rPr>
+              <w:t>Área Solicitante</w:t>
             </w:r>
           </w:p>
         </w:tc>
@@ -4211,6 +4307,7 @@
           <w:p>
             <w:pPr>
               <w:jc w:val="center"/>
+              <w:spacing w:before="0" w:after="40"/>
             </w:pPr>
             <w:r>
               <w:rPr>
@@ -4218,7 +4315,7 @@
                 <w:sz w:val="20"/>
                 <w:szCs w:val="20"/>
               </w:rPr>
-              <w:t>3.5</w:t>
+              <w:t>4.3</w:t>
             </w:r>
           </w:p>
         </w:tc>
@@ -4241,13 +4338,15 @@
             <w:vAlign w:val="center"/>
           </w:tcPr>
           <w:p>
-            <w:pPr/>
-            <w:r>
-              <w:rPr>
-                <w:sz w:val="20"/>
-                <w:szCs w:val="20"/>
-              </w:rPr>
-              <w:t>Mantener botiquín de primeros auxilios accesible en el área de trabajo (no en bodega cerrada). Todos los trabajadores deben conocer su ubicación y la del punto de encuentro más cercano.</w:t>
+            <w:pPr>
+              <w:spacing w:before="0" w:after="40"/>
+            </w:pPr>
+            <w:r>
+              <w:rPr>
+                <w:sz w:val="20"/>
+                <w:szCs w:val="20"/>
+              </w:rPr>
+              <w:t>El supervisor del contratista explica al equipo el procedimiento de trabajo seguro paso a paso (basado en el IPERC y el ART): secuencia de operaciones, EPP específico por etapa, puntos críticos de control y señales de parada. Ningún trabajador inicia una etapa sin entender el paso que le corresponde.</w:t>
             </w:r>
           </w:p>
         </w:tc>
@@ -4272,6 +4371,7 @@
           <w:p>
             <w:pPr>
               <w:jc w:val="center"/>
+              <w:spacing w:before="0" w:after="40"/>
             </w:pPr>
             <w:r>
               <w:rPr>
@@ -4303,6 +4403,7 @@
           <w:p>
             <w:pPr>
               <w:jc w:val="center"/>
+              <w:spacing w:before="0" w:after="40"/>
             </w:pPr>
             <w:r>
               <w:rPr>
@@ -4337,7 +4438,18 @@
             <w:vAlign w:val="center"/>
           </w:tcPr>
           <w:p>
-            <w:pPr/>
+            <w:pPr>
+              <w:jc w:val="center"/>
+              <w:spacing w:before="0" w:after="40"/>
+            </w:pPr>
+            <w:r>
+              <w:rPr>
+                <w:b/>
+                <w:sz w:val="20"/>
+                <w:szCs w:val="20"/>
+              </w:rPr>
+              <w:t>4.4</w:t>
+            </w:r>
           </w:p>
         </w:tc>
         <w:tc>
@@ -4360,15 +4472,14 @@
           </w:tcPr>
           <w:p>
             <w:pPr>
-              <w:jc w:val="center"/>
-            </w:pPr>
-            <w:r>
-              <w:rPr>
-                <w:b/>
-                <w:sz w:val="20"/>
-                <w:szCs w:val="20"/>
-              </w:rPr>
-              <w:t>FASE 4: ÁREA SOLICITANTE — COORDINACIÓN PREVIA AL INICIO</w:t>
+              <w:spacing w:before="0" w:after="40"/>
+            </w:pPr>
+            <w:r>
+              <w:rPr>
+                <w:sz w:val="20"/>
+                <w:szCs w:val="20"/>
+              </w:rPr>
+              <w:t>Uso correcto de extintores portátiles: identificar el tipo correcto (PQS para fuegos A/B/C; CO₂ para equipos eléctricos; nunca agua en fuegos eléctricos). Técnica PASS: Jalar el pasador de seguridad → Apuntar la boquilla a la BASE de las llamas → presionar la Palanca → Barrer de lado a lado. Rango efectivo: 2-3 metros. Si el fuego no se controla en 30 segundos, evacuar y llamar a emergencias.</w:t>
             </w:r>
           </w:p>
         </w:tc>
@@ -4391,7 +4502,17 @@
             <w:vAlign w:val="center"/>
           </w:tcPr>
           <w:p>
-            <w:pPr/>
+            <w:pPr>
+              <w:jc w:val="center"/>
+              <w:spacing w:before="0" w:after="40"/>
+            </w:pPr>
+            <w:r>
+              <w:rPr>
+                <w:sz w:val="20"/>
+                <w:szCs w:val="20"/>
+              </w:rPr>
+              <w:t>Supervisor Contratista</w:t>
+            </w:r>
           </w:p>
         </w:tc>
         <w:tc>
@@ -4413,7 +4534,17 @@
             <w:vAlign w:val="center"/>
           </w:tcPr>
           <w:p>
-            <w:pPr/>
+            <w:pPr>
+              <w:jc w:val="center"/>
+              <w:spacing w:before="0" w:after="40"/>
+            </w:pPr>
+            <w:r>
+              <w:rPr>
+                <w:sz w:val="20"/>
+                <w:szCs w:val="20"/>
+              </w:rPr>
+              <w:t>Equipo de E&amp;S</w:t>
+            </w:r>
           </w:p>
         </w:tc>
       </w:tr>
@@ -4442,6 +4573,7 @@
           <w:p>
             <w:pPr>
               <w:jc w:val="center"/>
+              <w:spacing w:before="0" w:after="40"/>
             </w:pPr>
             <w:r>
               <w:rPr>
@@ -4449,7 +4581,7 @@
                 <w:sz w:val="20"/>
                 <w:szCs w:val="20"/>
               </w:rPr>
-              <w:t>4.1</w:t>
+              <w:t>4.5</w:t>
             </w:r>
           </w:p>
         </w:tc>
@@ -4472,13 +4604,15 @@
             <w:vAlign w:val="center"/>
           </w:tcPr>
           <w:p>
-            <w:pPr/>
-            <w:r>
-              <w:rPr>
-                <w:sz w:val="20"/>
-                <w:szCs w:val="20"/>
-              </w:rPr>
-              <w:t>El Área Solicitante (jefe o supervisor de la dependencia de Plantabal que requiere el trabajo) debe definir por escrito el alcance completo de la actividad a contratar: descripción de la tarea, ubicación exacta, materiales, equipos involucrados y plazo estimado. Esto se entrega al contratista antes del inicio.</w:t>
+            <w:pPr>
+              <w:spacing w:before="0" w:after="40"/>
+            </w:pPr>
+            <w:r>
+              <w:rPr>
+                <w:sz w:val="20"/>
+                <w:szCs w:val="20"/>
+              </w:rPr>
+              <w:t>El contratista verifica la ubicación y accesibilidad del botiquín de primeros auxilios y del punto de encuentro de emergencia más cercano. Todos los trabajadores deben conocer el número de emergencias interno de Plantabal y el protocolo de notificación de incidentes.</w:t>
             </w:r>
           </w:p>
         </w:tc>
@@ -4503,13 +4637,14 @@
           <w:p>
             <w:pPr>
               <w:jc w:val="center"/>
-            </w:pPr>
-            <w:r>
-              <w:rPr>
-                <w:sz w:val="20"/>
-                <w:szCs w:val="20"/>
-              </w:rPr>
-              <w:t>Área Solicitante</w:t>
+              <w:spacing w:before="0" w:after="40"/>
+            </w:pPr>
+            <w:r>
+              <w:rPr>
+                <w:sz w:val="20"/>
+                <w:szCs w:val="20"/>
+              </w:rPr>
+              <w:t>Supervisor Contratista</w:t>
             </w:r>
           </w:p>
         </w:tc>
@@ -4534,6 +4669,7 @@
           <w:p>
             <w:pPr>
               <w:jc w:val="center"/>
+              <w:spacing w:before="0" w:after="40"/>
             </w:pPr>
             <w:r>
               <w:rPr>
@@ -4569,7 +4705,32 @@
           </w:tcPr>
           <w:p>
             <w:pPr>
-              <w:jc w:val="center"/>
+              <w:spacing w:before="0" w:after="40"/>
+            </w:pPr>
+          </w:p>
+        </w:tc>
+        <w:tc>
+          <w:tcPr>
+            <w:tcW w:w="5888" w:type="dxa"/>
+            <w:tcBorders>
+              <w:top w:val="single" w:sz="4" w:space="0" w:color="000000"/>
+              <w:left w:val="single" w:sz="4" w:space="0" w:color="000000"/>
+              <w:bottom w:val="single" w:sz="4" w:space="0" w:color="000000"/>
+              <w:right w:val="single" w:sz="4" w:space="0" w:color="000000"/>
+            </w:tcBorders>
+            <w:shd w:val="clear" w:color="auto" w:fill="D9D9D9"/>
+            <w:tcMar>
+              <w:top w:w="70" w:type="dxa"/>
+              <w:left w:w="100" w:type="dxa"/>
+              <w:bottom w:w="70" w:type="dxa"/>
+              <w:right w:w="100" w:type="dxa"/>
+            </w:tcMar>
+            <w:vAlign w:val="center"/>
+          </w:tcPr>
+          <w:p>
+            <w:pPr>
+              <w:jc w:val="center"/>
+              <w:spacing w:before="0" w:after="40"/>
             </w:pPr>
             <w:r>
               <w:rPr>
@@ -4577,36 +4738,7 @@
                 <w:sz w:val="20"/>
                 <w:szCs w:val="20"/>
               </w:rPr>
-              <w:t>4.2</w:t>
-            </w:r>
-          </w:p>
-        </w:tc>
-        <w:tc>
-          <w:tcPr>
-            <w:tcW w:w="5888" w:type="dxa"/>
-            <w:tcBorders>
-              <w:top w:val="single" w:sz="4" w:space="0" w:color="000000"/>
-              <w:left w:val="single" w:sz="4" w:space="0" w:color="000000"/>
-              <w:bottom w:val="single" w:sz="4" w:space="0" w:color="000000"/>
-              <w:right w:val="single" w:sz="4" w:space="0" w:color="000000"/>
-            </w:tcBorders>
-            <w:shd w:val="clear" w:color="auto" w:fill="D9D9D9"/>
-            <w:tcMar>
-              <w:top w:w="70" w:type="dxa"/>
-              <w:left w:w="100" w:type="dxa"/>
-              <w:bottom w:w="70" w:type="dxa"/>
-              <w:right w:w="100" w:type="dxa"/>
-            </w:tcMar>
-            <w:vAlign w:val="center"/>
-          </w:tcPr>
-          <w:p>
-            <w:pPr/>
-            <w:r>
-              <w:rPr>
-                <w:sz w:val="20"/>
-                <w:szCs w:val="20"/>
-              </w:rPr>
-              <w:t>El Área Solicitante coordina con el Equipo de E&amp;S la visita previa al área de trabajo (inspección conjunta) para identificar riesgos específicos del entorno, fuentes de energía a bloquear, interferencias con otros trabajos en curso y condiciones ambientales relevantes.</w:t>
+              <w:t>FASE 5: EJECUCIÓN DEL TRABAJO Y CONDICIONES EN SITIO</w:t>
             </w:r>
           </w:p>
         </w:tc>
@@ -4630,15 +4762,8 @@
           </w:tcPr>
           <w:p>
             <w:pPr>
-              <w:jc w:val="center"/>
-            </w:pPr>
-            <w:r>
-              <w:rPr>
-                <w:sz w:val="20"/>
-                <w:szCs w:val="20"/>
-              </w:rPr>
-              <w:t>Área Solicitante / Equipo de E&amp;S</w:t>
-            </w:r>
+              <w:spacing w:before="0" w:after="40"/>
+            </w:pPr>
           </w:p>
         </w:tc>
         <w:tc>
@@ -4661,15 +4786,8 @@
           </w:tcPr>
           <w:p>
             <w:pPr>
-              <w:jc w:val="center"/>
-            </w:pPr>
-            <w:r>
-              <w:rPr>
-                <w:sz w:val="20"/>
-                <w:szCs w:val="20"/>
-              </w:rPr>
-              <w:t>Supervisor Contratista</w:t>
-            </w:r>
+              <w:spacing w:before="0" w:after="40"/>
+            </w:pPr>
           </w:p>
         </w:tc>
       </w:tr>
@@ -4698,6 +4816,7 @@
           <w:p>
             <w:pPr>
               <w:jc w:val="center"/>
+              <w:spacing w:before="0" w:after="40"/>
             </w:pPr>
             <w:r>
               <w:rPr>
@@ -4705,7 +4824,7 @@
                 <w:sz w:val="20"/>
                 <w:szCs w:val="20"/>
               </w:rPr>
-              <w:t>4.3</w:t>
+              <w:t>5.1</w:t>
             </w:r>
           </w:p>
         </w:tc>
@@ -4728,13 +4847,15 @@
             <w:vAlign w:val="center"/>
           </w:tcPr>
           <w:p>
-            <w:pPr/>
-            <w:r>
-              <w:rPr>
-                <w:sz w:val="20"/>
-                <w:szCs w:val="20"/>
-              </w:rPr>
-              <w:t>El Área Solicitante verifica que el área de trabajo esté en condiciones seguras antes del ingreso del contratista: equipos energizados o en movimiento aislados, superficies limpias, accesos despejados. No se autoriza el ingreso si el área presenta condiciones inseguras no controladas.</w:t>
+            <w:pPr>
+              <w:spacing w:before="0" w:after="40"/>
+            </w:pPr>
+            <w:r>
+              <w:rPr>
+                <w:sz w:val="20"/>
+                <w:szCs w:val="20"/>
+              </w:rPr>
+              <w:t>Durante la ejecución, el supervisor del contratista mantiene supervisión permanente del equipo. Cualquier cambio de alcance, condición nueva o peligro no previsto en el ART obliga a detener el trabajo, notificar a E&amp;S y actualizar el ART antes de continuar. No se improvisan soluciones de seguridad en campo sin aprobación de E&amp;S.</w:t>
             </w:r>
           </w:p>
         </w:tc>
@@ -4759,13 +4880,14 @@
           <w:p>
             <w:pPr>
               <w:jc w:val="center"/>
-            </w:pPr>
-            <w:r>
-              <w:rPr>
-                <w:sz w:val="20"/>
-                <w:szCs w:val="20"/>
-              </w:rPr>
-              <w:t>Área Solicitante</w:t>
+              <w:spacing w:before="0" w:after="40"/>
+            </w:pPr>
+            <w:r>
+              <w:rPr>
+                <w:sz w:val="20"/>
+                <w:szCs w:val="20"/>
+              </w:rPr>
+              <w:t>Supervisor Contratista</w:t>
             </w:r>
           </w:p>
         </w:tc>
@@ -4790,6 +4912,7 @@
           <w:p>
             <w:pPr>
               <w:jc w:val="center"/>
+              <w:spacing w:before="0" w:after="40"/>
             </w:pPr>
             <w:r>
               <w:rPr>
@@ -4826,6 +4949,7 @@
           <w:p>
             <w:pPr>
               <w:jc w:val="center"/>
+              <w:spacing w:before="0" w:after="40"/>
             </w:pPr>
             <w:r>
               <w:rPr>
@@ -4833,7 +4957,7 @@
                 <w:sz w:val="20"/>
                 <w:szCs w:val="20"/>
               </w:rPr>
-              <w:t>4.4</w:t>
+              <w:t>5.2</w:t>
             </w:r>
           </w:p>
         </w:tc>
@@ -4856,13 +4980,15 @@
             <w:vAlign w:val="center"/>
           </w:tcPr>
           <w:p>
-            <w:pPr/>
-            <w:r>
-              <w:rPr>
-                <w:sz w:val="20"/>
-                <w:szCs w:val="20"/>
-              </w:rPr>
-              <w:t>El Área Solicitante designa un supervisor o punto de contacto de Plantabal que permanecerá disponible durante toda la jornada de trabajo del contratista para atender consultas, autorizar cambios de alcance y gestionar emergencias.</w:t>
+            <w:pPr>
+              <w:spacing w:before="0" w:after="40"/>
+            </w:pPr>
+            <w:r>
+              <w:rPr>
+                <w:sz w:val="20"/>
+                <w:szCs w:val="20"/>
+              </w:rPr>
+              <w:t>Orden y limpieza continua: residuos se depositan en contenedores identificados, herramientas y materiales se almacenan fuera de pasillos y vías de evacuación. Cables y mangueras se canaletan o protegen al cruzar zonas de tránsito. El área debe poder evacuarse en cualquier momento sin obstáculos.</w:t>
             </w:r>
           </w:p>
         </w:tc>
@@ -4887,13 +5013,14 @@
           <w:p>
             <w:pPr>
               <w:jc w:val="center"/>
-            </w:pPr>
-            <w:r>
-              <w:rPr>
-                <w:sz w:val="20"/>
-                <w:szCs w:val="20"/>
-              </w:rPr>
-              <w:t>Área Solicitante</w:t>
+              <w:spacing w:before="0" w:after="40"/>
+            </w:pPr>
+            <w:r>
+              <w:rPr>
+                <w:sz w:val="20"/>
+                <w:szCs w:val="20"/>
+              </w:rPr>
+              <w:t>Supervisor Contratista</w:t>
             </w:r>
           </w:p>
         </w:tc>
@@ -4918,13 +5045,14 @@
           <w:p>
             <w:pPr>
               <w:jc w:val="center"/>
-            </w:pPr>
-            <w:r>
-              <w:rPr>
-                <w:sz w:val="20"/>
-                <w:szCs w:val="20"/>
-              </w:rPr>
-              <w:t>Equipo de E&amp;S</w:t>
+              <w:spacing w:before="0" w:after="40"/>
+            </w:pPr>
+            <w:r>
+              <w:rPr>
+                <w:sz w:val="20"/>
+                <w:szCs w:val="20"/>
+              </w:rPr>
+              <w:t>Supervisor de Área</w:t>
             </w:r>
           </w:p>
         </w:tc>
@@ -4952,7 +5080,18 @@
             <w:vAlign w:val="center"/>
           </w:tcPr>
           <w:p>
-            <w:pPr/>
+            <w:pPr>
+              <w:jc w:val="center"/>
+              <w:spacing w:before="0" w:after="40"/>
+            </w:pPr>
+            <w:r>
+              <w:rPr>
+                <w:b/>
+                <w:sz w:val="20"/>
+                <w:szCs w:val="20"/>
+              </w:rPr>
+              <w:t>5.3</w:t>
+            </w:r>
           </w:p>
         </w:tc>
         <w:tc>
@@ -4975,15 +5114,14 @@
           </w:tcPr>
           <w:p>
             <w:pPr>
-              <w:jc w:val="center"/>
-            </w:pPr>
-            <w:r>
-              <w:rPr>
-                <w:b/>
-                <w:sz w:val="20"/>
-                <w:szCs w:val="20"/>
-              </w:rPr>
-              <w:t>FASE 5: ART Y PERMISOS DE TRABAJO</w:t>
+              <w:spacing w:before="0" w:after="40"/>
+            </w:pPr>
+            <w:r>
+              <w:rPr>
+                <w:sz w:val="20"/>
+                <w:szCs w:val="20"/>
+              </w:rPr>
+              <w:t>Está prohibido modificar, retirar o inhabilitar dispositivos de seguridad (guardas, candados LOTO, detectores, barreras) durante la ejecución sin autorización expresa de E&amp;S y del Área Solicitante. La violación de dispositivos de seguridad es incumplimiento grave con suspensión inmediata.</w:t>
             </w:r>
           </w:p>
         </w:tc>
@@ -5006,7 +5144,17 @@
             <w:vAlign w:val="center"/>
           </w:tcPr>
           <w:p>
-            <w:pPr/>
+            <w:pPr>
+              <w:jc w:val="center"/>
+              <w:spacing w:before="0" w:after="40"/>
+            </w:pPr>
+            <w:r>
+              <w:rPr>
+                <w:sz w:val="20"/>
+                <w:szCs w:val="20"/>
+              </w:rPr>
+              <w:t>Equipo de E&amp;S</w:t>
+            </w:r>
           </w:p>
         </w:tc>
         <w:tc>
@@ -5028,7 +5176,17 @@
             <w:vAlign w:val="center"/>
           </w:tcPr>
           <w:p>
-            <w:pPr/>
+            <w:pPr>
+              <w:jc w:val="center"/>
+              <w:spacing w:before="0" w:after="40"/>
+            </w:pPr>
+            <w:r>
+              <w:rPr>
+                <w:sz w:val="20"/>
+                <w:szCs w:val="20"/>
+              </w:rPr>
+              <w:t>Gerencia de Planta</w:t>
+            </w:r>
           </w:p>
         </w:tc>
       </w:tr>
@@ -5057,6 +5215,7 @@
           <w:p>
             <w:pPr>
               <w:jc w:val="center"/>
+              <w:spacing w:before="0" w:after="40"/>
             </w:pPr>
             <w:r>
               <w:rPr>
@@ -5064,7 +5223,7 @@
                 <w:sz w:val="20"/>
                 <w:szCs w:val="20"/>
               </w:rPr>
-              <w:t>5.1</w:t>
+              <w:t>5.4</w:t>
             </w:r>
           </w:p>
         </w:tc>
@@ -5087,13 +5246,15 @@
             <w:vAlign w:val="center"/>
           </w:tcPr>
           <w:p>
-            <w:pPr/>
-            <w:r>
-              <w:rPr>
-                <w:sz w:val="20"/>
-                <w:szCs w:val="20"/>
-              </w:rPr>
-              <w:t>Antes de iniciar cualquier actividad, el supervisor del contratista lidera el ART (Análisis de Riesgo en el Trabajo) con todos los trabajadores participantes. El ART desglosa la tarea paso a paso, identifica los peligros por cada paso y define los controles a aplicar. El ART debe ser firmado por todos los participantes y queda en sitio durante la ejecución.</w:t>
+            <w:pPr>
+              <w:spacing w:before="0" w:after="40"/>
+            </w:pPr>
+            <w:r>
+              <w:rPr>
+                <w:sz w:val="20"/>
+                <w:szCs w:val="20"/>
+              </w:rPr>
+              <w:t>El Técnico de E&amp;S realiza visitas de seguimiento durante la jornada. Si detecta desviaciones del ART o del permiso, puede emitir una observación (corrección en el momento) o detener el trabajo (riesgo inminente). Las observaciones se registran; las detenciones generan reporte formal.</w:t>
             </w:r>
           </w:p>
         </w:tc>
@@ -5118,13 +5279,14 @@
           <w:p>
             <w:pPr>
               <w:jc w:val="center"/>
-            </w:pPr>
-            <w:r>
-              <w:rPr>
-                <w:sz w:val="20"/>
-                <w:szCs w:val="20"/>
-              </w:rPr>
-              <w:t>Supervisor Contratista</w:t>
+              <w:spacing w:before="0" w:after="40"/>
+            </w:pPr>
+            <w:r>
+              <w:rPr>
+                <w:sz w:val="20"/>
+                <w:szCs w:val="20"/>
+              </w:rPr>
+              <w:t>Equipo de E&amp;S</w:t>
             </w:r>
           </w:p>
         </w:tc>
@@ -5149,13 +5311,14 @@
           <w:p>
             <w:pPr>
               <w:jc w:val="center"/>
-            </w:pPr>
-            <w:r>
-              <w:rPr>
-                <w:sz w:val="20"/>
-                <w:szCs w:val="20"/>
-              </w:rPr>
-              <w:t>Equipo de E&amp;S</w:t>
+              <w:spacing w:before="0" w:after="40"/>
+            </w:pPr>
+            <w:r>
+              <w:rPr>
+                <w:sz w:val="20"/>
+                <w:szCs w:val="20"/>
+              </w:rPr>
+              <w:t>Área Solicitante</w:t>
             </w:r>
           </w:p>
         </w:tc>
@@ -5184,7 +5347,32 @@
           </w:tcPr>
           <w:p>
             <w:pPr>
-              <w:jc w:val="center"/>
+              <w:spacing w:before="0" w:after="40"/>
+            </w:pPr>
+          </w:p>
+        </w:tc>
+        <w:tc>
+          <w:tcPr>
+            <w:tcW w:w="5888" w:type="dxa"/>
+            <w:tcBorders>
+              <w:top w:val="single" w:sz="4" w:space="0" w:color="000000"/>
+              <w:left w:val="single" w:sz="4" w:space="0" w:color="000000"/>
+              <w:bottom w:val="single" w:sz="4" w:space="0" w:color="000000"/>
+              <w:right w:val="single" w:sz="4" w:space="0" w:color="000000"/>
+            </w:tcBorders>
+            <w:shd w:val="clear" w:color="auto" w:fill="D9D9D9"/>
+            <w:tcMar>
+              <w:top w:w="70" w:type="dxa"/>
+              <w:left w:w="100" w:type="dxa"/>
+              <w:bottom w:w="70" w:type="dxa"/>
+              <w:right w:w="100" w:type="dxa"/>
+            </w:tcMar>
+            <w:vAlign w:val="center"/>
+          </w:tcPr>
+          <w:p>
+            <w:pPr>
+              <w:jc w:val="center"/>
+              <w:spacing w:before="0" w:after="40"/>
             </w:pPr>
             <w:r>
               <w:rPr>
@@ -5192,36 +5380,7 @@
                 <w:sz w:val="20"/>
                 <w:szCs w:val="20"/>
               </w:rPr>
-              <w:t>5.2</w:t>
-            </w:r>
-          </w:p>
-        </w:tc>
-        <w:tc>
-          <w:tcPr>
-            <w:tcW w:w="5888" w:type="dxa"/>
-            <w:tcBorders>
-              <w:top w:val="single" w:sz="4" w:space="0" w:color="000000"/>
-              <w:left w:val="single" w:sz="4" w:space="0" w:color="000000"/>
-              <w:bottom w:val="single" w:sz="4" w:space="0" w:color="000000"/>
-              <w:right w:val="single" w:sz="4" w:space="0" w:color="000000"/>
-            </w:tcBorders>
-            <w:shd w:val="clear" w:color="auto" w:fill="D9D9D9"/>
-            <w:tcMar>
-              <w:top w:w="70" w:type="dxa"/>
-              <w:left w:w="100" w:type="dxa"/>
-              <w:bottom w:w="70" w:type="dxa"/>
-              <w:right w:w="100" w:type="dxa"/>
-            </w:tcMar>
-            <w:vAlign w:val="center"/>
-          </w:tcPr>
-          <w:p>
-            <w:pPr/>
-            <w:r>
-              <w:rPr>
-                <w:sz w:val="20"/>
-                <w:szCs w:val="20"/>
-              </w:rPr>
-              <w:t>Para actividades de bajo a mediano riesgo (trabajos generales de mantenimiento, instalaciones menores, limpieza de equipos): solicitar Permiso de Trabajo General al Área Solicitante. El permiso debe especificar: fecha, área, descripción de la tarea, nombre del contratista y responsable de Plantabal. Firmado por Área Solicitante y E&amp;S.</w:t>
+              <w:t>FASE 6: CIERRE DEL PERMISO DE TRABAJO</w:t>
             </w:r>
           </w:p>
         </w:tc>
@@ -5245,15 +5404,8 @@
           </w:tcPr>
           <w:p>
             <w:pPr>
-              <w:jc w:val="center"/>
-            </w:pPr>
-            <w:r>
-              <w:rPr>
-                <w:sz w:val="20"/>
-                <w:szCs w:val="20"/>
-              </w:rPr>
-              <w:t>Área Solicitante / Equipo de E&amp;S</w:t>
-            </w:r>
+              <w:spacing w:before="0" w:after="40"/>
+            </w:pPr>
           </w:p>
         </w:tc>
         <w:tc>
@@ -5276,15 +5428,8 @@
           </w:tcPr>
           <w:p>
             <w:pPr>
-              <w:jc w:val="center"/>
-            </w:pPr>
-            <w:r>
-              <w:rPr>
-                <w:sz w:val="20"/>
-                <w:szCs w:val="20"/>
-              </w:rPr>
-              <w:t>Supervisor Contratista</w:t>
-            </w:r>
+              <w:spacing w:before="0" w:after="40"/>
+            </w:pPr>
           </w:p>
         </w:tc>
       </w:tr>
@@ -5313,6 +5458,7 @@
           <w:p>
             <w:pPr>
               <w:jc w:val="center"/>
+              <w:spacing w:before="0" w:after="40"/>
             </w:pPr>
             <w:r>
               <w:rPr>
@@ -5320,7 +5466,7 @@
                 <w:sz w:val="20"/>
                 <w:szCs w:val="20"/>
               </w:rPr>
-              <w:t>5.3</w:t>
+              <w:t>6.1</w:t>
             </w:r>
           </w:p>
         </w:tc>
@@ -5343,13 +5489,15 @@
             <w:vAlign w:val="center"/>
           </w:tcPr>
           <w:p>
-            <w:pPr/>
-            <w:r>
-              <w:rPr>
-                <w:sz w:val="20"/>
-                <w:szCs w:val="20"/>
-              </w:rPr>
-              <w:t>Para trabajo en altura (≥1,8 m): solicitar Permiso de Trabajo Especial — Altura. Incluye: verificación del arnés y líneas de vida, identificación de puntos de anclaje, plan de rescate en caso de caída. Firmado por E&amp;S, Área Solicitante y supervisor del contratista. Válido solo por la jornada indicada.</w:t>
+            <w:pPr>
+              <w:spacing w:before="0" w:after="40"/>
+            </w:pPr>
+            <w:r>
+              <w:rPr>
+                <w:sz w:val="20"/>
+                <w:szCs w:val="20"/>
+              </w:rPr>
+              <w:t>Al finalizar la actividad o la jornada, el supervisor del contratista notifica al Técnico de E&amp;S para realizar el cierre del permiso. El cierre incluye: verificación de que el trabajo está completo o en pausa segura, inspección visual del área, confirmación de que todos los trabajadores están fuera del área de riesgo.</w:t>
             </w:r>
           </w:p>
         </w:tc>
@@ -5374,13 +5522,14 @@
           <w:p>
             <w:pPr>
               <w:jc w:val="center"/>
-            </w:pPr>
-            <w:r>
-              <w:rPr>
-                <w:sz w:val="20"/>
-                <w:szCs w:val="20"/>
-              </w:rPr>
-              <w:t>Equipo de E&amp;S</w:t>
+              <w:spacing w:before="0" w:after="40"/>
+            </w:pPr>
+            <w:r>
+              <w:rPr>
+                <w:sz w:val="20"/>
+                <w:szCs w:val="20"/>
+              </w:rPr>
+              <w:t>Supervisor Contratista / Equipo de E&amp;S</w:t>
             </w:r>
           </w:p>
         </w:tc>
@@ -5405,6 +5554,7 @@
           <w:p>
             <w:pPr>
               <w:jc w:val="center"/>
+              <w:spacing w:before="0" w:after="40"/>
             </w:pPr>
             <w:r>
               <w:rPr>
@@ -5441,6 +5591,7 @@
           <w:p>
             <w:pPr>
               <w:jc w:val="center"/>
+              <w:spacing w:before="0" w:after="40"/>
             </w:pPr>
             <w:r>
               <w:rPr>
@@ -5448,7 +5599,7 @@
                 <w:sz w:val="20"/>
                 <w:szCs w:val="20"/>
               </w:rPr>
-              <w:t>5.4</w:t>
+              <w:t>6.2</w:t>
             </w:r>
           </w:p>
         </w:tc>
@@ -5471,13 +5622,15 @@
             <w:vAlign w:val="center"/>
           </w:tcPr>
           <w:p>
-            <w:pPr/>
-            <w:r>
-              <w:rPr>
-                <w:sz w:val="20"/>
-                <w:szCs w:val="20"/>
-              </w:rPr>
-              <w:t>Para trabajo en caliente (soldadura, corte, esmerilado): solicitar Permiso de Trabajo Especial — Caliente. Incluye: eliminación de materiales inflamables en radio de 10 m, extintor disponible, vigía de fuego designado, revisión post-trabajo a los 30 minutos. Firmado por E&amp;S y Área Solicitante.</w:t>
+            <w:pPr>
+              <w:spacing w:before="0" w:after="40"/>
+            </w:pPr>
+            <w:r>
+              <w:rPr>
+                <w:sz w:val="20"/>
+                <w:szCs w:val="20"/>
+              </w:rPr>
+              <w:t>Retiro de señalización: el contratista retira cinta, conos, señales y barreras utilizadas. No se retira la señalización de un trabajo en curso o en pausa hasta que E&amp;S confirme el cierre del permiso. La señalización solo puede quedar instalada de un día para otro si el permiso cubre jornadas múltiples y E&amp;S lo autoriza explícitamente.</w:t>
             </w:r>
           </w:p>
         </w:tc>
@@ -5502,6 +5655,39 @@
           <w:p>
             <w:pPr>
               <w:jc w:val="center"/>
+              <w:spacing w:before="0" w:after="40"/>
+            </w:pPr>
+            <w:r>
+              <w:rPr>
+                <w:sz w:val="20"/>
+                <w:szCs w:val="20"/>
+              </w:rPr>
+              <w:t>Supervisor Contratista</w:t>
+            </w:r>
+          </w:p>
+        </w:tc>
+        <w:tc>
+          <w:tcPr>
+            <w:tcW w:w="1300" w:type="dxa"/>
+            <w:tcBorders>
+              <w:top w:val="single" w:sz="4" w:space="0" w:color="000000"/>
+              <w:left w:val="single" w:sz="4" w:space="0" w:color="000000"/>
+              <w:bottom w:val="single" w:sz="4" w:space="0" w:color="000000"/>
+              <w:right w:val="single" w:sz="4" w:space="0" w:color="000000"/>
+            </w:tcBorders>
+            <w:shd w:val="clear" w:color="auto" w:fill="D9D9D9"/>
+            <w:tcMar>
+              <w:top w:w="70" w:type="dxa"/>
+              <w:left w:w="100" w:type="dxa"/>
+              <w:bottom w:w="70" w:type="dxa"/>
+              <w:right w:w="100" w:type="dxa"/>
+            </w:tcMar>
+            <w:vAlign w:val="center"/>
+          </w:tcPr>
+          <w:p>
+            <w:pPr>
+              <w:jc w:val="center"/>
+              <w:spacing w:before="0" w:after="40"/>
             </w:pPr>
             <w:r>
               <w:rPr>
@@ -5509,37 +5695,6 @@
                 <w:szCs w:val="20"/>
               </w:rPr>
               <w:t>Equipo de E&amp;S</w:t>
-            </w:r>
-          </w:p>
-        </w:tc>
-        <w:tc>
-          <w:tcPr>
-            <w:tcW w:w="1300" w:type="dxa"/>
-            <w:tcBorders>
-              <w:top w:val="single" w:sz="4" w:space="0" w:color="000000"/>
-              <w:left w:val="single" w:sz="4" w:space="0" w:color="000000"/>
-              <w:bottom w:val="single" w:sz="4" w:space="0" w:color="000000"/>
-              <w:right w:val="single" w:sz="4" w:space="0" w:color="000000"/>
-            </w:tcBorders>
-            <w:shd w:val="clear" w:color="auto" w:fill="D9D9D9"/>
-            <w:tcMar>
-              <w:top w:w="70" w:type="dxa"/>
-              <w:left w:w="100" w:type="dxa"/>
-              <w:bottom w:w="70" w:type="dxa"/>
-              <w:right w:w="100" w:type="dxa"/>
-            </w:tcMar>
-            <w:vAlign w:val="center"/>
-          </w:tcPr>
-          <w:p>
-            <w:pPr>
-              <w:jc w:val="center"/>
-            </w:pPr>
-            <w:r>
-              <w:rPr>
-                <w:sz w:val="20"/>
-                <w:szCs w:val="20"/>
-              </w:rPr>
-              <w:t>Área Solicitante</w:t>
             </w:r>
           </w:p>
         </w:tc>
@@ -5569,6 +5724,7 @@
           <w:p>
             <w:pPr>
               <w:jc w:val="center"/>
+              <w:spacing w:before="0" w:after="40"/>
             </w:pPr>
             <w:r>
               <w:rPr>
@@ -5576,7 +5732,7 @@
                 <w:sz w:val="20"/>
                 <w:szCs w:val="20"/>
               </w:rPr>
-              <w:t>5.5</w:t>
+              <w:t>6.3</w:t>
             </w:r>
           </w:p>
         </w:tc>
@@ -5599,13 +5755,15 @@
             <w:vAlign w:val="center"/>
           </w:tcPr>
           <w:p>
-            <w:pPr/>
-            <w:r>
-              <w:rPr>
-                <w:sz w:val="20"/>
-                <w:szCs w:val="20"/>
-              </w:rPr>
-              <w:t>Para espacios confinados: solicitar Permiso de Trabajo Especial — Espacio Confinado. Incluye: medición de gases antes del ingreso (O₂ 19,5%-23,5%, CO &lt;25 ppm, H₂S &lt;10 ppm, LEL &lt;10%), lista de verificación de equipo de rescate, vigía externo permanente, protocolo de comunicación. El permiso debe ser re-evaluado si las condiciones cambian.</w:t>
+            <w:pPr>
+              <w:spacing w:before="0" w:after="40"/>
+            </w:pPr>
+            <w:r>
+              <w:rPr>
+                <w:sz w:val="20"/>
+                <w:szCs w:val="20"/>
+              </w:rPr>
+              <w:t>Retiro de bloqueos LOTO: cada trabajador retira su propio candado y tarjeta en presencia del Técnico de E&amp;S. La re-energización del equipo la realiza el personal autorizado de Plantabal, no el contratista.</w:t>
             </w:r>
           </w:p>
         </w:tc>
@@ -5630,13 +5788,14 @@
           <w:p>
             <w:pPr>
               <w:jc w:val="center"/>
-            </w:pPr>
-            <w:r>
-              <w:rPr>
-                <w:sz w:val="20"/>
-                <w:szCs w:val="20"/>
-              </w:rPr>
-              <w:t>Equipo de E&amp;S</w:t>
+              <w:spacing w:before="0" w:after="40"/>
+            </w:pPr>
+            <w:r>
+              <w:rPr>
+                <w:sz w:val="20"/>
+                <w:szCs w:val="20"/>
+              </w:rPr>
+              <w:t>Equipo de E&amp;S / Área Solicitante</w:t>
             </w:r>
           </w:p>
         </w:tc>
@@ -5661,13 +5820,14 @@
           <w:p>
             <w:pPr>
               <w:jc w:val="center"/>
-            </w:pPr>
-            <w:r>
-              <w:rPr>
-                <w:sz w:val="20"/>
-                <w:szCs w:val="20"/>
-              </w:rPr>
-              <w:t>Gerencia de Planta</w:t>
+              <w:spacing w:before="0" w:after="40"/>
+            </w:pPr>
+            <w:r>
+              <w:rPr>
+                <w:sz w:val="20"/>
+                <w:szCs w:val="20"/>
+              </w:rPr>
+              <w:t>Supervisor Contratista</w:t>
             </w:r>
           </w:p>
         </w:tc>
@@ -5697,6 +5857,7 @@
           <w:p>
             <w:pPr>
               <w:jc w:val="center"/>
+              <w:spacing w:before="0" w:after="40"/>
             </w:pPr>
             <w:r>
               <w:rPr>
@@ -5704,7 +5865,7 @@
                 <w:sz w:val="20"/>
                 <w:szCs w:val="20"/>
               </w:rPr>
-              <w:t>5.6</w:t>
+              <w:t>6.4</w:t>
             </w:r>
           </w:p>
         </w:tc>
@@ -5727,13 +5888,15 @@
             <w:vAlign w:val="center"/>
           </w:tcPr>
           <w:p>
-            <w:pPr/>
-            <w:r>
-              <w:rPr>
-                <w:sz w:val="20"/>
-                <w:szCs w:val="20"/>
-              </w:rPr>
-              <w:t>Para trabajos eléctricos o bloqueo de energía (LOTO): solicitar Permiso de Trabajo Especial — Eléctrico / LOTO. Incluye: identificación de todos los puntos de energía a aislar, candados y tarjetas por cada trabajador que interviene, verificación de ausencia de tensión antes de iniciar. Solo personal habilitado puede ejecutarlo.</w:t>
+            <w:pPr>
+              <w:spacing w:before="0" w:after="40"/>
+            </w:pPr>
+            <w:r>
+              <w:rPr>
+                <w:sz w:val="20"/>
+                <w:szCs w:val="20"/>
+              </w:rPr>
+              <w:t>El Técnico de E&amp;S y el Área Solicitante firman el cierre del permiso. Sin esas dos firmas el permiso no se considera cerrado. Los permisos cerrados se archivan en E&amp;S por un mínimo de 12 meses.</w:t>
             </w:r>
           </w:p>
         </w:tc>
@@ -5758,13 +5921,14 @@
           <w:p>
             <w:pPr>
               <w:jc w:val="center"/>
-            </w:pPr>
-            <w:r>
-              <w:rPr>
-                <w:sz w:val="20"/>
-                <w:szCs w:val="20"/>
-              </w:rPr>
-              <w:t>Equipo de E&amp;S</w:t>
+              <w:spacing w:before="0" w:after="40"/>
+            </w:pPr>
+            <w:r>
+              <w:rPr>
+                <w:sz w:val="20"/>
+                <w:szCs w:val="20"/>
+              </w:rPr>
+              <w:t>Equipo de E&amp;S / Área Solicitante</w:t>
             </w:r>
           </w:p>
         </w:tc>
@@ -5789,13 +5953,14 @@
           <w:p>
             <w:pPr>
               <w:jc w:val="center"/>
-            </w:pPr>
-            <w:r>
-              <w:rPr>
-                <w:sz w:val="20"/>
-                <w:szCs w:val="20"/>
-              </w:rPr>
-              <w:t>Área Solicitante</w:t>
+              <w:spacing w:before="0" w:after="40"/>
+            </w:pPr>
+            <w:r>
+              <w:rPr>
+                <w:sz w:val="20"/>
+                <w:szCs w:val="20"/>
+              </w:rPr>
+              <w:t>—</w:t>
             </w:r>
           </w:p>
         </w:tc>
@@ -5824,7 +5989,32 @@
           </w:tcPr>
           <w:p>
             <w:pPr>
-              <w:jc w:val="center"/>
+              <w:spacing w:before="0" w:after="40"/>
+            </w:pPr>
+          </w:p>
+        </w:tc>
+        <w:tc>
+          <w:tcPr>
+            <w:tcW w:w="5888" w:type="dxa"/>
+            <w:tcBorders>
+              <w:top w:val="single" w:sz="4" w:space="0" w:color="000000"/>
+              <w:left w:val="single" w:sz="4" w:space="0" w:color="000000"/>
+              <w:bottom w:val="single" w:sz="4" w:space="0" w:color="000000"/>
+              <w:right w:val="single" w:sz="4" w:space="0" w:color="000000"/>
+            </w:tcBorders>
+            <w:shd w:val="clear" w:color="auto" w:fill="D9D9D9"/>
+            <w:tcMar>
+              <w:top w:w="70" w:type="dxa"/>
+              <w:left w:w="100" w:type="dxa"/>
+              <w:bottom w:w="70" w:type="dxa"/>
+              <w:right w:w="100" w:type="dxa"/>
+            </w:tcMar>
+            <w:vAlign w:val="center"/>
+          </w:tcPr>
+          <w:p>
+            <w:pPr>
+              <w:jc w:val="center"/>
+              <w:spacing w:before="0" w:after="40"/>
             </w:pPr>
             <w:r>
               <w:rPr>
@@ -5832,36 +6022,7 @@
                 <w:sz w:val="20"/>
                 <w:szCs w:val="20"/>
               </w:rPr>
-              <w:t>5.7</w:t>
-            </w:r>
-          </w:p>
-        </w:tc>
-        <w:tc>
-          <w:tcPr>
-            <w:tcW w:w="5888" w:type="dxa"/>
-            <w:tcBorders>
-              <w:top w:val="single" w:sz="4" w:space="0" w:color="000000"/>
-              <w:left w:val="single" w:sz="4" w:space="0" w:color="000000"/>
-              <w:bottom w:val="single" w:sz="4" w:space="0" w:color="000000"/>
-              <w:right w:val="single" w:sz="4" w:space="0" w:color="000000"/>
-            </w:tcBorders>
-            <w:shd w:val="clear" w:color="auto" w:fill="D9D9D9"/>
-            <w:tcMar>
-              <w:top w:w="70" w:type="dxa"/>
-              <w:left w:w="100" w:type="dxa"/>
-              <w:bottom w:w="70" w:type="dxa"/>
-              <w:right w:w="100" w:type="dxa"/>
-            </w:tcMar>
-            <w:vAlign w:val="center"/>
-          </w:tcPr>
-          <w:p>
-            <w:pPr/>
-            <w:r>
-              <w:rPr>
-                <w:sz w:val="20"/>
-                <w:szCs w:val="20"/>
-              </w:rPr>
-              <w:t>Confirmar habilitaciones individuales del personal para trabajos especiales: certificados vigentes de trabajo en altura, espacio confinado, trabajos en caliente o LOTO según la actividad. Ningún trabajador sin habilitación vigente puede ejecutar la tarea especial, aunque porte el EPP.</w:t>
+              <w:t>FASE 7: DISPOSICIÓN DE RESIDUOS Y LIMPIEZA FINAL</w:t>
             </w:r>
           </w:p>
         </w:tc>
@@ -5885,15 +6046,8 @@
           </w:tcPr>
           <w:p>
             <w:pPr>
-              <w:jc w:val="center"/>
-            </w:pPr>
-            <w:r>
-              <w:rPr>
-                <w:sz w:val="20"/>
-                <w:szCs w:val="20"/>
-              </w:rPr>
-              <w:t>Equipo de E&amp;S</w:t>
-            </w:r>
+              <w:spacing w:before="0" w:after="40"/>
+            </w:pPr>
           </w:p>
         </w:tc>
         <w:tc>
@@ -5916,15 +6070,8 @@
           </w:tcPr>
           <w:p>
             <w:pPr>
-              <w:jc w:val="center"/>
-            </w:pPr>
-            <w:r>
-              <w:rPr>
-                <w:sz w:val="20"/>
-                <w:szCs w:val="20"/>
-              </w:rPr>
-              <w:t>Área Solicitante</w:t>
-            </w:r>
+              <w:spacing w:before="0" w:after="40"/>
+            </w:pPr>
           </w:p>
         </w:tc>
       </w:tr>
@@ -5951,7 +6098,18 @@
             <w:vAlign w:val="center"/>
           </w:tcPr>
           <w:p>
-            <w:pPr/>
+            <w:pPr>
+              <w:jc w:val="center"/>
+              <w:spacing w:before="0" w:after="40"/>
+            </w:pPr>
+            <w:r>
+              <w:rPr>
+                <w:b/>
+                <w:sz w:val="20"/>
+                <w:szCs w:val="20"/>
+              </w:rPr>
+              <w:t>7.1</w:t>
+            </w:r>
           </w:p>
         </w:tc>
         <w:tc>
@@ -5974,15 +6132,14 @@
           </w:tcPr>
           <w:p>
             <w:pPr>
-              <w:jc w:val="center"/>
-            </w:pPr>
-            <w:r>
-              <w:rPr>
-                <w:b/>
-                <w:sz w:val="20"/>
-                <w:szCs w:val="20"/>
-              </w:rPr>
-              <w:t>FASE 6: DISPOSICIÓN DE RESIDUOS</w:t>
+              <w:spacing w:before="0" w:after="40"/>
+            </w:pPr>
+            <w:r>
+              <w:rPr>
+                <w:sz w:val="20"/>
+                <w:szCs w:val="20"/>
+              </w:rPr>
+              <w:t>Los residuos generados se segregan en punto de origen: comunes (negro), reciclables (azul/verde), peligrosos (rojo — trapos contaminados, envases de químicos, filtros, baterías). Prohibido mezclar residuos peligrosos con comunes.</w:t>
             </w:r>
           </w:p>
         </w:tc>
@@ -6005,7 +6162,17 @@
             <w:vAlign w:val="center"/>
           </w:tcPr>
           <w:p>
-            <w:pPr/>
+            <w:pPr>
+              <w:jc w:val="center"/>
+              <w:spacing w:before="0" w:after="40"/>
+            </w:pPr>
+            <w:r>
+              <w:rPr>
+                <w:sz w:val="20"/>
+                <w:szCs w:val="20"/>
+              </w:rPr>
+              <w:t>Supervisor Contratista</w:t>
+            </w:r>
           </w:p>
         </w:tc>
         <w:tc>
@@ -6027,7 +6194,17 @@
             <w:vAlign w:val="center"/>
           </w:tcPr>
           <w:p>
-            <w:pPr/>
+            <w:pPr>
+              <w:jc w:val="center"/>
+              <w:spacing w:before="0" w:after="40"/>
+            </w:pPr>
+            <w:r>
+              <w:rPr>
+                <w:sz w:val="20"/>
+                <w:szCs w:val="20"/>
+              </w:rPr>
+              <w:t>Equipo de E&amp;S</w:t>
+            </w:r>
           </w:p>
         </w:tc>
       </w:tr>
@@ -6056,6 +6233,7 @@
           <w:p>
             <w:pPr>
               <w:jc w:val="center"/>
+              <w:spacing w:before="0" w:after="40"/>
             </w:pPr>
             <w:r>
               <w:rPr>
@@ -6063,7 +6241,7 @@
                 <w:sz w:val="20"/>
                 <w:szCs w:val="20"/>
               </w:rPr>
-              <w:t>6.1</w:t>
+              <w:t>7.2</w:t>
             </w:r>
           </w:p>
         </w:tc>
@@ -6086,13 +6264,15 @@
             <w:vAlign w:val="center"/>
           </w:tcPr>
           <w:p>
-            <w:pPr/>
-            <w:r>
-              <w:rPr>
-                <w:sz w:val="20"/>
-                <w:szCs w:val="20"/>
-              </w:rPr>
-              <w:t>Antes de iniciar, el supervisor del contratista coordinará con el Área Solicitante la identificación y ubicación de los contenedores de residuos disponibles en el área: residuos comunes (negro/gris), reciclables (azul/verde), peligrosos (rojo/naranja) y chatarra/metal (contenedor específico de planta).</w:t>
+            <w:pPr>
+              <w:spacing w:before="0" w:after="40"/>
+            </w:pPr>
+            <w:r>
+              <w:rPr>
+                <w:sz w:val="20"/>
+                <w:szCs w:val="20"/>
+              </w:rPr>
+              <w:t>Residuos peligrosos: el contratista los retira con gestor ambiental autorizado o los entrega al área de almacenamiento temporal de Plantabal previa coordinación con E&amp;S. Debe presentar manifiesto de disposición si se solicita.</w:t>
             </w:r>
           </w:p>
         </w:tc>
@@ -6117,13 +6297,14 @@
           <w:p>
             <w:pPr>
               <w:jc w:val="center"/>
-            </w:pPr>
-            <w:r>
-              <w:rPr>
-                <w:sz w:val="20"/>
-                <w:szCs w:val="20"/>
-              </w:rPr>
-              <w:t>Supervisor Contratista / Área Solicitante</w:t>
+              <w:spacing w:before="0" w:after="40"/>
+            </w:pPr>
+            <w:r>
+              <w:rPr>
+                <w:sz w:val="20"/>
+                <w:szCs w:val="20"/>
+              </w:rPr>
+              <w:t>Supervisor Contratista</w:t>
             </w:r>
           </w:p>
         </w:tc>
@@ -6148,13 +6329,14 @@
           <w:p>
             <w:pPr>
               <w:jc w:val="center"/>
-            </w:pPr>
-            <w:r>
-              <w:rPr>
-                <w:sz w:val="20"/>
-                <w:szCs w:val="20"/>
-              </w:rPr>
-              <w:t>Equipo de E&amp;S</w:t>
+              <w:spacing w:before="0" w:after="40"/>
+            </w:pPr>
+            <w:r>
+              <w:rPr>
+                <w:sz w:val="20"/>
+                <w:szCs w:val="20"/>
+              </w:rPr>
+              <w:t>Equipo de E&amp;S / Área Solicitante</w:t>
             </w:r>
           </w:p>
         </w:tc>
@@ -6184,6 +6366,7 @@
           <w:p>
             <w:pPr>
               <w:jc w:val="center"/>
+              <w:spacing w:before="0" w:after="40"/>
             </w:pPr>
             <w:r>
               <w:rPr>
@@ -6191,7 +6374,7 @@
                 <w:sz w:val="20"/>
                 <w:szCs w:val="20"/>
               </w:rPr>
-              <w:t>6.2</w:t>
+              <w:t>7.3</w:t>
             </w:r>
           </w:p>
         </w:tc>
@@ -6214,13 +6397,15 @@
             <w:vAlign w:val="center"/>
           </w:tcPr>
           <w:p>
-            <w:pPr/>
-            <w:r>
-              <w:rPr>
-                <w:sz w:val="20"/>
-                <w:szCs w:val="20"/>
-              </w:rPr>
-              <w:t>Los residuos generados por el contratista deben segregarse en el punto de generación. Está prohibido mezclar residuos peligrosos con residuos comunes. Los trapos con aceite, solventes, pinturas o productos químicos se depositan en el contenedor de residuos peligrosos, nunca en la basura común.</w:t>
+            <w:pPr>
+              <w:spacing w:before="0" w:after="40"/>
+            </w:pPr>
+            <w:r>
+              <w:rPr>
+                <w:sz w:val="20"/>
+                <w:szCs w:val="20"/>
+              </w:rPr>
+              <w:t>Al término del contrato o de cada fase de trabajo, el contratista deja el área completamente libre de residuos, materiales sobrantes, herramientas y equipos propios. E&amp;S y el Área Solicitante verifican y dan conformidad. Sin conformidad de ambas partes, el contratista no puede retirarse de planta.</w:t>
             </w:r>
           </w:p>
         </w:tc>
@@ -6245,6 +6430,7 @@
           <w:p>
             <w:pPr>
               <w:jc w:val="center"/>
+              <w:spacing w:before="0" w:after="40"/>
             </w:pPr>
             <w:r>
               <w:rPr>
@@ -6276,13 +6462,14 @@
           <w:p>
             <w:pPr>
               <w:jc w:val="center"/>
-            </w:pPr>
-            <w:r>
-              <w:rPr>
-                <w:sz w:val="20"/>
-                <w:szCs w:val="20"/>
-              </w:rPr>
-              <w:t>Equipo de E&amp;S</w:t>
+              <w:spacing w:before="0" w:after="40"/>
+            </w:pPr>
+            <w:r>
+              <w:rPr>
+                <w:sz w:val="20"/>
+                <w:szCs w:val="20"/>
+              </w:rPr>
+              <w:t>Área Solicitante / Equipo de E&amp;S</w:t>
             </w:r>
           </w:p>
         </w:tc>
@@ -6312,6 +6499,7 @@
           <w:p>
             <w:pPr>
               <w:jc w:val="center"/>
+              <w:spacing w:before="0" w:after="40"/>
             </w:pPr>
             <w:r>
               <w:rPr>
@@ -6319,7 +6507,7 @@
                 <w:sz w:val="20"/>
                 <w:szCs w:val="20"/>
               </w:rPr>
-              <w:t>6.3</w:t>
+              <w:t>7.4</w:t>
             </w:r>
           </w:p>
         </w:tc>
@@ -6342,13 +6530,15 @@
             <w:vAlign w:val="center"/>
           </w:tcPr>
           <w:p>
-            <w:pPr/>
-            <w:r>
-              <w:rPr>
-                <w:sz w:val="20"/>
-                <w:szCs w:val="20"/>
-              </w:rPr>
-              <w:t>Los residuos peligrosos generados por el contratista (envases de químicos, trapos contaminados, filtros de aceite, baterías, fluorescentes) deben ser retirados por el propio contratista con gestor ambiental autorizado, o depositados en el área de almacenamiento temporal de residuos peligrosos de Plantabal previa autorización. El contratista debe presentar el manifiesto de disposición si se le solicita.</w:t>
+            <w:pPr>
+              <w:spacing w:before="0" w:after="40"/>
+            </w:pPr>
+            <w:r>
+              <w:rPr>
+                <w:sz w:val="20"/>
+                <w:szCs w:val="20"/>
+              </w:rPr>
+              <w:t>Prohibido verter líquidos contaminantes (aceites, solventes, pinturas) en alcantarillado, suelo o cuerpos de agua. Ante derrame accidental: contener de inmediato con material absorbente, notificar a E&amp;S y Área Solicitante, y ejecutar el plan de respuesta a derrames del contratista.</w:t>
             </w:r>
           </w:p>
         </w:tc>
@@ -6373,6 +6563,7 @@
           <w:p>
             <w:pPr>
               <w:jc w:val="center"/>
+              <w:spacing w:before="0" w:after="40"/>
             </w:pPr>
             <w:r>
               <w:rPr>
@@ -6404,6 +6595,7 @@
           <w:p>
             <w:pPr>
               <w:jc w:val="center"/>
+              <w:spacing w:before="0" w:after="40"/>
             </w:pPr>
             <w:r>
               <w:rPr>
@@ -6439,7 +6631,32 @@
           </w:tcPr>
           <w:p>
             <w:pPr>
-              <w:jc w:val="center"/>
+              <w:spacing w:before="0" w:after="40"/>
+            </w:pPr>
+          </w:p>
+        </w:tc>
+        <w:tc>
+          <w:tcPr>
+            <w:tcW w:w="5888" w:type="dxa"/>
+            <w:tcBorders>
+              <w:top w:val="single" w:sz="4" w:space="0" w:color="000000"/>
+              <w:left w:val="single" w:sz="4" w:space="0" w:color="000000"/>
+              <w:bottom w:val="single" w:sz="4" w:space="0" w:color="000000"/>
+              <w:right w:val="single" w:sz="4" w:space="0" w:color="000000"/>
+            </w:tcBorders>
+            <w:shd w:val="clear" w:color="auto" w:fill="D9D9D9"/>
+            <w:tcMar>
+              <w:top w:w="70" w:type="dxa"/>
+              <w:left w:w="100" w:type="dxa"/>
+              <w:bottom w:w="70" w:type="dxa"/>
+              <w:right w:w="100" w:type="dxa"/>
+            </w:tcMar>
+            <w:vAlign w:val="center"/>
+          </w:tcPr>
+          <w:p>
+            <w:pPr>
+              <w:jc w:val="center"/>
+              <w:spacing w:before="0" w:after="40"/>
             </w:pPr>
             <w:r>
               <w:rPr>
@@ -6447,36 +6664,7 @@
                 <w:sz w:val="20"/>
                 <w:szCs w:val="20"/>
               </w:rPr>
-              <w:t>6.4</w:t>
-            </w:r>
-          </w:p>
-        </w:tc>
-        <w:tc>
-          <w:tcPr>
-            <w:tcW w:w="5888" w:type="dxa"/>
-            <w:tcBorders>
-              <w:top w:val="single" w:sz="4" w:space="0" w:color="000000"/>
-              <w:left w:val="single" w:sz="4" w:space="0" w:color="000000"/>
-              <w:bottom w:val="single" w:sz="4" w:space="0" w:color="000000"/>
-              <w:right w:val="single" w:sz="4" w:space="0" w:color="000000"/>
-            </w:tcBorders>
-            <w:shd w:val="clear" w:color="auto" w:fill="D9D9D9"/>
-            <w:tcMar>
-              <w:top w:w="70" w:type="dxa"/>
-              <w:left w:w="100" w:type="dxa"/>
-              <w:bottom w:w="70" w:type="dxa"/>
-              <w:right w:w="100" w:type="dxa"/>
-            </w:tcMar>
-            <w:vAlign w:val="center"/>
-          </w:tcPr>
-          <w:p>
-            <w:pPr/>
-            <w:r>
-              <w:rPr>
-                <w:sz w:val="20"/>
-                <w:szCs w:val="20"/>
-              </w:rPr>
-              <w:t>Al finalizar cada jornada y al término del contrato, el contratista debe dejar el área de trabajo completamente libre de residuos, materiales sobrantes, herramientas y equipos propios. El Área Solicitante y E&amp;S verifican el estado del área antes de dar por finalizada la actividad.</w:t>
+              <w:t>FASE 8: INCUMPLIMIENTOS Y SANCIONES</w:t>
             </w:r>
           </w:p>
         </w:tc>
@@ -6500,15 +6688,8 @@
           </w:tcPr>
           <w:p>
             <w:pPr>
-              <w:jc w:val="center"/>
-            </w:pPr>
-            <w:r>
-              <w:rPr>
-                <w:sz w:val="20"/>
-                <w:szCs w:val="20"/>
-              </w:rPr>
-              <w:t>Supervisor Contratista</w:t>
-            </w:r>
+              <w:spacing w:before="0" w:after="40"/>
+            </w:pPr>
           </w:p>
         </w:tc>
         <w:tc>
@@ -6531,15 +6712,8 @@
           </w:tcPr>
           <w:p>
             <w:pPr>
-              <w:jc w:val="center"/>
-            </w:pPr>
-            <w:r>
-              <w:rPr>
-                <w:sz w:val="20"/>
-                <w:szCs w:val="20"/>
-              </w:rPr>
-              <w:t>Área Solicitante / Equipo de E&amp;S</w:t>
-            </w:r>
+              <w:spacing w:before="0" w:after="40"/>
+            </w:pPr>
           </w:p>
         </w:tc>
       </w:tr>
@@ -6568,6 +6742,7 @@
           <w:p>
             <w:pPr>
               <w:jc w:val="center"/>
+              <w:spacing w:before="0" w:after="40"/>
             </w:pPr>
             <w:r>
               <w:rPr>
@@ -6575,7 +6750,7 @@
                 <w:sz w:val="20"/>
                 <w:szCs w:val="20"/>
               </w:rPr>
-              <w:t>6.5</w:t>
+              <w:t>8.1</w:t>
             </w:r>
           </w:p>
         </w:tc>
@@ -6598,13 +6773,15 @@
             <w:vAlign w:val="center"/>
           </w:tcPr>
           <w:p>
-            <w:pPr/>
-            <w:r>
-              <w:rPr>
-                <w:sz w:val="20"/>
-                <w:szCs w:val="20"/>
-              </w:rPr>
-              <w:t>Está prohibido el vertimiento de líquidos (aceites, solventes, pinturas, aguas de lavado contaminadas) en el sistema de alcantarillado, suelo o cuerpos de agua de la planta. En caso de derrame accidental, el contratista debe notificar de inmediato al Área Solicitante y a E&amp;S, y ejecutar el plan de respuesta a derrames.</w:t>
+            <w:pPr>
+              <w:spacing w:before="0" w:after="40"/>
+            </w:pPr>
+            <w:r>
+              <w:rPr>
+                <w:sz w:val="20"/>
+                <w:szCs w:val="20"/>
+              </w:rPr>
+              <w:t>Falta leve (primer incumplimiento): advertencia verbal + corrección inmediata antes de continuar + registro en E&amp;S. Ejemplos: EPP incompleto, área sin delimitar al inicio, herramienta menor en mal estado.</w:t>
             </w:r>
           </w:p>
         </w:tc>
@@ -6629,13 +6806,14 @@
           <w:p>
             <w:pPr>
               <w:jc w:val="center"/>
-            </w:pPr>
-            <w:r>
-              <w:rPr>
-                <w:sz w:val="20"/>
-                <w:szCs w:val="20"/>
-              </w:rPr>
-              <w:t>Supervisor Contratista</w:t>
+              <w:spacing w:before="0" w:after="40"/>
+            </w:pPr>
+            <w:r>
+              <w:rPr>
+                <w:sz w:val="20"/>
+                <w:szCs w:val="20"/>
+              </w:rPr>
+              <w:t>Equipo de E&amp;S</w:t>
             </w:r>
           </w:p>
         </w:tc>
@@ -6660,13 +6838,14 @@
           <w:p>
             <w:pPr>
               <w:jc w:val="center"/>
-            </w:pPr>
-            <w:r>
-              <w:rPr>
-                <w:sz w:val="20"/>
-                <w:szCs w:val="20"/>
-              </w:rPr>
-              <w:t>Equipo de E&amp;S / Área Solicitante</w:t>
+              <w:spacing w:before="0" w:after="40"/>
+            </w:pPr>
+            <w:r>
+              <w:rPr>
+                <w:sz w:val="20"/>
+                <w:szCs w:val="20"/>
+              </w:rPr>
+              <w:t>Supervisor de Área</w:t>
             </w:r>
           </w:p>
         </w:tc>
@@ -6694,7 +6873,18 @@
             <w:vAlign w:val="center"/>
           </w:tcPr>
           <w:p>
-            <w:pPr/>
+            <w:pPr>
+              <w:jc w:val="center"/>
+              <w:spacing w:before="0" w:after="40"/>
+            </w:pPr>
+            <w:r>
+              <w:rPr>
+                <w:b/>
+                <w:sz w:val="20"/>
+                <w:szCs w:val="20"/>
+              </w:rPr>
+              <w:t>8.2</w:t>
+            </w:r>
           </w:p>
         </w:tc>
         <w:tc>
@@ -6717,15 +6907,14 @@
           </w:tcPr>
           <w:p>
             <w:pPr>
-              <w:jc w:val="center"/>
-            </w:pPr>
-            <w:r>
-              <w:rPr>
-                <w:b/>
-                <w:sz w:val="20"/>
-                <w:szCs w:val="20"/>
-              </w:rPr>
-              <w:t>FASE 7: INCUMPLIMIENTOS Y SANCIONES</w:t>
+              <w:spacing w:before="0" w:after="40"/>
+            </w:pPr>
+            <w:r>
+              <w:rPr>
+                <w:sz w:val="20"/>
+                <w:szCs w:val="20"/>
+              </w:rPr>
+              <w:t>Falta moderada (reincidencia o segundo incumplimiento): paralización del trabajo hasta subsanar + notificación formal escrita al representante legal de la contratista. Ejemplos: ART no elaborado, ausencia de señalización en TAR, dispositivo de seguridad retirado sin autorización.</w:t>
             </w:r>
           </w:p>
         </w:tc>
@@ -6748,7 +6937,17 @@
             <w:vAlign w:val="center"/>
           </w:tcPr>
           <w:p>
-            <w:pPr/>
+            <w:pPr>
+              <w:jc w:val="center"/>
+              <w:spacing w:before="0" w:after="40"/>
+            </w:pPr>
+            <w:r>
+              <w:rPr>
+                <w:sz w:val="20"/>
+                <w:szCs w:val="20"/>
+              </w:rPr>
+              <w:t>Equipo de E&amp;S</w:t>
+            </w:r>
           </w:p>
         </w:tc>
         <w:tc>
@@ -6770,7 +6969,17 @@
             <w:vAlign w:val="center"/>
           </w:tcPr>
           <w:p>
-            <w:pPr/>
+            <w:pPr>
+              <w:jc w:val="center"/>
+              <w:spacing w:before="0" w:after="40"/>
+            </w:pPr>
+            <w:r>
+              <w:rPr>
+                <w:sz w:val="20"/>
+                <w:szCs w:val="20"/>
+              </w:rPr>
+              <w:t>Gerencia de Planta</w:t>
+            </w:r>
           </w:p>
         </w:tc>
       </w:tr>
@@ -6799,6 +7008,7 @@
           <w:p>
             <w:pPr>
               <w:jc w:val="center"/>
+              <w:spacing w:before="0" w:after="40"/>
             </w:pPr>
             <w:r>
               <w:rPr>
@@ -6806,7 +7016,7 @@
                 <w:sz w:val="20"/>
                 <w:szCs w:val="20"/>
               </w:rPr>
-              <w:t>7.1</w:t>
+              <w:t>8.3</w:t>
             </w:r>
           </w:p>
         </w:tc>
@@ -6829,13 +7039,15 @@
             <w:vAlign w:val="center"/>
           </w:tcPr>
           <w:p>
-            <w:pPr/>
-            <w:r>
-              <w:rPr>
-                <w:sz w:val="20"/>
-                <w:szCs w:val="20"/>
-              </w:rPr>
-              <w:t>Primer incumplimiento (falta leve): advertencia verbal al trabajador y a su supervisor. Corrección inmediata del incumplimiento antes de continuar con la actividad. Registro del evento por parte de E&amp;S.</w:t>
+            <w:pPr>
+              <w:spacing w:before="0" w:after="40"/>
+            </w:pPr>
+            <w:r>
+              <w:rPr>
+                <w:sz w:val="20"/>
+                <w:szCs w:val="20"/>
+              </w:rPr>
+              <w:t>Falta grave (tercer incumplimiento o gravedad alta): suspensión de todas las actividades de la empresa contratista + reporte a Gerencia General + evaluación de continuidad del contrato. Ejemplos: inicio de TAR sin permiso, violación de LOTO, trabajo en altura sin arnés.</w:t>
             </w:r>
           </w:p>
         </w:tc>
@@ -6860,13 +7072,14 @@
           <w:p>
             <w:pPr>
               <w:jc w:val="center"/>
-            </w:pPr>
-            <w:r>
-              <w:rPr>
-                <w:sz w:val="20"/>
-                <w:szCs w:val="20"/>
-              </w:rPr>
-              <w:t>Equipo de E&amp;S</w:t>
+              <w:spacing w:before="0" w:after="40"/>
+            </w:pPr>
+            <w:r>
+              <w:rPr>
+                <w:sz w:val="20"/>
+                <w:szCs w:val="20"/>
+              </w:rPr>
+              <w:t>Gerencia de Planta</w:t>
             </w:r>
           </w:p>
         </w:tc>
@@ -6891,13 +7104,14 @@
           <w:p>
             <w:pPr>
               <w:jc w:val="center"/>
-            </w:pPr>
-            <w:r>
-              <w:rPr>
-                <w:sz w:val="20"/>
-                <w:szCs w:val="20"/>
-              </w:rPr>
-              <w:t>Supervisor de Área</w:t>
+              <w:spacing w:before="0" w:after="40"/>
+            </w:pPr>
+            <w:r>
+              <w:rPr>
+                <w:sz w:val="20"/>
+                <w:szCs w:val="20"/>
+              </w:rPr>
+              <w:t>Gerencia General</w:t>
             </w:r>
           </w:p>
         </w:tc>
@@ -6927,6 +7141,7 @@
           <w:p>
             <w:pPr>
               <w:jc w:val="center"/>
+              <w:spacing w:before="0" w:after="40"/>
             </w:pPr>
             <w:r>
               <w:rPr>
@@ -6934,7 +7149,7 @@
                 <w:sz w:val="20"/>
                 <w:szCs w:val="20"/>
               </w:rPr>
-              <w:t>7.2</w:t>
+              <w:t>8.4</w:t>
             </w:r>
           </w:p>
         </w:tc>
@@ -6957,13 +7172,15 @@
             <w:vAlign w:val="center"/>
           </w:tcPr>
           <w:p>
-            <w:pPr/>
-            <w:r>
-              <w:rPr>
-                <w:sz w:val="20"/>
-                <w:szCs w:val="20"/>
-              </w:rPr>
-              <w:t>Segundo incumplimiento o incumplimiento moderado: paralización del trabajo hasta subsanar la condición + notificación formal escrita al representante legal o gerente de la empresa contratista.</w:t>
+            <w:pPr>
+              <w:spacing w:before="0" w:after="40"/>
+            </w:pPr>
+            <w:r>
+              <w:rPr>
+                <w:sz w:val="20"/>
+                <w:szCs w:val="20"/>
+              </w:rPr>
+              <w:t>Riesgo inminente: paralización y evacuación inmediata del área. No se reanudan actividades hasta corrección verificada por E&amp;S y Gerencia. Si el riesgo se originó por negligencia del contratista, la reanudación queda sujeta a evaluación disciplinaria del contrato.</w:t>
             </w:r>
           </w:p>
         </w:tc>
@@ -6988,6 +7205,7 @@
           <w:p>
             <w:pPr>
               <w:jc w:val="center"/>
+              <w:spacing w:before="0" w:after="40"/>
             </w:pPr>
             <w:r>
               <w:rPr>
@@ -7019,262 +7237,7 @@
           <w:p>
             <w:pPr>
               <w:jc w:val="center"/>
-            </w:pPr>
-            <w:r>
-              <w:rPr>
-                <w:sz w:val="20"/>
-                <w:szCs w:val="20"/>
-              </w:rPr>
-              <w:t>Gerencia de Planta</w:t>
-            </w:r>
-          </w:p>
-        </w:tc>
-      </w:tr>
-      <w:tr>
-        <w:trPr>
-          <w:tblHeader/>
-        </w:trPr>
-        <w:tc>
-          <w:tcPr>
-            <w:tcW w:w="550" w:type="dxa"/>
-            <w:tcBorders>
-              <w:top w:val="single" w:sz="4" w:space="0" w:color="000000"/>
-              <w:left w:val="single" w:sz="4" w:space="0" w:color="000000"/>
-              <w:bottom w:val="single" w:sz="4" w:space="0" w:color="000000"/>
-              <w:right w:val="single" w:sz="4" w:space="0" w:color="000000"/>
-            </w:tcBorders>
-            <w:shd w:val="clear" w:color="auto" w:fill="D9D9D9"/>
-            <w:tcMar>
-              <w:top w:w="70" w:type="dxa"/>
-              <w:left w:w="100" w:type="dxa"/>
-              <w:bottom w:w="70" w:type="dxa"/>
-              <w:right w:w="100" w:type="dxa"/>
-            </w:tcMar>
-            <w:vAlign w:val="center"/>
-          </w:tcPr>
-          <w:p>
-            <w:pPr>
-              <w:jc w:val="center"/>
-            </w:pPr>
-            <w:r>
-              <w:rPr>
-                <w:b/>
-                <w:sz w:val="20"/>
-                <w:szCs w:val="20"/>
-              </w:rPr>
-              <w:t>7.3</w:t>
-            </w:r>
-          </w:p>
-        </w:tc>
-        <w:tc>
-          <w:tcPr>
-            <w:tcW w:w="5888" w:type="dxa"/>
-            <w:tcBorders>
-              <w:top w:val="single" w:sz="4" w:space="0" w:color="000000"/>
-              <w:left w:val="single" w:sz="4" w:space="0" w:color="000000"/>
-              <w:bottom w:val="single" w:sz="4" w:space="0" w:color="000000"/>
-              <w:right w:val="single" w:sz="4" w:space="0" w:color="000000"/>
-            </w:tcBorders>
-            <w:shd w:val="clear" w:color="auto" w:fill="D9D9D9"/>
-            <w:tcMar>
-              <w:top w:w="70" w:type="dxa"/>
-              <w:left w:w="100" w:type="dxa"/>
-              <w:bottom w:w="70" w:type="dxa"/>
-              <w:right w:w="100" w:type="dxa"/>
-            </w:tcMar>
-            <w:vAlign w:val="center"/>
-          </w:tcPr>
-          <w:p>
-            <w:pPr/>
-            <w:r>
-              <w:rPr>
-                <w:sz w:val="20"/>
-                <w:szCs w:val="20"/>
-              </w:rPr>
-              <w:t>Tercer incumplimiento, incumplimiento grave o reincidente: suspensión de todas las actividades de la empresa contratista en planta + reporte a Gerencia General + evaluación de continuidad del contrato.</w:t>
-            </w:r>
-          </w:p>
-        </w:tc>
-        <w:tc>
-          <w:tcPr>
-            <w:tcW w:w="1900" w:type="dxa"/>
-            <w:tcBorders>
-              <w:top w:val="single" w:sz="4" w:space="0" w:color="000000"/>
-              <w:left w:val="single" w:sz="4" w:space="0" w:color="000000"/>
-              <w:bottom w:val="single" w:sz="4" w:space="0" w:color="000000"/>
-              <w:right w:val="single" w:sz="4" w:space="0" w:color="000000"/>
-            </w:tcBorders>
-            <w:shd w:val="clear" w:color="auto" w:fill="D9D9D9"/>
-            <w:tcMar>
-              <w:top w:w="70" w:type="dxa"/>
-              <w:left w:w="100" w:type="dxa"/>
-              <w:bottom w:w="70" w:type="dxa"/>
-              <w:right w:w="100" w:type="dxa"/>
-            </w:tcMar>
-            <w:vAlign w:val="center"/>
-          </w:tcPr>
-          <w:p>
-            <w:pPr>
-              <w:jc w:val="center"/>
-            </w:pPr>
-            <w:r>
-              <w:rPr>
-                <w:sz w:val="20"/>
-                <w:szCs w:val="20"/>
-              </w:rPr>
-              <w:t>Gerencia de Planta</w:t>
-            </w:r>
-          </w:p>
-        </w:tc>
-        <w:tc>
-          <w:tcPr>
-            <w:tcW w:w="1300" w:type="dxa"/>
-            <w:tcBorders>
-              <w:top w:val="single" w:sz="4" w:space="0" w:color="000000"/>
-              <w:left w:val="single" w:sz="4" w:space="0" w:color="000000"/>
-              <w:bottom w:val="single" w:sz="4" w:space="0" w:color="000000"/>
-              <w:right w:val="single" w:sz="4" w:space="0" w:color="000000"/>
-            </w:tcBorders>
-            <w:shd w:val="clear" w:color="auto" w:fill="D9D9D9"/>
-            <w:tcMar>
-              <w:top w:w="70" w:type="dxa"/>
-              <w:left w:w="100" w:type="dxa"/>
-              <w:bottom w:w="70" w:type="dxa"/>
-              <w:right w:w="100" w:type="dxa"/>
-            </w:tcMar>
-            <w:vAlign w:val="center"/>
-          </w:tcPr>
-          <w:p>
-            <w:pPr>
-              <w:jc w:val="center"/>
-            </w:pPr>
-            <w:r>
-              <w:rPr>
-                <w:sz w:val="20"/>
-                <w:szCs w:val="20"/>
-              </w:rPr>
-              <w:t>Gerencia General</w:t>
-            </w:r>
-          </w:p>
-        </w:tc>
-      </w:tr>
-      <w:tr>
-        <w:trPr>
-          <w:tblHeader/>
-        </w:trPr>
-        <w:tc>
-          <w:tcPr>
-            <w:tcW w:w="550" w:type="dxa"/>
-            <w:tcBorders>
-              <w:top w:val="single" w:sz="4" w:space="0" w:color="000000"/>
-              <w:left w:val="single" w:sz="4" w:space="0" w:color="000000"/>
-              <w:bottom w:val="single" w:sz="4" w:space="0" w:color="000000"/>
-              <w:right w:val="single" w:sz="4" w:space="0" w:color="000000"/>
-            </w:tcBorders>
-            <w:shd w:val="clear" w:color="auto" w:fill="D9D9D9"/>
-            <w:tcMar>
-              <w:top w:w="70" w:type="dxa"/>
-              <w:left w:w="100" w:type="dxa"/>
-              <w:bottom w:w="70" w:type="dxa"/>
-              <w:right w:w="100" w:type="dxa"/>
-            </w:tcMar>
-            <w:vAlign w:val="center"/>
-          </w:tcPr>
-          <w:p>
-            <w:pPr>
-              <w:jc w:val="center"/>
-            </w:pPr>
-            <w:r>
-              <w:rPr>
-                <w:b/>
-                <w:sz w:val="20"/>
-                <w:szCs w:val="20"/>
-              </w:rPr>
-              <w:t>7.4</w:t>
-            </w:r>
-          </w:p>
-        </w:tc>
-        <w:tc>
-          <w:tcPr>
-            <w:tcW w:w="5888" w:type="dxa"/>
-            <w:tcBorders>
-              <w:top w:val="single" w:sz="4" w:space="0" w:color="000000"/>
-              <w:left w:val="single" w:sz="4" w:space="0" w:color="000000"/>
-              <w:bottom w:val="single" w:sz="4" w:space="0" w:color="000000"/>
-              <w:right w:val="single" w:sz="4" w:space="0" w:color="000000"/>
-            </w:tcBorders>
-            <w:shd w:val="clear" w:color="auto" w:fill="D9D9D9"/>
-            <w:tcMar>
-              <w:top w:w="70" w:type="dxa"/>
-              <w:left w:w="100" w:type="dxa"/>
-              <w:bottom w:w="70" w:type="dxa"/>
-              <w:right w:w="100" w:type="dxa"/>
-            </w:tcMar>
-            <w:vAlign w:val="center"/>
-          </w:tcPr>
-          <w:p>
-            <w:pPr/>
-            <w:r>
-              <w:rPr>
-                <w:sz w:val="20"/>
-                <w:szCs w:val="20"/>
-              </w:rPr>
-              <w:t>Incumplimiento con riesgo inminente (pone en peligro la vida de personas): paralización inmediata de actividades y evacuación del área. No se reanudan actividades hasta corrección verificada por E&amp;S y aprobación de Gerencia.</w:t>
-            </w:r>
-          </w:p>
-        </w:tc>
-        <w:tc>
-          <w:tcPr>
-            <w:tcW w:w="1900" w:type="dxa"/>
-            <w:tcBorders>
-              <w:top w:val="single" w:sz="4" w:space="0" w:color="000000"/>
-              <w:left w:val="single" w:sz="4" w:space="0" w:color="000000"/>
-              <w:bottom w:val="single" w:sz="4" w:space="0" w:color="000000"/>
-              <w:right w:val="single" w:sz="4" w:space="0" w:color="000000"/>
-            </w:tcBorders>
-            <w:shd w:val="clear" w:color="auto" w:fill="D9D9D9"/>
-            <w:tcMar>
-              <w:top w:w="70" w:type="dxa"/>
-              <w:left w:w="100" w:type="dxa"/>
-              <w:bottom w:w="70" w:type="dxa"/>
-              <w:right w:w="100" w:type="dxa"/>
-            </w:tcMar>
-            <w:vAlign w:val="center"/>
-          </w:tcPr>
-          <w:p>
-            <w:pPr>
-              <w:jc w:val="center"/>
-            </w:pPr>
-            <w:r>
-              <w:rPr>
-                <w:sz w:val="20"/>
-                <w:szCs w:val="20"/>
-              </w:rPr>
-              <w:t>Equipo de E&amp;S</w:t>
-            </w:r>
-          </w:p>
-        </w:tc>
-        <w:tc>
-          <w:tcPr>
-            <w:tcW w:w="1300" w:type="dxa"/>
-            <w:tcBorders>
-              <w:top w:val="single" w:sz="4" w:space="0" w:color="000000"/>
-              <w:left w:val="single" w:sz="4" w:space="0" w:color="000000"/>
-              <w:bottom w:val="single" w:sz="4" w:space="0" w:color="000000"/>
-              <w:right w:val="single" w:sz="4" w:space="0" w:color="000000"/>
-            </w:tcBorders>
-            <w:shd w:val="clear" w:color="auto" w:fill="D9D9D9"/>
-            <w:tcMar>
-              <w:top w:w="70" w:type="dxa"/>
-              <w:left w:w="100" w:type="dxa"/>
-              <w:bottom w:w="70" w:type="dxa"/>
-              <w:right w:w="100" w:type="dxa"/>
-            </w:tcMar>
-            <w:vAlign w:val="center"/>
-          </w:tcPr>
-          <w:p>
-            <w:pPr>
-              <w:jc w:val="center"/>
+              <w:spacing w:before="0" w:after="40"/>
             </w:pPr>
             <w:r>
               <w:rPr>
@@ -7289,7 +7252,7 @@
     </w:tbl>
     <w:p>
       <w:pPr>
-        <w:spacing w:before="120"/>
+        <w:spacing w:before="0" w:after="0"/>
       </w:pPr>
     </w:p>
     <w:p>
@@ -7301,7 +7264,7 @@
           <w:right w:val="single" w:sz="4" w:space="0" w:color="000000"/>
         </w:pBdr>
         <w:shd w:val="clear" w:color="auto" w:fill="D9D9D9"/>
-        <w:spacing w:before="160" w:after="80"/>
+        <w:spacing w:before="60" w:after="40"/>
       </w:pPr>
       <w:r>
         <w:rPr>
@@ -7740,7 +7703,7 @@
     </w:tbl>
     <w:p>
       <w:pPr>
-        <w:spacing w:before="120"/>
+        <w:spacing w:before="0" w:after="0"/>
       </w:pPr>
     </w:p>
     <w:p>
@@ -7752,7 +7715,7 @@
           <w:right w:val="single" w:sz="4" w:space="0" w:color="000000"/>
         </w:pBdr>
         <w:shd w:val="clear" w:color="auto" w:fill="D9D9D9"/>
-        <w:spacing w:before="160" w:after="80"/>
+        <w:spacing w:before="60" w:after="40"/>
       </w:pPr>
       <w:r>
         <w:rPr>
@@ -8728,7 +8691,7 @@
                 <w:sz w:val="16"/>
                 <w:szCs w:val="16"/>
               </w:rPr>
-              <w:t>GE-SO-RXX</w:t>
+              <w:t>GE-SO-R002</w:t>
             </w:r>
           </w:p>
         </w:tc>
@@ -9090,7 +9053,7 @@
                 <w:sz w:val="16"/>
                 <w:szCs w:val="16"/>
               </w:rPr>
-              <w:t>GE-SO-D4</w:t>
+              <w:t>GE-SO-I4</w:t>
             </w:r>
           </w:p>
         </w:tc>
@@ -9436,12 +9399,12 @@
     </w:p>
     <w:p>
       <w:pPr>
-        <w:spacing w:before="120"/>
+        <w:spacing w:before="0" w:after="0"/>
       </w:pPr>
     </w:p>
     <w:p>
       <w:pPr>
-        <w:spacing w:before="120"/>
+        <w:spacing w:before="0" w:after="0"/>
       </w:pPr>
     </w:p>
     <w:p>
@@ -9453,7 +9416,7 @@
           <w:right w:val="single" w:sz="4" w:space="0" w:color="000000"/>
         </w:pBdr>
         <w:shd w:val="clear" w:color="auto" w:fill="D9D9D9"/>
-        <w:spacing w:before="160" w:after="80"/>
+        <w:spacing w:before="60" w:after="40"/>
       </w:pPr>
       <w:r>
         <w:rPr>
@@ -9669,7 +9632,11 @@
         </w:tc>
       </w:tr>
     </w:tbl>
-    <w:p/>
+    <w:p>
+      <w:pPr>
+        <w:spacing w:before="0" w:after="0"/>
+      </w:pPr>
+    </w:p>
     <w:sectPr>
       <w:headerReference w:type="default" r:id="rId7"/>
       <w:footerReference w:type="default" r:id="rId8"/>

</xml_diff>